<commit_message>
docs: add light production architecture and data placement
</commit_message>
<xml_diff>
--- a/wiki/architecture/reports/vibe-code-platform-architecture-and-plan.docx
+++ b/wiki/architecture/reports/vibe-code-platform-architecture-and-plan.docx
@@ -22,7 +22,7 @@
       <w:r>
         <w:t>Vibe-Code Platform</w:t>
         <w:br/>
-        <w:t>Architecture &amp; Delivery Plan</w:t>
+        <w:t>Final Production Architecture &amp; Delivery Plan</w:t>
       </w:r>
     </w:p>
     <w:p>
@@ -34,7 +34,7 @@
           <w:color w:val="475569"/>
           <w:sz w:val="30"/>
         </w:rPr>
-        <w:t>Target architecture envelope, staged roadmap and Stage 0 decision package</w:t>
+        <w:t>Hong Kong production topology, scaling, user-data placement, staged roadmap and Stage 0 decision package</w:t>
       </w:r>
     </w:p>
     <w:tbl>
@@ -102,7 +102,7 @@
         <w:tc>
           <w:tcPr>
             <w:tcW w:type="dxa" w:w="2448"/>
-            <w:shd w:val="clear" w:fill="0F172A"/>
+            <w:shd w:val="clear" w:fill="DBEAFE"/>
             <w:vAlign w:val="center"/>
           </w:tcPr>
           <w:p>
@@ -114,7 +114,7 @@
               <w:rPr>
                 <w:rFonts w:ascii="Aptos" w:hAnsi="Aptos"/>
                 <w:b/>
-                <w:color w:val="FFFFFF"/>
+                <w:color w:val="1E3A8A"/>
                 <w:sz w:val="17"/>
               </w:rPr>
               <w:t>Document field</w:t>
@@ -124,7 +124,7 @@
         <w:tc>
           <w:tcPr>
             <w:tcW w:type="dxa" w:w="7920"/>
-            <w:shd w:val="clear" w:fill="0F172A"/>
+            <w:shd w:val="clear" w:fill="DBEAFE"/>
             <w:vAlign w:val="center"/>
           </w:tcPr>
           <w:p>
@@ -136,7 +136,7 @@
               <w:rPr>
                 <w:rFonts w:ascii="Aptos" w:hAnsi="Aptos"/>
                 <w:b/>
-                <w:color w:val="FFFFFF"/>
+                <w:color w:val="1E3A8A"/>
                 <w:sz w:val="17"/>
               </w:rPr>
               <w:t>Value</w:t>
@@ -500,7 +500,7 @@
         <w:tc>
           <w:tcPr>
             <w:tcW w:type="dxa" w:w="2736"/>
-            <w:shd w:val="clear" w:fill="0F172A"/>
+            <w:shd w:val="clear" w:fill="DBEAFE"/>
             <w:vAlign w:val="center"/>
           </w:tcPr>
           <w:p>
@@ -512,7 +512,7 @@
               <w:rPr>
                 <w:rFonts w:ascii="Aptos" w:hAnsi="Aptos"/>
                 <w:b/>
-                <w:color w:val="FFFFFF"/>
+                <w:color w:val="1E3A8A"/>
                 <w:sz w:val="17"/>
               </w:rPr>
               <w:t>Capability</w:t>
@@ -522,7 +522,7 @@
         <w:tc>
           <w:tcPr>
             <w:tcW w:type="dxa" w:w="7632"/>
-            <w:shd w:val="clear" w:fill="0F172A"/>
+            <w:shd w:val="clear" w:fill="DBEAFE"/>
             <w:vAlign w:val="center"/>
           </w:tcPr>
           <w:p>
@@ -534,7 +534,7 @@
               <w:rPr>
                 <w:rFonts w:ascii="Aptos" w:hAnsi="Aptos"/>
                 <w:b/>
-                <w:color w:val="FFFFFF"/>
+                <w:color w:val="1E3A8A"/>
                 <w:sz w:val="17"/>
               </w:rPr>
               <w:t>Practical value</w:t>
@@ -839,7 +839,7 @@
         <w:pStyle w:val="Heading1"/>
       </w:pPr>
       <w:r>
-        <w:t>2. Target architecture</w:t>
+        <w:t>2. Final production architecture</w:t>
       </w:r>
     </w:p>
     <w:p>
@@ -887,7 +887,7 @@
         <w:jc w:val="center"/>
       </w:pPr>
       <w:r>
-        <w:t>Figure 1 — Target envelope. Stage 0–1 uses only a subset; durable agents and mobile arrive later.</w:t>
+        <w:t>Figure 1 — Final HK production target with active multi-AZ scaling, warm-passive DR and explicit data placement. Stages 0–1 deploy only a subset.</w:t>
       </w:r>
     </w:p>
     <w:p>
@@ -922,7 +922,7 @@
         <w:tc>
           <w:tcPr>
             <w:tcW w:type="dxa" w:w="1800"/>
-            <w:shd w:val="clear" w:fill="0F172A"/>
+            <w:shd w:val="clear" w:fill="DBEAFE"/>
             <w:vAlign w:val="center"/>
           </w:tcPr>
           <w:p>
@@ -934,7 +934,7 @@
               <w:rPr>
                 <w:rFonts w:ascii="Aptos" w:hAnsi="Aptos"/>
                 <w:b/>
-                <w:color w:val="FFFFFF"/>
+                <w:color w:val="1E3A8A"/>
                 <w:sz w:val="17"/>
               </w:rPr>
               <w:t>Plane</w:t>
@@ -944,7 +944,7 @@
         <w:tc>
           <w:tcPr>
             <w:tcW w:type="dxa" w:w="6696"/>
-            <w:shd w:val="clear" w:fill="0F172A"/>
+            <w:shd w:val="clear" w:fill="DBEAFE"/>
             <w:vAlign w:val="center"/>
           </w:tcPr>
           <w:p>
@@ -956,7 +956,7 @@
               <w:rPr>
                 <w:rFonts w:ascii="Aptos" w:hAnsi="Aptos"/>
                 <w:b/>
-                <w:color w:val="FFFFFF"/>
+                <w:color w:val="1E3A8A"/>
                 <w:sz w:val="17"/>
               </w:rPr>
               <w:t>Responsibility</w:t>
@@ -966,7 +966,7 @@
         <w:tc>
           <w:tcPr>
             <w:tcW w:type="dxa" w:w="1152"/>
-            <w:shd w:val="clear" w:fill="0F172A"/>
+            <w:shd w:val="clear" w:fill="DBEAFE"/>
             <w:vAlign w:val="center"/>
           </w:tcPr>
           <w:p>
@@ -978,7 +978,7 @@
               <w:rPr>
                 <w:rFonts w:ascii="Aptos" w:hAnsi="Aptos"/>
                 <w:b/>
-                <w:color w:val="FFFFFF"/>
+                <w:color w:val="1E3A8A"/>
                 <w:sz w:val="17"/>
               </w:rPr>
               <w:t>Stage</w:t>
@@ -1575,7 +1575,7 @@
         <w:tc>
           <w:tcPr>
             <w:tcW w:type="dxa" w:w="2088"/>
-            <w:shd w:val="clear" w:fill="0F172A"/>
+            <w:shd w:val="clear" w:fill="DBEAFE"/>
             <w:vAlign w:val="center"/>
           </w:tcPr>
           <w:p>
@@ -1587,7 +1587,7 @@
               <w:rPr>
                 <w:rFonts w:ascii="Aptos" w:hAnsi="Aptos"/>
                 <w:b/>
-                <w:color w:val="FFFFFF"/>
+                <w:color w:val="1E3A8A"/>
                 <w:sz w:val="17"/>
               </w:rPr>
               <w:t>Component</w:t>
@@ -1597,7 +1597,7 @@
         <w:tc>
           <w:tcPr>
             <w:tcW w:type="dxa" w:w="3312"/>
-            <w:shd w:val="clear" w:fill="0F172A"/>
+            <w:shd w:val="clear" w:fill="DBEAFE"/>
             <w:vAlign w:val="center"/>
           </w:tcPr>
           <w:p>
@@ -1609,7 +1609,7 @@
               <w:rPr>
                 <w:rFonts w:ascii="Aptos" w:hAnsi="Aptos"/>
                 <w:b/>
-                <w:color w:val="FFFFFF"/>
+                <w:color w:val="1E3A8A"/>
                 <w:sz w:val="17"/>
               </w:rPr>
               <w:t>Role</w:t>
@@ -1619,7 +1619,7 @@
         <w:tc>
           <w:tcPr>
             <w:tcW w:type="dxa" w:w="4320"/>
-            <w:shd w:val="clear" w:fill="0F172A"/>
+            <w:shd w:val="clear" w:fill="DBEAFE"/>
             <w:vAlign w:val="center"/>
           </w:tcPr>
           <w:p>
@@ -1631,7 +1631,7 @@
               <w:rPr>
                 <w:rFonts w:ascii="Aptos" w:hAnsi="Aptos"/>
                 <w:b/>
-                <w:color w:val="FFFFFF"/>
+                <w:color w:val="1E3A8A"/>
                 <w:sz w:val="17"/>
               </w:rPr>
               <w:t>Guardrail</w:t>
@@ -2211,7 +2211,1656 @@
         <w:pStyle w:val="Heading1"/>
       </w:pPr>
       <w:r>
-        <w:t>4. Staged delivery roadmap</w:t>
+        <w:t>4. Production topology, scaling and data placement</w:t>
+      </w:r>
+    </w:p>
+    <w:p>
+      <w:r>
+        <w:t>The final target keeps users, active infrastructure, warm-passive DR and platform data in Hong Kong. Back office is an access site rather than the platform host; offices use local secure breakout to the HK edge. The active facility is multi-AZ, while a physically separate HK facility provides fenced warm-passive recovery.</w:t>
+      </w:r>
+    </w:p>
+    <w:p>
+      <w:pPr>
+        <w:pStyle w:val="Heading2"/>
+      </w:pPr>
+      <w:r>
+        <w:t>Scaling and high availability</w:t>
+      </w:r>
+    </w:p>
+    <w:tbl>
+      <w:tblPr>
+        <w:tblStyle w:val="TableGrid"/>
+        <w:tblW w:type="auto" w:w="0"/>
+        <w:jc w:val="center"/>
+        <w:tblLook w:firstColumn="1" w:firstRow="1" w:lastColumn="0" w:lastRow="0" w:noHBand="0" w:noVBand="1" w:val="04A0"/>
+      </w:tblPr>
+      <w:tblGrid>
+        <w:gridCol w:w="3389"/>
+        <w:gridCol w:w="3389"/>
+        <w:gridCol w:w="3389"/>
+      </w:tblGrid>
+      <w:tr>
+        <w:trPr>
+          <w:cantSplit/>
+        </w:trPr>
+        <w:tc>
+          <w:tcPr>
+            <w:tcW w:type="dxa" w:w="1944"/>
+            <w:shd w:val="clear" w:fill="DBEAFE"/>
+            <w:vAlign w:val="center"/>
+          </w:tcPr>
+          <w:p>
+            <w:pPr>
+              <w:spacing w:after="0"/>
+            </w:pPr>
+            <w:r/>
+            <w:r>
+              <w:rPr>
+                <w:rFonts w:ascii="Aptos" w:hAnsi="Aptos"/>
+                <w:b/>
+                <w:color w:val="1E3A8A"/>
+                <w:sz w:val="17"/>
+              </w:rPr>
+              <w:t>Area</w:t>
+            </w:r>
+          </w:p>
+        </w:tc>
+        <w:tc>
+          <w:tcPr>
+            <w:tcW w:type="dxa" w:w="3816"/>
+            <w:shd w:val="clear" w:fill="DBEAFE"/>
+            <w:vAlign w:val="center"/>
+          </w:tcPr>
+          <w:p>
+            <w:pPr>
+              <w:spacing w:after="0"/>
+            </w:pPr>
+            <w:r/>
+            <w:r>
+              <w:rPr>
+                <w:rFonts w:ascii="Aptos" w:hAnsi="Aptos"/>
+                <w:b/>
+                <w:color w:val="1E3A8A"/>
+                <w:sz w:val="17"/>
+              </w:rPr>
+              <w:t>Production model</w:t>
+            </w:r>
+          </w:p>
+        </w:tc>
+        <w:tc>
+          <w:tcPr>
+            <w:tcW w:type="dxa" w:w="3960"/>
+            <w:shd w:val="clear" w:fill="DBEAFE"/>
+            <w:vAlign w:val="center"/>
+          </w:tcPr>
+          <w:p>
+            <w:pPr>
+              <w:spacing w:after="0"/>
+            </w:pPr>
+            <w:r/>
+            <w:r>
+              <w:rPr>
+                <w:rFonts w:ascii="Aptos" w:hAnsi="Aptos"/>
+                <w:b/>
+                <w:color w:val="1E3A8A"/>
+                <w:sz w:val="17"/>
+              </w:rPr>
+              <w:t>Initial envelope</w:t>
+            </w:r>
+          </w:p>
+        </w:tc>
+      </w:tr>
+      <w:tr>
+        <w:trPr>
+          <w:cantSplit/>
+        </w:trPr>
+        <w:tc>
+          <w:tcPr>
+            <w:tcW w:type="dxa" w:w="1944"/>
+            <w:vAlign w:val="center"/>
+          </w:tcPr>
+          <w:p>
+            <w:pPr>
+              <w:spacing w:after="0"/>
+            </w:pPr>
+            <w:r/>
+            <w:r>
+              <w:rPr>
+                <w:rFonts w:ascii="Aptos" w:hAnsi="Aptos"/>
+                <w:b w:val="0"/>
+                <w:color w:val="1E293B"/>
+                <w:sz w:val="16"/>
+              </w:rPr>
+              <w:t>Edge / ingress</w:t>
+            </w:r>
+          </w:p>
+        </w:tc>
+        <w:tc>
+          <w:tcPr>
+            <w:tcW w:type="dxa" w:w="3816"/>
+            <w:vAlign w:val="center"/>
+          </w:tcPr>
+          <w:p>
+            <w:pPr>
+              <w:spacing w:after="0"/>
+            </w:pPr>
+            <w:r/>
+            <w:r>
+              <w:rPr>
+                <w:rFonts w:ascii="Aptos" w:hAnsi="Aptos"/>
+                <w:b w:val="0"/>
+                <w:color w:val="1E293B"/>
+                <w:sz w:val="16"/>
+              </w:rPr>
+              <w:t>Managed WAF/LB plus 3+ ingress/proxy replicas across AZs</w:t>
+            </w:r>
+          </w:p>
+        </w:tc>
+        <w:tc>
+          <w:tcPr>
+            <w:tcW w:type="dxa" w:w="3960"/>
+            <w:vAlign w:val="center"/>
+          </w:tcPr>
+          <w:p>
+            <w:pPr>
+              <w:spacing w:after="0"/>
+            </w:pPr>
+            <w:r/>
+            <w:r>
+              <w:rPr>
+                <w:rFonts w:ascii="Aptos" w:hAnsi="Aptos"/>
+                <w:b w:val="0"/>
+                <w:color w:val="1E293B"/>
+                <w:sz w:val="16"/>
+              </w:rPr>
+              <w:t>443 only; no sticky API; WebSocket drain/reconnect and soak tests.</w:t>
+            </w:r>
+          </w:p>
+        </w:tc>
+      </w:tr>
+      <w:tr>
+        <w:trPr>
+          <w:cantSplit/>
+        </w:trPr>
+        <w:tc>
+          <w:tcPr>
+            <w:tcW w:type="dxa" w:w="1944"/>
+            <w:shd w:val="clear" w:fill="F1F5F9"/>
+            <w:vAlign w:val="center"/>
+          </w:tcPr>
+          <w:p>
+            <w:pPr>
+              <w:spacing w:after="0"/>
+            </w:pPr>
+            <w:r/>
+            <w:r>
+              <w:rPr>
+                <w:rFonts w:ascii="Aptos" w:hAnsi="Aptos"/>
+                <w:b w:val="0"/>
+                <w:color w:val="1E293B"/>
+                <w:sz w:val="16"/>
+              </w:rPr>
+              <w:t>Portal / Control API</w:t>
+            </w:r>
+          </w:p>
+        </w:tc>
+        <w:tc>
+          <w:tcPr>
+            <w:tcW w:type="dxa" w:w="3816"/>
+            <w:shd w:val="clear" w:fill="F1F5F9"/>
+            <w:vAlign w:val="center"/>
+          </w:tcPr>
+          <w:p>
+            <w:pPr>
+              <w:spacing w:after="0"/>
+            </w:pPr>
+            <w:r/>
+            <w:r>
+              <w:rPr>
+                <w:rFonts w:ascii="Aptos" w:hAnsi="Aptos"/>
+                <w:b w:val="0"/>
+                <w:color w:val="1E293B"/>
+                <w:sz w:val="16"/>
+              </w:rPr>
+              <w:t>3+ stateless active-active replicas with topology spread and PDB</w:t>
+            </w:r>
+          </w:p>
+        </w:tc>
+        <w:tc>
+          <w:tcPr>
+            <w:tcW w:type="dxa" w:w="3960"/>
+            <w:shd w:val="clear" w:fill="F1F5F9"/>
+            <w:vAlign w:val="center"/>
+          </w:tcPr>
+          <w:p>
+            <w:pPr>
+              <w:spacing w:after="0"/>
+            </w:pPr>
+            <w:r/>
+            <w:r>
+              <w:rPr>
+                <w:rFonts w:ascii="Aptos" w:hAnsi="Aptos"/>
+                <w:b w:val="0"/>
+                <w:color w:val="1E293B"/>
+                <w:sz w:val="16"/>
+              </w:rPr>
+              <w:t>99.9% initial monthly SLO; 99.95% only after failover evidence.</w:t>
+            </w:r>
+          </w:p>
+        </w:tc>
+      </w:tr>
+      <w:tr>
+        <w:trPr>
+          <w:cantSplit/>
+        </w:trPr>
+        <w:tc>
+          <w:tcPr>
+            <w:tcW w:type="dxa" w:w="1944"/>
+            <w:vAlign w:val="center"/>
+          </w:tcPr>
+          <w:p>
+            <w:pPr>
+              <w:spacing w:after="0"/>
+            </w:pPr>
+            <w:r/>
+            <w:r>
+              <w:rPr>
+                <w:rFonts w:ascii="Aptos" w:hAnsi="Aptos"/>
+                <w:b w:val="0"/>
+                <w:color w:val="1E293B"/>
+                <w:sz w:val="16"/>
+              </w:rPr>
+              <w:t>Coder / LiteLLM</w:t>
+            </w:r>
+          </w:p>
+        </w:tc>
+        <w:tc>
+          <w:tcPr>
+            <w:tcW w:type="dxa" w:w="3816"/>
+            <w:vAlign w:val="center"/>
+          </w:tcPr>
+          <w:p>
+            <w:pPr>
+              <w:spacing w:after="0"/>
+            </w:pPr>
+            <w:r/>
+            <w:r>
+              <w:rPr>
+                <w:rFonts w:ascii="Aptos" w:hAnsi="Aptos"/>
+                <w:b w:val="0"/>
+                <w:color w:val="1E293B"/>
+                <w:sz w:val="16"/>
+              </w:rPr>
+              <w:t>2+ replicas with state and credentials externalized</w:t>
+            </w:r>
+          </w:p>
+        </w:tc>
+        <w:tc>
+          <w:tcPr>
+            <w:tcW w:type="dxa" w:w="3960"/>
+            <w:vAlign w:val="center"/>
+          </w:tcPr>
+          <w:p>
+            <w:pPr>
+              <w:spacing w:after="0"/>
+            </w:pPr>
+            <w:r/>
+            <w:r>
+              <w:rPr>
+                <w:rFonts w:ascii="Aptos" w:hAnsi="Aptos"/>
+                <w:b w:val="0"/>
+                <w:color w:val="1E293B"/>
+                <w:sz w:val="16"/>
+              </w:rPr>
+              <w:t>Per-workspace keys, budget and fallback; no master key in workspaces.</w:t>
+            </w:r>
+          </w:p>
+        </w:tc>
+      </w:tr>
+      <w:tr>
+        <w:trPr>
+          <w:cantSplit/>
+        </w:trPr>
+        <w:tc>
+          <w:tcPr>
+            <w:tcW w:type="dxa" w:w="1944"/>
+            <w:shd w:val="clear" w:fill="F1F5F9"/>
+            <w:vAlign w:val="center"/>
+          </w:tcPr>
+          <w:p>
+            <w:pPr>
+              <w:spacing w:after="0"/>
+            </w:pPr>
+            <w:r/>
+            <w:r>
+              <w:rPr>
+                <w:rFonts w:ascii="Aptos" w:hAnsi="Aptos"/>
+                <w:b w:val="0"/>
+                <w:color w:val="1E293B"/>
+                <w:sz w:val="16"/>
+              </w:rPr>
+              <w:t>Workspace Router</w:t>
+            </w:r>
+          </w:p>
+        </w:tc>
+        <w:tc>
+          <w:tcPr>
+            <w:tcW w:type="dxa" w:w="3816"/>
+            <w:shd w:val="clear" w:fill="F1F5F9"/>
+            <w:vAlign w:val="center"/>
+          </w:tcPr>
+          <w:p>
+            <w:pPr>
+              <w:spacing w:after="0"/>
+            </w:pPr>
+            <w:r/>
+            <w:r>
+              <w:rPr>
+                <w:rFonts w:ascii="Aptos" w:hAnsi="Aptos"/>
+                <w:b w:val="0"/>
+                <w:color w:val="1E293B"/>
+                <w:sz w:val="16"/>
+              </w:rPr>
+              <w:t>3+ active-active proxies routed by workspace ID</w:t>
+            </w:r>
+          </w:p>
+        </w:tc>
+        <w:tc>
+          <w:tcPr>
+            <w:tcW w:type="dxa" w:w="3960"/>
+            <w:shd w:val="clear" w:fill="F1F5F9"/>
+            <w:vAlign w:val="center"/>
+          </w:tcPr>
+          <w:p>
+            <w:pPr>
+              <w:spacing w:after="0"/>
+            </w:pPr>
+            <w:r/>
+            <w:r>
+              <w:rPr>
+                <w:rFonts w:ascii="Aptos" w:hAnsi="Aptos"/>
+                <w:b w:val="0"/>
+                <w:color w:val="1E293B"/>
+                <w:sz w:val="16"/>
+              </w:rPr>
+              <w:t>Connections may reconnect; new sessions use healthy replicas.</w:t>
+            </w:r>
+          </w:p>
+        </w:tc>
+      </w:tr>
+      <w:tr>
+        <w:trPr>
+          <w:cantSplit/>
+        </w:trPr>
+        <w:tc>
+          <w:tcPr>
+            <w:tcW w:type="dxa" w:w="1944"/>
+            <w:vAlign w:val="center"/>
+          </w:tcPr>
+          <w:p>
+            <w:pPr>
+              <w:spacing w:after="0"/>
+            </w:pPr>
+            <w:r/>
+            <w:r>
+              <w:rPr>
+                <w:rFonts w:ascii="Aptos" w:hAnsi="Aptos"/>
+                <w:b w:val="0"/>
+                <w:color w:val="1E293B"/>
+                <w:sz w:val="16"/>
+              </w:rPr>
+              <w:t>Workspace pool</w:t>
+            </w:r>
+          </w:p>
+        </w:tc>
+        <w:tc>
+          <w:tcPr>
+            <w:tcW w:type="dxa" w:w="3816"/>
+            <w:vAlign w:val="center"/>
+          </w:tcPr>
+          <w:p>
+            <w:pPr>
+              <w:spacing w:after="0"/>
+            </w:pPr>
+            <w:r/>
+            <w:r>
+              <w:rPr>
+                <w:rFonts w:ascii="Aptos" w:hAnsi="Aptos"/>
+                <w:b w:val="0"/>
+                <w:color w:val="1E293B"/>
+                <w:sz w:val="16"/>
+              </w:rPr>
+              <w:t>Single-active workspace + PVC; autoscaling node pool with N+1</w:t>
+            </w:r>
+          </w:p>
+        </w:tc>
+        <w:tc>
+          <w:tcPr>
+            <w:tcW w:type="dxa" w:w="3960"/>
+            <w:vAlign w:val="center"/>
+          </w:tcPr>
+          <w:p>
+            <w:pPr>
+              <w:spacing w:after="0"/>
+            </w:pPr>
+            <w:r/>
+            <w:r>
+              <w:rPr>
+                <w:rFonts w:ascii="Aptos" w:hAnsi="Aptos"/>
+                <w:b w:val="0"/>
+                <w:color w:val="1E293B"/>
+                <w:sz w:val="16"/>
+              </w:rPr>
+              <w:t>Pre-warm 30, autoscale 50, contingency test 80; 10–20% warm slots.</w:t>
+            </w:r>
+          </w:p>
+        </w:tc>
+      </w:tr>
+      <w:tr>
+        <w:trPr>
+          <w:cantSplit/>
+        </w:trPr>
+        <w:tc>
+          <w:tcPr>
+            <w:tcW w:type="dxa" w:w="1944"/>
+            <w:shd w:val="clear" w:fill="F1F5F9"/>
+            <w:vAlign w:val="center"/>
+          </w:tcPr>
+          <w:p>
+            <w:pPr>
+              <w:spacing w:after="0"/>
+            </w:pPr>
+            <w:r/>
+            <w:r>
+              <w:rPr>
+                <w:rFonts w:ascii="Aptos" w:hAnsi="Aptos"/>
+                <w:b w:val="0"/>
+                <w:color w:val="1E293B"/>
+                <w:sz w:val="16"/>
+              </w:rPr>
+              <w:t>50-active capacity</w:t>
+            </w:r>
+          </w:p>
+        </w:tc>
+        <w:tc>
+          <w:tcPr>
+            <w:tcW w:type="dxa" w:w="3816"/>
+            <w:shd w:val="clear" w:fill="F1F5F9"/>
+            <w:vAlign w:val="center"/>
+          </w:tcPr>
+          <w:p>
+            <w:pPr>
+              <w:spacing w:after="0"/>
+            </w:pPr>
+            <w:r/>
+            <w:r>
+              <w:rPr>
+                <w:rFonts w:ascii="Aptos" w:hAnsi="Aptos"/>
+                <w:b w:val="0"/>
+                <w:color w:val="1E293B"/>
+                <w:sz w:val="16"/>
+              </w:rPr>
+              <w:t>Separate workspace/build/system pools</w:t>
+            </w:r>
+          </w:p>
+        </w:tc>
+        <w:tc>
+          <w:tcPr>
+            <w:tcW w:type="dxa" w:w="3960"/>
+            <w:shd w:val="clear" w:fill="F1F5F9"/>
+            <w:vAlign w:val="center"/>
+          </w:tcPr>
+          <w:p>
+            <w:pPr>
+              <w:spacing w:after="0"/>
+            </w:pPr>
+            <w:r/>
+            <w:r>
+              <w:rPr>
+                <w:rFonts w:ascii="Aptos" w:hAnsi="Aptos"/>
+                <w:b w:val="0"/>
+                <w:color w:val="1E293B"/>
+                <w:sz w:val="16"/>
+              </w:rPr>
+              <w:t>About 7 × 16/64 nodes, or 4–5 × 32/128 nodes after burst/fragmentation tests.</w:t>
+            </w:r>
+          </w:p>
+        </w:tc>
+      </w:tr>
+      <w:tr>
+        <w:trPr>
+          <w:cantSplit/>
+        </w:trPr>
+        <w:tc>
+          <w:tcPr>
+            <w:tcW w:type="dxa" w:w="1944"/>
+            <w:vAlign w:val="center"/>
+          </w:tcPr>
+          <w:p>
+            <w:pPr>
+              <w:spacing w:after="0"/>
+            </w:pPr>
+            <w:r/>
+            <w:r>
+              <w:rPr>
+                <w:rFonts w:ascii="Aptos" w:hAnsi="Aptos"/>
+                <w:b w:val="0"/>
+                <w:color w:val="1E293B"/>
+                <w:sz w:val="16"/>
+              </w:rPr>
+              <w:t>Build / evaluation</w:t>
+            </w:r>
+          </w:p>
+        </w:tc>
+        <w:tc>
+          <w:tcPr>
+            <w:tcW w:type="dxa" w:w="3816"/>
+            <w:vAlign w:val="center"/>
+          </w:tcPr>
+          <w:p>
+            <w:pPr>
+              <w:spacing w:after="0"/>
+            </w:pPr>
+            <w:r/>
+            <w:r>
+              <w:rPr>
+                <w:rFonts w:ascii="Aptos" w:hAnsi="Aptos"/>
+                <w:b w:val="0"/>
+                <w:color w:val="1E293B"/>
+                <w:sz w:val="16"/>
+              </w:rPr>
+              <w:t>Separate ephemeral pool; queue/KEDA scaling</w:t>
+            </w:r>
+          </w:p>
+        </w:tc>
+        <w:tc>
+          <w:tcPr>
+            <w:tcW w:type="dxa" w:w="3960"/>
+            <w:vAlign w:val="center"/>
+          </w:tcPr>
+          <w:p>
+            <w:pPr>
+              <w:spacing w:after="0"/>
+            </w:pPr>
+            <w:r/>
+            <w:r>
+              <w:rPr>
+                <w:rFonts w:ascii="Aptos" w:hAnsi="Aptos"/>
+                <w:b w:val="0"/>
+                <w:color w:val="1E293B"/>
+                <w:sz w:val="16"/>
+              </w:rPr>
+              <w:t>Build storm queues and cannot starve interactive IDEs.</w:t>
+            </w:r>
+          </w:p>
+        </w:tc>
+      </w:tr>
+      <w:tr>
+        <w:trPr>
+          <w:cantSplit/>
+        </w:trPr>
+        <w:tc>
+          <w:tcPr>
+            <w:tcW w:type="dxa" w:w="1944"/>
+            <w:shd w:val="clear" w:fill="F1F5F9"/>
+            <w:vAlign w:val="center"/>
+          </w:tcPr>
+          <w:p>
+            <w:pPr>
+              <w:spacing w:after="0"/>
+            </w:pPr>
+            <w:r/>
+            <w:r>
+              <w:rPr>
+                <w:rFonts w:ascii="Aptos" w:hAnsi="Aptos"/>
+                <w:b w:val="0"/>
+                <w:color w:val="1E293B"/>
+                <w:sz w:val="16"/>
+              </w:rPr>
+              <w:t>Durable agents</w:t>
+            </w:r>
+          </w:p>
+        </w:tc>
+        <w:tc>
+          <w:tcPr>
+            <w:tcW w:type="dxa" w:w="3816"/>
+            <w:shd w:val="clear" w:fill="F1F5F9"/>
+            <w:vAlign w:val="center"/>
+          </w:tcPr>
+          <w:p>
+            <w:pPr>
+              <w:spacing w:after="0"/>
+            </w:pPr>
+            <w:r/>
+            <w:r>
+              <w:rPr>
+                <w:rFonts w:ascii="Aptos" w:hAnsi="Aptos"/>
+                <w:b w:val="0"/>
+                <w:color w:val="1E293B"/>
+                <w:sz w:val="16"/>
+              </w:rPr>
+              <w:t>3+ dispatcher/runners with DB lease, idempotency and checkpoint</w:t>
+            </w:r>
+          </w:p>
+        </w:tc>
+        <w:tc>
+          <w:tcPr>
+            <w:tcW w:type="dxa" w:w="3960"/>
+            <w:shd w:val="clear" w:fill="F1F5F9"/>
+            <w:vAlign w:val="center"/>
+          </w:tcPr>
+          <w:p>
+            <w:pPr>
+              <w:spacing w:after="0"/>
+            </w:pPr>
+            <w:r/>
+            <w:r>
+              <w:rPr>
+                <w:rFonts w:ascii="Aptos" w:hAnsi="Aptos"/>
+                <w:b w:val="0"/>
+                <w:color w:val="1E293B"/>
+                <w:sz w:val="16"/>
+              </w:rPr>
+              <w:t>PostgreSQL outbox → 3-node RabbitMQ quorum → isolated runner.</w:t>
+            </w:r>
+          </w:p>
+        </w:tc>
+      </w:tr>
+      <w:tr>
+        <w:trPr>
+          <w:cantSplit/>
+        </w:trPr>
+        <w:tc>
+          <w:tcPr>
+            <w:tcW w:type="dxa" w:w="1944"/>
+            <w:vAlign w:val="center"/>
+          </w:tcPr>
+          <w:p>
+            <w:pPr>
+              <w:spacing w:after="0"/>
+            </w:pPr>
+            <w:r/>
+            <w:r>
+              <w:rPr>
+                <w:rFonts w:ascii="Aptos" w:hAnsi="Aptos"/>
+                <w:b w:val="0"/>
+                <w:color w:val="1E293B"/>
+                <w:sz w:val="16"/>
+              </w:rPr>
+              <w:t>PostgreSQL</w:t>
+            </w:r>
+          </w:p>
+        </w:tc>
+        <w:tc>
+          <w:tcPr>
+            <w:tcW w:type="dxa" w:w="3816"/>
+            <w:vAlign w:val="center"/>
+          </w:tcPr>
+          <w:p>
+            <w:pPr>
+              <w:spacing w:after="0"/>
+            </w:pPr>
+            <w:r/>
+            <w:r>
+              <w:rPr>
+                <w:rFonts w:ascii="Aptos" w:hAnsi="Aptos"/>
+                <w:b w:val="0"/>
+                <w:color w:val="1E293B"/>
+                <w:sz w:val="16"/>
+              </w:rPr>
+              <w:t>Writable primary + synchronous/managed standby; PITR</w:t>
+            </w:r>
+          </w:p>
+        </w:tc>
+        <w:tc>
+          <w:tcPr>
+            <w:tcW w:type="dxa" w:w="3960"/>
+            <w:vAlign w:val="center"/>
+          </w:tcPr>
+          <w:p>
+            <w:pPr>
+              <w:spacing w:after="0"/>
+            </w:pPr>
+            <w:r/>
+            <w:r>
+              <w:rPr>
+                <w:rFonts w:ascii="Aptos" w:hAnsi="Aptos"/>
+                <w:b w:val="0"/>
+                <w:color w:val="1E293B"/>
+                <w:sz w:val="16"/>
+              </w:rPr>
+              <w:t>Strong truth for identity, project, job, approval, audit, budget and policy.</w:t>
+            </w:r>
+          </w:p>
+        </w:tc>
+      </w:tr>
+      <w:tr>
+        <w:trPr>
+          <w:cantSplit/>
+        </w:trPr>
+        <w:tc>
+          <w:tcPr>
+            <w:tcW w:type="dxa" w:w="1944"/>
+            <w:shd w:val="clear" w:fill="F1F5F9"/>
+            <w:vAlign w:val="center"/>
+          </w:tcPr>
+          <w:p>
+            <w:pPr>
+              <w:spacing w:after="0"/>
+            </w:pPr>
+            <w:r/>
+            <w:r>
+              <w:rPr>
+                <w:rFonts w:ascii="Aptos" w:hAnsi="Aptos"/>
+                <w:b w:val="0"/>
+                <w:color w:val="1E293B"/>
+                <w:sz w:val="16"/>
+              </w:rPr>
+              <w:t>Regional DR</w:t>
+            </w:r>
+          </w:p>
+        </w:tc>
+        <w:tc>
+          <w:tcPr>
+            <w:tcW w:type="dxa" w:w="3816"/>
+            <w:shd w:val="clear" w:fill="F1F5F9"/>
+            <w:vAlign w:val="center"/>
+          </w:tcPr>
+          <w:p>
+            <w:pPr>
+              <w:spacing w:after="0"/>
+            </w:pPr>
+            <w:r/>
+            <w:r>
+              <w:rPr>
+                <w:rFonts w:ascii="Aptos" w:hAnsi="Aptos"/>
+                <w:b w:val="0"/>
+                <w:color w:val="1E293B"/>
+                <w:sz w:val="16"/>
+              </w:rPr>
+              <w:t>Warm-passive second HK facility with fenced promotion</w:t>
+            </w:r>
+          </w:p>
+        </w:tc>
+        <w:tc>
+          <w:tcPr>
+            <w:tcW w:type="dxa" w:w="3960"/>
+            <w:shd w:val="clear" w:fill="F1F5F9"/>
+            <w:vAlign w:val="center"/>
+          </w:tcPr>
+          <w:p>
+            <w:pPr>
+              <w:spacing w:after="0"/>
+            </w:pPr>
+            <w:r/>
+            <w:r>
+              <w:rPr>
+                <w:rFonts w:ascii="Aptos" w:hAnsi="Aptos"/>
+                <w:b w:val="0"/>
+                <w:color w:val="1E293B"/>
+                <w:sz w:val="16"/>
+              </w:rPr>
+              <w:t>Initial RTO ≤ 2 h and RPO ≤ 15 min; prove by restore/failover drill.</w:t>
+            </w:r>
+          </w:p>
+        </w:tc>
+      </w:tr>
+    </w:tbl>
+    <w:p>
+      <w:pPr>
+        <w:spacing w:after="0"/>
+      </w:pPr>
+    </w:p>
+    <w:p>
+      <w:pPr>
+        <w:pStyle w:val="SmallNote"/>
+      </w:pPr>
+      <w:r>
+        <w:t>Capacity assumptions are load-test starting points, not supplier guarantees. Weighted workspace demand is 1.15 vCPU, 3.6 GiB RAM and 18 GiB disk. One hundred registered workspaces require about 2.29 TiB after a 30% buffer, before registry, object-store and database capacity. When full, the API returns CAPACITY_QUEUED; login and administration remain available.</w:t>
+      </w:r>
+    </w:p>
+    <w:p>
+      <w:r>
+        <w:br w:type="page"/>
+      </w:r>
+    </w:p>
+    <w:p>
+      <w:pPr>
+        <w:pStyle w:val="Heading2"/>
+      </w:pPr>
+      <w:r>
+        <w:t>User and platform data locations</w:t>
+      </w:r>
+    </w:p>
+    <w:tbl>
+      <w:tblPr>
+        <w:tblStyle w:val="TableGrid"/>
+        <w:tblW w:type="auto" w:w="0"/>
+        <w:jc w:val="center"/>
+        <w:tblLook w:firstColumn="1" w:firstRow="1" w:lastColumn="0" w:lastRow="0" w:noHBand="0" w:noVBand="1" w:val="04A0"/>
+      </w:tblPr>
+      <w:tblGrid>
+        <w:gridCol w:w="3389"/>
+        <w:gridCol w:w="3389"/>
+        <w:gridCol w:w="3389"/>
+      </w:tblGrid>
+      <w:tr>
+        <w:trPr>
+          <w:cantSplit/>
+        </w:trPr>
+        <w:tc>
+          <w:tcPr>
+            <w:tcW w:type="dxa" w:w="2448"/>
+            <w:shd w:val="clear" w:fill="DBEAFE"/>
+            <w:vAlign w:val="center"/>
+          </w:tcPr>
+          <w:p>
+            <w:pPr>
+              <w:spacing w:after="0"/>
+            </w:pPr>
+            <w:r/>
+            <w:r>
+              <w:rPr>
+                <w:rFonts w:ascii="Aptos" w:hAnsi="Aptos"/>
+                <w:b/>
+                <w:color w:val="1E3A8A"/>
+                <w:sz w:val="17"/>
+              </w:rPr>
+              <w:t>Data class</w:t>
+            </w:r>
+          </w:p>
+        </w:tc>
+        <w:tc>
+          <w:tcPr>
+            <w:tcW w:type="dxa" w:w="3168"/>
+            <w:shd w:val="clear" w:fill="DBEAFE"/>
+            <w:vAlign w:val="center"/>
+          </w:tcPr>
+          <w:p>
+            <w:pPr>
+              <w:spacing w:after="0"/>
+            </w:pPr>
+            <w:r/>
+            <w:r>
+              <w:rPr>
+                <w:rFonts w:ascii="Aptos" w:hAnsi="Aptos"/>
+                <w:b/>
+                <w:color w:val="1E3A8A"/>
+                <w:sz w:val="17"/>
+              </w:rPr>
+              <w:t>Authoritative location</w:t>
+            </w:r>
+          </w:p>
+        </w:tc>
+        <w:tc>
+          <w:tcPr>
+            <w:tcW w:type="dxa" w:w="4104"/>
+            <w:shd w:val="clear" w:fill="DBEAFE"/>
+            <w:vAlign w:val="center"/>
+          </w:tcPr>
+          <w:p>
+            <w:pPr>
+              <w:spacing w:after="0"/>
+            </w:pPr>
+            <w:r/>
+            <w:r>
+              <w:rPr>
+                <w:rFonts w:ascii="Aptos" w:hAnsi="Aptos"/>
+                <w:b/>
+                <w:color w:val="1E3A8A"/>
+                <w:sz w:val="17"/>
+              </w:rPr>
+              <w:t>Durability / policy</w:t>
+            </w:r>
+          </w:p>
+        </w:tc>
+      </w:tr>
+      <w:tr>
+        <w:trPr>
+          <w:cantSplit/>
+        </w:trPr>
+        <w:tc>
+          <w:tcPr>
+            <w:tcW w:type="dxa" w:w="2448"/>
+            <w:vAlign w:val="center"/>
+          </w:tcPr>
+          <w:p>
+            <w:pPr>
+              <w:spacing w:after="0"/>
+            </w:pPr>
+            <w:r/>
+            <w:r>
+              <w:rPr>
+                <w:rFonts w:ascii="Aptos" w:hAnsi="Aptos"/>
+                <w:b w:val="0"/>
+                <w:color w:val="1E293B"/>
+                <w:sz w:val="16"/>
+              </w:rPr>
+              <w:t>Identity, teams, sessions, roles</w:t>
+            </w:r>
+          </w:p>
+        </w:tc>
+        <w:tc>
+          <w:tcPr>
+            <w:tcW w:type="dxa" w:w="3168"/>
+            <w:vAlign w:val="center"/>
+          </w:tcPr>
+          <w:p>
+            <w:pPr>
+              <w:spacing w:after="0"/>
+            </w:pPr>
+            <w:r/>
+            <w:r>
+              <w:rPr>
+                <w:rFonts w:ascii="Aptos" w:hAnsi="Aptos"/>
+                <w:b w:val="0"/>
+                <w:color w:val="1E293B"/>
+                <w:sz w:val="16"/>
+              </w:rPr>
+              <w:t>HK private PostgreSQL</w:t>
+            </w:r>
+          </w:p>
+        </w:tc>
+        <w:tc>
+          <w:tcPr>
+            <w:tcW w:type="dxa" w:w="4104"/>
+            <w:vAlign w:val="center"/>
+          </w:tcPr>
+          <w:p>
+            <w:pPr>
+              <w:spacing w:after="0"/>
+            </w:pPr>
+            <w:r/>
+            <w:r>
+              <w:rPr>
+                <w:rFonts w:ascii="Aptos" w:hAnsi="Aptos"/>
+                <w:b w:val="0"/>
+                <w:color w:val="1E293B"/>
+                <w:sz w:val="16"/>
+              </w:rPr>
+              <w:t>Primary + standby, encrypted backup and PITR; identity/platform owner access.</w:t>
+            </w:r>
+          </w:p>
+        </w:tc>
+      </w:tr>
+      <w:tr>
+        <w:trPr>
+          <w:cantSplit/>
+        </w:trPr>
+        <w:tc>
+          <w:tcPr>
+            <w:tcW w:type="dxa" w:w="2448"/>
+            <w:shd w:val="clear" w:fill="F1F5F9"/>
+            <w:vAlign w:val="center"/>
+          </w:tcPr>
+          <w:p>
+            <w:pPr>
+              <w:spacing w:after="0"/>
+            </w:pPr>
+            <w:r/>
+            <w:r>
+              <w:rPr>
+                <w:rFonts w:ascii="Aptos" w:hAnsi="Aptos"/>
+                <w:b w:val="0"/>
+                <w:color w:val="1E293B"/>
+                <w:sz w:val="16"/>
+              </w:rPr>
+              <w:t>Projects, jobs/outbox, approvals, policy, audit, budget</w:t>
+            </w:r>
+          </w:p>
+        </w:tc>
+        <w:tc>
+          <w:tcPr>
+            <w:tcW w:type="dxa" w:w="3168"/>
+            <w:shd w:val="clear" w:fill="F1F5F9"/>
+            <w:vAlign w:val="center"/>
+          </w:tcPr>
+          <w:p>
+            <w:pPr>
+              <w:spacing w:after="0"/>
+            </w:pPr>
+            <w:r/>
+            <w:r>
+              <w:rPr>
+                <w:rFonts w:ascii="Aptos" w:hAnsi="Aptos"/>
+                <w:b w:val="0"/>
+                <w:color w:val="1E293B"/>
+                <w:sz w:val="16"/>
+              </w:rPr>
+              <w:t>HK private PostgreSQL</w:t>
+            </w:r>
+          </w:p>
+        </w:tc>
+        <w:tc>
+          <w:tcPr>
+            <w:tcW w:type="dxa" w:w="4104"/>
+            <w:shd w:val="clear" w:fill="F1F5F9"/>
+            <w:vAlign w:val="center"/>
+          </w:tcPr>
+          <w:p>
+            <w:pPr>
+              <w:spacing w:after="0"/>
+            </w:pPr>
+            <w:r/>
+            <w:r>
+              <w:rPr>
+                <w:rFonts w:ascii="Aptos" w:hAnsi="Aptos"/>
+                <w:b w:val="0"/>
+                <w:color w:val="1E293B"/>
+                <w:sz w:val="16"/>
+              </w:rPr>
+              <w:t>Transactional truth, no public endpoint, PITR and DR-log copy.</w:t>
+            </w:r>
+          </w:p>
+        </w:tc>
+      </w:tr>
+      <w:tr>
+        <w:trPr>
+          <w:cantSplit/>
+        </w:trPr>
+        <w:tc>
+          <w:tcPr>
+            <w:tcW w:type="dxa" w:w="2448"/>
+            <w:vAlign w:val="center"/>
+          </w:tcPr>
+          <w:p>
+            <w:pPr>
+              <w:spacing w:after="0"/>
+            </w:pPr>
+            <w:r/>
+            <w:r>
+              <w:rPr>
+                <w:rFonts w:ascii="Aptos" w:hAnsi="Aptos"/>
+                <w:b w:val="0"/>
+                <w:color w:val="1E293B"/>
+                <w:sz w:val="16"/>
+              </w:rPr>
+              <w:t>Source and checkpoints</w:t>
+            </w:r>
+          </w:p>
+        </w:tc>
+        <w:tc>
+          <w:tcPr>
+            <w:tcW w:type="dxa" w:w="3168"/>
+            <w:vAlign w:val="center"/>
+          </w:tcPr>
+          <w:p>
+            <w:pPr>
+              <w:spacing w:after="0"/>
+            </w:pPr>
+            <w:r/>
+            <w:r>
+              <w:rPr>
+                <w:rFonts w:ascii="Aptos" w:hAnsi="Aptos"/>
+                <w:b w:val="0"/>
+                <w:color w:val="1E293B"/>
+                <w:sz w:val="16"/>
+              </w:rPr>
+              <w:t>Approved HK Git service</w:t>
+            </w:r>
+          </w:p>
+        </w:tc>
+        <w:tc>
+          <w:tcPr>
+            <w:tcW w:type="dxa" w:w="4104"/>
+            <w:vAlign w:val="center"/>
+          </w:tcPr>
+          <w:p>
+            <w:pPr>
+              <w:spacing w:after="0"/>
+            </w:pPr>
+            <w:r/>
+            <w:r>
+              <w:rPr>
+                <w:rFonts w:ascii="Aptos" w:hAnsi="Aptos"/>
+                <w:b w:val="0"/>
+                <w:color w:val="1E293B"/>
+                <w:sz w:val="16"/>
+              </w:rPr>
+              <w:t>Commit SHA is truth; protected branches, backup and exportability.</w:t>
+            </w:r>
+          </w:p>
+        </w:tc>
+      </w:tr>
+      <w:tr>
+        <w:trPr>
+          <w:cantSplit/>
+        </w:trPr>
+        <w:tc>
+          <w:tcPr>
+            <w:tcW w:type="dxa" w:w="2448"/>
+            <w:shd w:val="clear" w:fill="F1F5F9"/>
+            <w:vAlign w:val="center"/>
+          </w:tcPr>
+          <w:p>
+            <w:pPr>
+              <w:spacing w:after="0"/>
+            </w:pPr>
+            <w:r/>
+            <w:r>
+              <w:rPr>
+                <w:rFonts w:ascii="Aptos" w:hAnsi="Aptos"/>
+                <w:b w:val="0"/>
+                <w:color w:val="1E293B"/>
+                <w:sz w:val="16"/>
+              </w:rPr>
+              <w:t>Live workspace filesystem</w:t>
+            </w:r>
+          </w:p>
+        </w:tc>
+        <w:tc>
+          <w:tcPr>
+            <w:tcW w:type="dxa" w:w="3168"/>
+            <w:shd w:val="clear" w:fill="F1F5F9"/>
+            <w:vAlign w:val="center"/>
+          </w:tcPr>
+          <w:p>
+            <w:pPr>
+              <w:spacing w:after="0"/>
+            </w:pPr>
+            <w:r/>
+            <w:r>
+              <w:rPr>
+                <w:rFonts w:ascii="Aptos" w:hAnsi="Aptos"/>
+                <w:b w:val="0"/>
+                <w:color w:val="1E293B"/>
+                <w:sz w:val="16"/>
+              </w:rPr>
+              <w:t>Per-workspace PVC in active HK facility</w:t>
+            </w:r>
+          </w:p>
+        </w:tc>
+        <w:tc>
+          <w:tcPr>
+            <w:tcW w:type="dxa" w:w="4104"/>
+            <w:shd w:val="clear" w:fill="F1F5F9"/>
+            <w:vAlign w:val="center"/>
+          </w:tcPr>
+          <w:p>
+            <w:pPr>
+              <w:spacing w:after="0"/>
+            </w:pPr>
+            <w:r/>
+            <w:r>
+              <w:rPr>
+                <w:rFonts w:ascii="Aptos" w:hAnsi="Aptos"/>
+                <w:b w:val="0"/>
+                <w:color w:val="1E293B"/>
+                <w:sz w:val="16"/>
+              </w:rPr>
+              <w:t>Single-active 10/20/50 GiB; snapshot to HK object storage; no local-path-only copy.</w:t>
+            </w:r>
+          </w:p>
+        </w:tc>
+      </w:tr>
+      <w:tr>
+        <w:trPr>
+          <w:cantSplit/>
+        </w:trPr>
+        <w:tc>
+          <w:tcPr>
+            <w:tcW w:type="dxa" w:w="2448"/>
+            <w:vAlign w:val="center"/>
+          </w:tcPr>
+          <w:p>
+            <w:pPr>
+              <w:spacing w:after="0"/>
+            </w:pPr>
+            <w:r/>
+            <w:r>
+              <w:rPr>
+                <w:rFonts w:ascii="Aptos" w:hAnsi="Aptos"/>
+                <w:b w:val="0"/>
+                <w:color w:val="1E293B"/>
+                <w:sz w:val="16"/>
+              </w:rPr>
+              <w:t>Snapshots, POC artifacts, SBOM, evidence, handover</w:t>
+            </w:r>
+          </w:p>
+        </w:tc>
+        <w:tc>
+          <w:tcPr>
+            <w:tcW w:type="dxa" w:w="3168"/>
+            <w:vAlign w:val="center"/>
+          </w:tcPr>
+          <w:p>
+            <w:pPr>
+              <w:spacing w:after="0"/>
+            </w:pPr>
+            <w:r/>
+            <w:r>
+              <w:rPr>
+                <w:rFonts w:ascii="Aptos" w:hAnsi="Aptos"/>
+                <w:b w:val="0"/>
+                <w:color w:val="1E293B"/>
+                <w:sz w:val="16"/>
+              </w:rPr>
+              <w:t>HK object storage / OCI registry</w:t>
+            </w:r>
+          </w:p>
+        </w:tc>
+        <w:tc>
+          <w:tcPr>
+            <w:tcW w:type="dxa" w:w="4104"/>
+            <w:vAlign w:val="center"/>
+          </w:tcPr>
+          <w:p>
+            <w:pPr>
+              <w:spacing w:after="0"/>
+            </w:pPr>
+            <w:r/>
+            <w:r>
+              <w:rPr>
+                <w:rFonts w:ascii="Aptos" w:hAnsi="Aptos"/>
+                <w:b w:val="0"/>
+                <w:color w:val="1E293B"/>
+                <w:sz w:val="16"/>
+              </w:rPr>
+              <w:t>Digest, encryption, lifecycle/deletion policy and warm-passive HK replication.</w:t>
+            </w:r>
+          </w:p>
+        </w:tc>
+      </w:tr>
+      <w:tr>
+        <w:trPr>
+          <w:cantSplit/>
+        </w:trPr>
+        <w:tc>
+          <w:tcPr>
+            <w:tcW w:type="dxa" w:w="2448"/>
+            <w:shd w:val="clear" w:fill="F1F5F9"/>
+            <w:vAlign w:val="center"/>
+          </w:tcPr>
+          <w:p>
+            <w:pPr>
+              <w:spacing w:after="0"/>
+            </w:pPr>
+            <w:r/>
+            <w:r>
+              <w:rPr>
+                <w:rFonts w:ascii="Aptos" w:hAnsi="Aptos"/>
+                <w:b w:val="0"/>
+                <w:color w:val="1E293B"/>
+                <w:sz w:val="16"/>
+              </w:rPr>
+              <w:t>Presence and cache</w:t>
+            </w:r>
+          </w:p>
+        </w:tc>
+        <w:tc>
+          <w:tcPr>
+            <w:tcW w:type="dxa" w:w="3168"/>
+            <w:shd w:val="clear" w:fill="F1F5F9"/>
+            <w:vAlign w:val="center"/>
+          </w:tcPr>
+          <w:p>
+            <w:pPr>
+              <w:spacing w:after="0"/>
+            </w:pPr>
+            <w:r/>
+            <w:r>
+              <w:rPr>
+                <w:rFonts w:ascii="Aptos" w:hAnsi="Aptos"/>
+                <w:b w:val="0"/>
+                <w:color w:val="1E293B"/>
+                <w:sz w:val="16"/>
+              </w:rPr>
+              <w:t>HK Redis private endpoint</w:t>
+            </w:r>
+          </w:p>
+        </w:tc>
+        <w:tc>
+          <w:tcPr>
+            <w:tcW w:type="dxa" w:w="4104"/>
+            <w:shd w:val="clear" w:fill="F1F5F9"/>
+            <w:vAlign w:val="center"/>
+          </w:tcPr>
+          <w:p>
+            <w:pPr>
+              <w:spacing w:after="0"/>
+            </w:pPr>
+            <w:r/>
+            <w:r>
+              <w:rPr>
+                <w:rFonts w:ascii="Aptos" w:hAnsi="Aptos"/>
+                <w:b w:val="0"/>
+                <w:color w:val="1E293B"/>
+                <w:sz w:val="16"/>
+              </w:rPr>
+              <w:t>Primary/replica; rebuildable; never durable job or approval truth.</w:t>
+            </w:r>
+          </w:p>
+        </w:tc>
+      </w:tr>
+      <w:tr>
+        <w:trPr>
+          <w:cantSplit/>
+        </w:trPr>
+        <w:tc>
+          <w:tcPr>
+            <w:tcW w:type="dxa" w:w="2448"/>
+            <w:vAlign w:val="center"/>
+          </w:tcPr>
+          <w:p>
+            <w:pPr>
+              <w:spacing w:after="0"/>
+            </w:pPr>
+            <w:r/>
+            <w:r>
+              <w:rPr>
+                <w:rFonts w:ascii="Aptos" w:hAnsi="Aptos"/>
+                <w:b w:val="0"/>
+                <w:color w:val="1E293B"/>
+                <w:sz w:val="16"/>
+              </w:rPr>
+              <w:t>Logs, metrics and privacy-aware traces</w:t>
+            </w:r>
+          </w:p>
+        </w:tc>
+        <w:tc>
+          <w:tcPr>
+            <w:tcW w:type="dxa" w:w="3168"/>
+            <w:vAlign w:val="center"/>
+          </w:tcPr>
+          <w:p>
+            <w:pPr>
+              <w:spacing w:after="0"/>
+            </w:pPr>
+            <w:r/>
+            <w:r>
+              <w:rPr>
+                <w:rFonts w:ascii="Aptos" w:hAnsi="Aptos"/>
+                <w:b w:val="0"/>
+                <w:color w:val="1E293B"/>
+                <w:sz w:val="16"/>
+              </w:rPr>
+              <w:t>HK observability stores</w:t>
+            </w:r>
+          </w:p>
+        </w:tc>
+        <w:tc>
+          <w:tcPr>
+            <w:tcW w:type="dxa" w:w="4104"/>
+            <w:vAlign w:val="center"/>
+          </w:tcPr>
+          <w:p>
+            <w:pPr>
+              <w:spacing w:after="0"/>
+            </w:pPr>
+            <w:r/>
+            <w:r>
+              <w:rPr>
+                <w:rFonts w:ascii="Aptos" w:hAnsi="Aptos"/>
+                <w:b w:val="0"/>
+                <w:color w:val="1E293B"/>
+                <w:sz w:val="16"/>
+              </w:rPr>
+              <w:t>Explicit retention, RBAC, redaction and deletion; identity stays out of metric labels.</w:t>
+            </w:r>
+          </w:p>
+        </w:tc>
+      </w:tr>
+      <w:tr>
+        <w:trPr>
+          <w:cantSplit/>
+        </w:trPr>
+        <w:tc>
+          <w:tcPr>
+            <w:tcW w:type="dxa" w:w="2448"/>
+            <w:shd w:val="clear" w:fill="F1F5F9"/>
+            <w:vAlign w:val="center"/>
+          </w:tcPr>
+          <w:p>
+            <w:pPr>
+              <w:spacing w:after="0"/>
+            </w:pPr>
+            <w:r/>
+            <w:r>
+              <w:rPr>
+                <w:rFonts w:ascii="Aptos" w:hAnsi="Aptos"/>
+                <w:b w:val="0"/>
+                <w:color w:val="1E293B"/>
+                <w:sz w:val="16"/>
+              </w:rPr>
+              <w:t>Secrets and provider keys</w:t>
+            </w:r>
+          </w:p>
+        </w:tc>
+        <w:tc>
+          <w:tcPr>
+            <w:tcW w:type="dxa" w:w="3168"/>
+            <w:shd w:val="clear" w:fill="F1F5F9"/>
+            <w:vAlign w:val="center"/>
+          </w:tcPr>
+          <w:p>
+            <w:pPr>
+              <w:spacing w:after="0"/>
+            </w:pPr>
+            <w:r/>
+            <w:r>
+              <w:rPr>
+                <w:rFonts w:ascii="Aptos" w:hAnsi="Aptos"/>
+                <w:b w:val="0"/>
+                <w:color w:val="1E293B"/>
+                <w:sz w:val="16"/>
+              </w:rPr>
+              <w:t>HK Vault/KMS or approved secret manager</w:t>
+            </w:r>
+          </w:p>
+        </w:tc>
+        <w:tc>
+          <w:tcPr>
+            <w:tcW w:type="dxa" w:w="4104"/>
+            <w:shd w:val="clear" w:fill="F1F5F9"/>
+            <w:vAlign w:val="center"/>
+          </w:tcPr>
+          <w:p>
+            <w:pPr>
+              <w:spacing w:after="0"/>
+            </w:pPr>
+            <w:r/>
+            <w:r>
+              <w:rPr>
+                <w:rFonts w:ascii="Aptos" w:hAnsi="Aptos"/>
+                <w:b w:val="0"/>
+                <w:color w:val="1E293B"/>
+                <w:sz w:val="16"/>
+              </w:rPr>
+              <w:t>References only; scoped expiring virtual keys in workspaces.</w:t>
+            </w:r>
+          </w:p>
+        </w:tc>
+      </w:tr>
+      <w:tr>
+        <w:trPr>
+          <w:cantSplit/>
+        </w:trPr>
+        <w:tc>
+          <w:tcPr>
+            <w:tcW w:type="dxa" w:w="2448"/>
+            <w:vAlign w:val="center"/>
+          </w:tcPr>
+          <w:p>
+            <w:pPr>
+              <w:spacing w:after="0"/>
+            </w:pPr>
+            <w:r/>
+            <w:r>
+              <w:rPr>
+                <w:rFonts w:ascii="Aptos" w:hAnsi="Aptos"/>
+                <w:b w:val="0"/>
+                <w:color w:val="1E293B"/>
+                <w:sz w:val="16"/>
+              </w:rPr>
+              <w:t>AI prompts/responses</w:t>
+            </w:r>
+          </w:p>
+        </w:tc>
+        <w:tc>
+          <w:tcPr>
+            <w:tcW w:type="dxa" w:w="3168"/>
+            <w:vAlign w:val="center"/>
+          </w:tcPr>
+          <w:p>
+            <w:pPr>
+              <w:spacing w:after="0"/>
+            </w:pPr>
+            <w:r/>
+            <w:r>
+              <w:rPr>
+                <w:rFonts w:ascii="Aptos" w:hAnsi="Aptos"/>
+                <w:b w:val="0"/>
+                <w:color w:val="1E293B"/>
+                <w:sz w:val="16"/>
+              </w:rPr>
+              <w:t>Policy-approved model endpoint</w:t>
+            </w:r>
+          </w:p>
+        </w:tc>
+        <w:tc>
+          <w:tcPr>
+            <w:tcW w:type="dxa" w:w="4104"/>
+            <w:vAlign w:val="center"/>
+          </w:tcPr>
+          <w:p>
+            <w:pPr>
+              <w:spacing w:after="0"/>
+            </w:pPr>
+            <w:r/>
+            <w:r>
+              <w:rPr>
+                <w:rFonts w:ascii="Aptos" w:hAnsi="Aptos"/>
+                <w:b w:val="0"/>
+                <w:color w:val="1E293B"/>
+                <w:sz w:val="16"/>
+              </w:rPr>
+              <w:t>Residency/retention/training-use gate; HK-only requires HK/private endpoint or route block.</w:t>
+            </w:r>
+          </w:p>
+        </w:tc>
+      </w:tr>
+      <w:tr>
+        <w:trPr>
+          <w:cantSplit/>
+        </w:trPr>
+        <w:tc>
+          <w:tcPr>
+            <w:tcW w:type="dxa" w:w="2448"/>
+            <w:shd w:val="clear" w:fill="F1F5F9"/>
+            <w:vAlign w:val="center"/>
+          </w:tcPr>
+          <w:p>
+            <w:pPr>
+              <w:spacing w:after="0"/>
+            </w:pPr>
+            <w:r/>
+            <w:r>
+              <w:rPr>
+                <w:rFonts w:ascii="Aptos" w:hAnsi="Aptos"/>
+                <w:b w:val="0"/>
+                <w:color w:val="1E293B"/>
+                <w:sz w:val="16"/>
+              </w:rPr>
+              <w:t>DR copies</w:t>
+            </w:r>
+          </w:p>
+        </w:tc>
+        <w:tc>
+          <w:tcPr>
+            <w:tcW w:type="dxa" w:w="3168"/>
+            <w:shd w:val="clear" w:fill="F1F5F9"/>
+            <w:vAlign w:val="center"/>
+          </w:tcPr>
+          <w:p>
+            <w:pPr>
+              <w:spacing w:after="0"/>
+            </w:pPr>
+            <w:r/>
+            <w:r>
+              <w:rPr>
+                <w:rFonts w:ascii="Aptos" w:hAnsi="Aptos"/>
+                <w:b w:val="0"/>
+                <w:color w:val="1E293B"/>
+                <w:sz w:val="16"/>
+              </w:rPr>
+              <w:t>Separate HK DC/cloud failure domain</w:t>
+            </w:r>
+          </w:p>
+        </w:tc>
+        <w:tc>
+          <w:tcPr>
+            <w:tcW w:type="dxa" w:w="4104"/>
+            <w:shd w:val="clear" w:fill="F1F5F9"/>
+            <w:vAlign w:val="center"/>
+          </w:tcPr>
+          <w:p>
+            <w:pPr>
+              <w:spacing w:after="0"/>
+            </w:pPr>
+            <w:r/>
+            <w:r>
+              <w:rPr>
+                <w:rFonts w:ascii="Aptos" w:hAnsi="Aptos"/>
+                <w:b w:val="0"/>
+                <w:color w:val="1E293B"/>
+                <w:sz w:val="16"/>
+              </w:rPr>
+              <w:t>PITR/log, object/registry, GitOps, images and secret references; no dual writers.</w:t>
+            </w:r>
+          </w:p>
+        </w:tc>
+      </w:tr>
+    </w:tbl>
+    <w:p>
+      <w:pPr>
+        <w:spacing w:after="0"/>
+      </w:pPr>
+    </w:p>
+    <w:tbl>
+      <w:tblPr>
+        <w:tblW w:type="auto" w:w="0"/>
+        <w:jc w:val="center"/>
+        <w:tblLook w:firstColumn="1" w:firstRow="1" w:lastColumn="0" w:lastRow="0" w:noHBand="0" w:noVBand="1" w:val="04A0"/>
+      </w:tblPr>
+      <w:tblGrid>
+        <w:gridCol w:w="10166"/>
+      </w:tblGrid>
+      <w:tr>
+        <w:trPr>
+          <w:cantSplit/>
+        </w:trPr>
+        <w:tc>
+          <w:tcPr>
+            <w:tcW w:type="dxa" w:w="10166"/>
+            <w:shd w:val="clear" w:fill="EFF6FF"/>
+          </w:tcPr>
+          <w:p>
+            <w:pPr>
+              <w:pStyle w:val="Callout"/>
+            </w:pPr>
+            <w:r>
+              <w:t>Residual risk: an HK-only active/DR design does not survive a territory-wide Hong Kong outage. If policy forbids overseas DR, record and accept that limitation instead of claiming unsupported multi-region HA.</w:t>
+            </w:r>
+          </w:p>
+        </w:tc>
+      </w:tr>
+    </w:tbl>
+    <w:p>
+      <w:pPr>
+        <w:spacing w:after="0"/>
+      </w:pPr>
+    </w:p>
+    <w:p>
+      <w:r>
+        <w:br w:type="page"/>
+      </w:r>
+    </w:p>
+    <w:p>
+      <w:pPr>
+        <w:pStyle w:val="Heading1"/>
+      </w:pPr>
+      <w:r>
+        <w:t>5. Staged delivery roadmap</w:t>
       </w:r>
     </w:p>
     <w:p>
@@ -2239,7 +3888,7 @@
         <w:tc>
           <w:tcPr>
             <w:tcW w:type="dxa" w:w="1512"/>
-            <w:shd w:val="clear" w:fill="0F172A"/>
+            <w:shd w:val="clear" w:fill="DBEAFE"/>
             <w:vAlign w:val="center"/>
           </w:tcPr>
           <w:p>
@@ -2251,7 +3900,7 @@
               <w:rPr>
                 <w:rFonts w:ascii="Aptos" w:hAnsi="Aptos"/>
                 <w:b/>
-                <w:color w:val="FFFFFF"/>
+                <w:color w:val="1E3A8A"/>
                 <w:sz w:val="17"/>
               </w:rPr>
               <w:t>Stage</w:t>
@@ -2261,7 +3910,7 @@
         <w:tc>
           <w:tcPr>
             <w:tcW w:type="dxa" w:w="1152"/>
-            <w:shd w:val="clear" w:fill="0F172A"/>
+            <w:shd w:val="clear" w:fill="DBEAFE"/>
             <w:vAlign w:val="center"/>
           </w:tcPr>
           <w:p>
@@ -2273,7 +3922,7 @@
               <w:rPr>
                 <w:rFonts w:ascii="Aptos" w:hAnsi="Aptos"/>
                 <w:b/>
-                <w:color w:val="FFFFFF"/>
+                <w:color w:val="1E3A8A"/>
                 <w:sz w:val="17"/>
               </w:rPr>
               <w:t>Duration</w:t>
@@ -2283,7 +3932,7 @@
         <w:tc>
           <w:tcPr>
             <w:tcW w:type="dxa" w:w="4464"/>
-            <w:shd w:val="clear" w:fill="0F172A"/>
+            <w:shd w:val="clear" w:fill="DBEAFE"/>
             <w:vAlign w:val="center"/>
           </w:tcPr>
           <w:p>
@@ -2295,7 +3944,7 @@
               <w:rPr>
                 <w:rFonts w:ascii="Aptos" w:hAnsi="Aptos"/>
                 <w:b/>
-                <w:color w:val="FFFFFF"/>
+                <w:color w:val="1E3A8A"/>
                 <w:sz w:val="17"/>
               </w:rPr>
               <w:t>Primary outcome</w:t>
@@ -2305,7 +3954,7 @@
         <w:tc>
           <w:tcPr>
             <w:tcW w:type="dxa" w:w="3168"/>
-            <w:shd w:val="clear" w:fill="0F172A"/>
+            <w:shd w:val="clear" w:fill="DBEAFE"/>
             <w:vAlign w:val="center"/>
           </w:tcPr>
           <w:p>
@@ -2317,7 +3966,7 @@
               <w:rPr>
                 <w:rFonts w:ascii="Aptos" w:hAnsi="Aptos"/>
                 <w:b/>
-                <w:color w:val="FFFFFF"/>
+                <w:color w:val="1E3A8A"/>
                 <w:sz w:val="17"/>
               </w:rPr>
               <w:t>Gate / exclusion</w:t>
@@ -2984,7 +4633,7 @@
         <w:pStyle w:val="Heading1"/>
       </w:pPr>
       <w:r>
-        <w:t>5. Stage 0 feasibility spike</w:t>
+        <w:t>6. Stage 0 feasibility spike</w:t>
       </w:r>
     </w:p>
     <w:p>
@@ -3125,7 +4774,7 @@
         <w:tc>
           <w:tcPr>
             <w:tcW w:type="dxa" w:w="2088"/>
-            <w:shd w:val="clear" w:fill="0F172A"/>
+            <w:shd w:val="clear" w:fill="DBEAFE"/>
             <w:vAlign w:val="center"/>
           </w:tcPr>
           <w:p>
@@ -3137,7 +4786,7 @@
               <w:rPr>
                 <w:rFonts w:ascii="Aptos" w:hAnsi="Aptos"/>
                 <w:b/>
-                <w:color w:val="FFFFFF"/>
+                <w:color w:val="1E3A8A"/>
                 <w:sz w:val="17"/>
               </w:rPr>
               <w:t>Outcome</w:t>
@@ -3147,7 +4796,7 @@
         <w:tc>
           <w:tcPr>
             <w:tcW w:type="dxa" w:w="7632"/>
-            <w:shd w:val="clear" w:fill="0F172A"/>
+            <w:shd w:val="clear" w:fill="DBEAFE"/>
             <w:vAlign w:val="center"/>
           </w:tcPr>
           <w:p>
@@ -3159,7 +4808,7 @@
               <w:rPr>
                 <w:rFonts w:ascii="Aptos" w:hAnsi="Aptos"/>
                 <w:b/>
-                <w:color w:val="FFFFFF"/>
+                <w:color w:val="1E3A8A"/>
                 <w:sz w:val="17"/>
               </w:rPr>
               <w:t>Condition</w:t>
@@ -3321,7 +4970,7 @@
         <w:pStyle w:val="Heading1"/>
       </w:pPr>
       <w:r>
-        <w:t>6. Security and operational boundaries</w:t>
+        <w:t>7. Security and operational boundaries</w:t>
       </w:r>
     </w:p>
     <w:p>
@@ -3422,7 +5071,7 @@
         <w:tc>
           <w:tcPr>
             <w:tcW w:type="dxa" w:w="2592"/>
-            <w:shd w:val="clear" w:fill="0F172A"/>
+            <w:shd w:val="clear" w:fill="DBEAFE"/>
             <w:vAlign w:val="center"/>
           </w:tcPr>
           <w:p>
@@ -3434,7 +5083,7 @@
               <w:rPr>
                 <w:rFonts w:ascii="Aptos" w:hAnsi="Aptos"/>
                 <w:b/>
-                <w:color w:val="FFFFFF"/>
+                <w:color w:val="1E3A8A"/>
                 <w:sz w:val="17"/>
               </w:rPr>
               <w:t>Failure</w:t>
@@ -3444,7 +5093,7 @@
         <w:tc>
           <w:tcPr>
             <w:tcW w:type="dxa" w:w="7128"/>
-            <w:shd w:val="clear" w:fill="0F172A"/>
+            <w:shd w:val="clear" w:fill="DBEAFE"/>
             <w:vAlign w:val="center"/>
           </w:tcPr>
           <w:p>
@@ -3456,7 +5105,7 @@
               <w:rPr>
                 <w:rFonts w:ascii="Aptos" w:hAnsi="Aptos"/>
                 <w:b/>
-                <w:color w:val="FFFFFF"/>
+                <w:color w:val="1E3A8A"/>
                 <w:sz w:val="17"/>
               </w:rPr>
               <w:t>Expected platform behaviour</w:t>
@@ -3763,7 +5412,7 @@
         <w:pStyle w:val="Heading1"/>
       </w:pPr>
       <w:r>
-        <w:t>7. Key risks and decision owners</w:t>
+        <w:t>8. Key risks and decision owners</w:t>
       </w:r>
     </w:p>
     <w:tbl>
@@ -3785,7 +5434,7 @@
         <w:tc>
           <w:tcPr>
             <w:tcW w:type="dxa" w:w="2232"/>
-            <w:shd w:val="clear" w:fill="0F172A"/>
+            <w:shd w:val="clear" w:fill="DBEAFE"/>
             <w:vAlign w:val="center"/>
           </w:tcPr>
           <w:p>
@@ -3797,7 +5446,7 @@
               <w:rPr>
                 <w:rFonts w:ascii="Aptos" w:hAnsi="Aptos"/>
                 <w:b/>
-                <w:color w:val="FFFFFF"/>
+                <w:color w:val="1E3A8A"/>
                 <w:sz w:val="17"/>
               </w:rPr>
               <w:t>Risk</w:t>
@@ -3807,7 +5456,7 @@
         <w:tc>
           <w:tcPr>
             <w:tcW w:type="dxa" w:w="6120"/>
-            <w:shd w:val="clear" w:fill="0F172A"/>
+            <w:shd w:val="clear" w:fill="DBEAFE"/>
             <w:vAlign w:val="center"/>
           </w:tcPr>
           <w:p>
@@ -3819,7 +5468,7 @@
               <w:rPr>
                 <w:rFonts w:ascii="Aptos" w:hAnsi="Aptos"/>
                 <w:b/>
-                <w:color w:val="FFFFFF"/>
+                <w:color w:val="1E3A8A"/>
                 <w:sz w:val="17"/>
               </w:rPr>
               <w:t>Required decision / evidence</w:t>
@@ -3829,7 +5478,7 @@
         <w:tc>
           <w:tcPr>
             <w:tcW w:type="dxa" w:w="1800"/>
-            <w:shd w:val="clear" w:fill="0F172A"/>
+            <w:shd w:val="clear" w:fill="DBEAFE"/>
             <w:vAlign w:val="center"/>
           </w:tcPr>
           <w:p>
@@ -3841,7 +5490,7 @@
               <w:rPr>
                 <w:rFonts w:ascii="Aptos" w:hAnsi="Aptos"/>
                 <w:b/>
-                <w:color w:val="FFFFFF"/>
+                <w:color w:val="1E3A8A"/>
                 <w:sz w:val="17"/>
               </w:rPr>
               <w:t>Owner</w:t>
@@ -4484,7 +6133,7 @@
         <w:pStyle w:val="Heading1"/>
       </w:pPr>
       <w:r>
-        <w:t>8. Immediate decision package</w:t>
+        <w:t>9. Immediate decision package</w:t>
       </w:r>
     </w:p>
     <w:p>
@@ -4613,7 +6262,7 @@
         <w:pStyle w:val="Heading1"/>
       </w:pPr>
       <w:r>
-        <w:t>9. Repository references</w:t>
+        <w:t>10. Repository references</w:t>
       </w:r>
     </w:p>
     <w:tbl>
@@ -4634,7 +6283,7 @@
         <w:tc>
           <w:tcPr>
             <w:tcW w:type="dxa" w:w="3168"/>
-            <w:shd w:val="clear" w:fill="0F172A"/>
+            <w:shd w:val="clear" w:fill="DBEAFE"/>
             <w:vAlign w:val="center"/>
           </w:tcPr>
           <w:p>
@@ -4646,7 +6295,7 @@
               <w:rPr>
                 <w:rFonts w:ascii="Aptos" w:hAnsi="Aptos"/>
                 <w:b/>
-                <w:color w:val="FFFFFF"/>
+                <w:color w:val="1E3A8A"/>
                 <w:sz w:val="17"/>
               </w:rPr>
               <w:t>Artifact</w:t>
@@ -4656,7 +6305,7 @@
         <w:tc>
           <w:tcPr>
             <w:tcW w:type="dxa" w:w="6552"/>
-            <w:shd w:val="clear" w:fill="0F172A"/>
+            <w:shd w:val="clear" w:fill="DBEAFE"/>
             <w:vAlign w:val="center"/>
           </w:tcPr>
           <w:p>
@@ -4668,7 +6317,7 @@
               <w:rPr>
                 <w:rFonts w:ascii="Aptos" w:hAnsi="Aptos"/>
                 <w:b/>
-                <w:color w:val="FFFFFF"/>
+                <w:color w:val="1E3A8A"/>
                 <w:sz w:val="17"/>
               </w:rPr>
               <w:t>Repository path</w:t>

</xml_diff>

<commit_message>
docs: add production decision register
</commit_message>
<xml_diff>
--- a/wiki/architecture/reports/vibe-code-platform-architecture-and-plan.docx
+++ b/wiki/architecture/reports/vibe-code-platform-architecture-and-plan.docx
@@ -5408,6 +5408,11 @@
       </w:pPr>
     </w:p>
     <w:p>
+      <w:r>
+        <w:br w:type="page"/>
+      </w:r>
+    </w:p>
+    <w:p>
       <w:pPr>
         <w:pStyle w:val="Heading1"/>
       </w:pPr>
@@ -6129,11 +6134,2613 @@
       </w:pPr>
     </w:p>
     <w:p>
+      <w:r>
+        <w:br w:type="page"/>
+      </w:r>
+    </w:p>
+    <w:p>
       <w:pPr>
         <w:pStyle w:val="Heading1"/>
       </w:pPr>
       <w:r>
-        <w:t>9. Immediate decision package</w:t>
+        <w:t>9. Planning assumptions and decision register</w:t>
+      </w:r>
+    </w:p>
+    <w:p>
+      <w:r>
+        <w:t>This section is intentionally incomplete. It is the structured placeholder that product, infrastructure, security, data, network and operations owners must complete before production design freeze. A blank field is not approval: record DECISION REQUIRED, assign one accountable owner, set a due date and attach evidence.</w:t>
+      </w:r>
+    </w:p>
+    <w:p>
+      <w:pPr>
+        <w:pStyle w:val="Heading2"/>
+      </w:pPr>
+      <w:r>
+        <w:t>Feature and phase register</w:t>
+      </w:r>
+    </w:p>
+    <w:tbl>
+      <w:tblPr>
+        <w:tblStyle w:val="TableGrid"/>
+        <w:tblW w:type="auto" w:w="0"/>
+        <w:jc w:val="center"/>
+        <w:tblLook w:firstColumn="1" w:firstRow="1" w:lastColumn="0" w:lastRow="0" w:noHBand="0" w:noVBand="1" w:val="04A0"/>
+      </w:tblPr>
+      <w:tblGrid>
+        <w:gridCol w:w="2541"/>
+        <w:gridCol w:w="2541"/>
+        <w:gridCol w:w="2541"/>
+        <w:gridCol w:w="2541"/>
+      </w:tblGrid>
+      <w:tr>
+        <w:trPr>
+          <w:cantSplit/>
+        </w:trPr>
+        <w:tc>
+          <w:tcPr>
+            <w:tcW w:type="dxa" w:w="2664"/>
+            <w:shd w:val="clear" w:fill="DBEAFE"/>
+            <w:vAlign w:val="center"/>
+          </w:tcPr>
+          <w:p>
+            <w:pPr>
+              <w:spacing w:after="0"/>
+            </w:pPr>
+            <w:r/>
+            <w:r>
+              <w:rPr>
+                <w:rFonts w:ascii="Aptos" w:hAnsi="Aptos"/>
+                <w:b/>
+                <w:color w:val="1E3A8A"/>
+                <w:sz w:val="17"/>
+              </w:rPr>
+              <w:t>Feature / capability</w:t>
+            </w:r>
+          </w:p>
+        </w:tc>
+        <w:tc>
+          <w:tcPr>
+            <w:tcW w:type="dxa" w:w="1152"/>
+            <w:shd w:val="clear" w:fill="DBEAFE"/>
+            <w:vAlign w:val="center"/>
+          </w:tcPr>
+          <w:p>
+            <w:pPr>
+              <w:spacing w:after="0"/>
+            </w:pPr>
+            <w:r/>
+            <w:r>
+              <w:rPr>
+                <w:rFonts w:ascii="Aptos" w:hAnsi="Aptos"/>
+                <w:b/>
+                <w:color w:val="1E3A8A"/>
+                <w:sz w:val="17"/>
+              </w:rPr>
+              <w:t>Proposed phase</w:t>
+            </w:r>
+          </w:p>
+        </w:tc>
+        <w:tc>
+          <w:tcPr>
+            <w:tcW w:type="dxa" w:w="3672"/>
+            <w:shd w:val="clear" w:fill="DBEAFE"/>
+            <w:vAlign w:val="center"/>
+          </w:tcPr>
+          <w:p>
+            <w:pPr>
+              <w:spacing w:after="0"/>
+            </w:pPr>
+            <w:r/>
+            <w:r>
+              <w:rPr>
+                <w:rFonts w:ascii="Aptos" w:hAnsi="Aptos"/>
+                <w:b/>
+                <w:color w:val="1E3A8A"/>
+                <w:sz w:val="17"/>
+              </w:rPr>
+              <w:t>Production gate</w:t>
+            </w:r>
+          </w:p>
+        </w:tc>
+        <w:tc>
+          <w:tcPr>
+            <w:tcW w:type="dxa" w:w="2304"/>
+            <w:shd w:val="clear" w:fill="DBEAFE"/>
+            <w:vAlign w:val="center"/>
+          </w:tcPr>
+          <w:p>
+            <w:pPr>
+              <w:spacing w:after="0"/>
+            </w:pPr>
+            <w:r/>
+            <w:r>
+              <w:rPr>
+                <w:rFonts w:ascii="Aptos" w:hAnsi="Aptos"/>
+                <w:b/>
+                <w:color w:val="1E3A8A"/>
+                <w:sz w:val="17"/>
+              </w:rPr>
+              <w:t>Owner / status</w:t>
+            </w:r>
+          </w:p>
+        </w:tc>
+      </w:tr>
+      <w:tr>
+        <w:trPr>
+          <w:cantSplit/>
+        </w:trPr>
+        <w:tc>
+          <w:tcPr>
+            <w:tcW w:type="dxa" w:w="2664"/>
+            <w:vAlign w:val="center"/>
+          </w:tcPr>
+          <w:p>
+            <w:pPr>
+              <w:spacing w:after="0"/>
+            </w:pPr>
+            <w:r/>
+            <w:r>
+              <w:rPr>
+                <w:rFonts w:ascii="Aptos" w:hAnsi="Aptos"/>
+                <w:b w:val="0"/>
+                <w:color w:val="1E293B"/>
+                <w:sz w:val="16"/>
+              </w:rPr>
+              <w:t>Portal, SSO, project list and workspace lifecycle</w:t>
+            </w:r>
+          </w:p>
+        </w:tc>
+        <w:tc>
+          <w:tcPr>
+            <w:tcW w:type="dxa" w:w="1152"/>
+            <w:vAlign w:val="center"/>
+          </w:tcPr>
+          <w:p>
+            <w:pPr>
+              <w:spacing w:after="0"/>
+            </w:pPr>
+            <w:r/>
+            <w:r>
+              <w:rPr>
+                <w:rFonts w:ascii="Aptos" w:hAnsi="Aptos"/>
+                <w:b w:val="0"/>
+                <w:color w:val="1E293B"/>
+                <w:sz w:val="16"/>
+              </w:rPr>
+              <w:t>Stage 1</w:t>
+            </w:r>
+          </w:p>
+        </w:tc>
+        <w:tc>
+          <w:tcPr>
+            <w:tcW w:type="dxa" w:w="3672"/>
+            <w:vAlign w:val="center"/>
+          </w:tcPr>
+          <w:p>
+            <w:pPr>
+              <w:spacing w:after="0"/>
+            </w:pPr>
+            <w:r/>
+            <w:r>
+              <w:rPr>
+                <w:rFonts w:ascii="Aptos" w:hAnsi="Aptos"/>
+                <w:b w:val="0"/>
+                <w:color w:val="1E293B"/>
+                <w:sz w:val="16"/>
+              </w:rPr>
+              <w:t>Repeatable journey for 5–10 named users</w:t>
+            </w:r>
+          </w:p>
+        </w:tc>
+        <w:tc>
+          <w:tcPr>
+            <w:tcW w:type="dxa" w:w="2304"/>
+            <w:vAlign w:val="center"/>
+          </w:tcPr>
+          <w:p>
+            <w:pPr>
+              <w:spacing w:after="0"/>
+            </w:pPr>
+            <w:r/>
+            <w:r>
+              <w:rPr>
+                <w:rFonts w:ascii="Aptos" w:hAnsi="Aptos"/>
+                <w:b w:val="0"/>
+                <w:color w:val="1E293B"/>
+                <w:sz w:val="16"/>
+              </w:rPr>
+              <w:t>Product / identity — DECISION REQUIRED</w:t>
+            </w:r>
+          </w:p>
+        </w:tc>
+      </w:tr>
+      <w:tr>
+        <w:trPr>
+          <w:cantSplit/>
+        </w:trPr>
+        <w:tc>
+          <w:tcPr>
+            <w:tcW w:type="dxa" w:w="2664"/>
+            <w:shd w:val="clear" w:fill="F1F5F9"/>
+            <w:vAlign w:val="center"/>
+          </w:tcPr>
+          <w:p>
+            <w:pPr>
+              <w:spacing w:after="0"/>
+            </w:pPr>
+            <w:r/>
+            <w:r>
+              <w:rPr>
+                <w:rFonts w:ascii="Aptos" w:hAnsi="Aptos"/>
+                <w:b w:val="0"/>
+                <w:color w:val="1E293B"/>
+                <w:sz w:val="16"/>
+              </w:rPr>
+              <w:t>Golden React/FastAPI template and authenticated preview</w:t>
+            </w:r>
+          </w:p>
+        </w:tc>
+        <w:tc>
+          <w:tcPr>
+            <w:tcW w:type="dxa" w:w="1152"/>
+            <w:shd w:val="clear" w:fill="F1F5F9"/>
+            <w:vAlign w:val="center"/>
+          </w:tcPr>
+          <w:p>
+            <w:pPr>
+              <w:spacing w:after="0"/>
+            </w:pPr>
+            <w:r/>
+            <w:r>
+              <w:rPr>
+                <w:rFonts w:ascii="Aptos" w:hAnsi="Aptos"/>
+                <w:b w:val="0"/>
+                <w:color w:val="1E293B"/>
+                <w:sz w:val="16"/>
+              </w:rPr>
+              <w:t>Stage 0–1</w:t>
+            </w:r>
+          </w:p>
+        </w:tc>
+        <w:tc>
+          <w:tcPr>
+            <w:tcW w:type="dxa" w:w="3672"/>
+            <w:shd w:val="clear" w:fill="F1F5F9"/>
+            <w:vAlign w:val="center"/>
+          </w:tcPr>
+          <w:p>
+            <w:pPr>
+              <w:spacing w:after="0"/>
+            </w:pPr>
+            <w:r/>
+            <w:r>
+              <w:rPr>
+                <w:rFonts w:ascii="Aptos" w:hAnsi="Aptos"/>
+                <w:b w:val="0"/>
+                <w:color w:val="1E293B"/>
+                <w:sz w:val="16"/>
+              </w:rPr>
+              <w:t>Browser E2E, persistence and isolation evidence</w:t>
+            </w:r>
+          </w:p>
+        </w:tc>
+        <w:tc>
+          <w:tcPr>
+            <w:tcW w:type="dxa" w:w="2304"/>
+            <w:shd w:val="clear" w:fill="F1F5F9"/>
+            <w:vAlign w:val="center"/>
+          </w:tcPr>
+          <w:p>
+            <w:pPr>
+              <w:spacing w:after="0"/>
+            </w:pPr>
+            <w:r/>
+            <w:r>
+              <w:rPr>
+                <w:rFonts w:ascii="Aptos" w:hAnsi="Aptos"/>
+                <w:b w:val="0"/>
+                <w:color w:val="1E293B"/>
+                <w:sz w:val="16"/>
+              </w:rPr>
+              <w:t>Template owner — DECISION REQUIRED</w:t>
+            </w:r>
+          </w:p>
+        </w:tc>
+      </w:tr>
+      <w:tr>
+        <w:trPr>
+          <w:cantSplit/>
+        </w:trPr>
+        <w:tc>
+          <w:tcPr>
+            <w:tcW w:type="dxa" w:w="2664"/>
+            <w:vAlign w:val="center"/>
+          </w:tcPr>
+          <w:p>
+            <w:pPr>
+              <w:spacing w:after="0"/>
+            </w:pPr>
+            <w:r/>
+            <w:r>
+              <w:rPr>
+                <w:rFonts w:ascii="Aptos" w:hAnsi="Aptos"/>
+                <w:b w:val="0"/>
+                <w:color w:val="1E293B"/>
+                <w:sz w:val="16"/>
+              </w:rPr>
+              <w:t>Immutable templates, packages, scans and handover</w:t>
+            </w:r>
+          </w:p>
+        </w:tc>
+        <w:tc>
+          <w:tcPr>
+            <w:tcW w:type="dxa" w:w="1152"/>
+            <w:vAlign w:val="center"/>
+          </w:tcPr>
+          <w:p>
+            <w:pPr>
+              <w:spacing w:after="0"/>
+            </w:pPr>
+            <w:r/>
+            <w:r>
+              <w:rPr>
+                <w:rFonts w:ascii="Aptos" w:hAnsi="Aptos"/>
+                <w:b w:val="0"/>
+                <w:color w:val="1E293B"/>
+                <w:sz w:val="16"/>
+              </w:rPr>
+              <w:t>Stage 2</w:t>
+            </w:r>
+          </w:p>
+        </w:tc>
+        <w:tc>
+          <w:tcPr>
+            <w:tcW w:type="dxa" w:w="3672"/>
+            <w:vAlign w:val="center"/>
+          </w:tcPr>
+          <w:p>
+            <w:pPr>
+              <w:spacing w:after="0"/>
+            </w:pPr>
+            <w:r/>
+            <w:r>
+              <w:rPr>
+                <w:rFonts w:ascii="Aptos" w:hAnsi="Aptos"/>
+                <w:b w:val="0"/>
+                <w:color w:val="1E293B"/>
+                <w:sz w:val="16"/>
+              </w:rPr>
+              <w:t>Versioning, SBOM, compatibility and IT receipt</w:t>
+            </w:r>
+          </w:p>
+        </w:tc>
+        <w:tc>
+          <w:tcPr>
+            <w:tcW w:type="dxa" w:w="2304"/>
+            <w:vAlign w:val="center"/>
+          </w:tcPr>
+          <w:p>
+            <w:pPr>
+              <w:spacing w:after="0"/>
+            </w:pPr>
+            <w:r/>
+            <w:r>
+              <w:rPr>
+                <w:rFonts w:ascii="Aptos" w:hAnsi="Aptos"/>
+                <w:b w:val="0"/>
+                <w:color w:val="1E293B"/>
+                <w:sz w:val="16"/>
+              </w:rPr>
+              <w:t>Platform / security — DECISION REQUIRED</w:t>
+            </w:r>
+          </w:p>
+        </w:tc>
+      </w:tr>
+      <w:tr>
+        <w:trPr>
+          <w:cantSplit/>
+        </w:trPr>
+        <w:tc>
+          <w:tcPr>
+            <w:tcW w:type="dxa" w:w="2664"/>
+            <w:shd w:val="clear" w:fill="F1F5F9"/>
+            <w:vAlign w:val="center"/>
+          </w:tcPr>
+          <w:p>
+            <w:pPr>
+              <w:spacing w:after="0"/>
+            </w:pPr>
+            <w:r/>
+            <w:r>
+              <w:rPr>
+                <w:rFonts w:ascii="Aptos" w:hAnsi="Aptos"/>
+                <w:b w:val="0"/>
+                <w:color w:val="1E293B"/>
+                <w:sz w:val="16"/>
+              </w:rPr>
+              <w:t>30–50 concurrent workspace scaling</w:t>
+            </w:r>
+          </w:p>
+        </w:tc>
+        <w:tc>
+          <w:tcPr>
+            <w:tcW w:type="dxa" w:w="1152"/>
+            <w:shd w:val="clear" w:fill="F1F5F9"/>
+            <w:vAlign w:val="center"/>
+          </w:tcPr>
+          <w:p>
+            <w:pPr>
+              <w:spacing w:after="0"/>
+            </w:pPr>
+            <w:r/>
+            <w:r>
+              <w:rPr>
+                <w:rFonts w:ascii="Aptos" w:hAnsi="Aptos"/>
+                <w:b w:val="0"/>
+                <w:color w:val="1E293B"/>
+                <w:sz w:val="16"/>
+              </w:rPr>
+              <w:t>Stage 3</w:t>
+            </w:r>
+          </w:p>
+        </w:tc>
+        <w:tc>
+          <w:tcPr>
+            <w:tcW w:type="dxa" w:w="3672"/>
+            <w:shd w:val="clear" w:fill="F1F5F9"/>
+            <w:vAlign w:val="center"/>
+          </w:tcPr>
+          <w:p>
+            <w:pPr>
+              <w:spacing w:after="0"/>
+            </w:pPr>
+            <w:r/>
+            <w:r>
+              <w:rPr>
+                <w:rFonts w:ascii="Aptos" w:hAnsi="Aptos"/>
+                <w:b w:val="0"/>
+                <w:color w:val="1E293B"/>
+                <w:sz w:val="16"/>
+              </w:rPr>
+              <w:t>Mixed-load test, N+1 node loss and admission queue</w:t>
+            </w:r>
+          </w:p>
+        </w:tc>
+        <w:tc>
+          <w:tcPr>
+            <w:tcW w:type="dxa" w:w="2304"/>
+            <w:shd w:val="clear" w:fill="F1F5F9"/>
+            <w:vAlign w:val="center"/>
+          </w:tcPr>
+          <w:p>
+            <w:pPr>
+              <w:spacing w:after="0"/>
+            </w:pPr>
+            <w:r/>
+            <w:r>
+              <w:rPr>
+                <w:rFonts w:ascii="Aptos" w:hAnsi="Aptos"/>
+                <w:b w:val="0"/>
+                <w:color w:val="1E293B"/>
+                <w:sz w:val="16"/>
+              </w:rPr>
+              <w:t>Infrastructure — DECISION REQUIRED</w:t>
+            </w:r>
+          </w:p>
+        </w:tc>
+      </w:tr>
+      <w:tr>
+        <w:trPr>
+          <w:cantSplit/>
+        </w:trPr>
+        <w:tc>
+          <w:tcPr>
+            <w:tcW w:type="dxa" w:w="2664"/>
+            <w:vAlign w:val="center"/>
+          </w:tcPr>
+          <w:p>
+            <w:pPr>
+              <w:spacing w:after="0"/>
+            </w:pPr>
+            <w:r/>
+            <w:r>
+              <w:rPr>
+                <w:rFonts w:ascii="Aptos" w:hAnsi="Aptos"/>
+                <w:b w:val="0"/>
+                <w:color w:val="1E293B"/>
+                <w:sz w:val="16"/>
+              </w:rPr>
+              <w:t>Durable asynchronous agents and RabbitMQ</w:t>
+            </w:r>
+          </w:p>
+        </w:tc>
+        <w:tc>
+          <w:tcPr>
+            <w:tcW w:type="dxa" w:w="1152"/>
+            <w:vAlign w:val="center"/>
+          </w:tcPr>
+          <w:p>
+            <w:pPr>
+              <w:spacing w:after="0"/>
+            </w:pPr>
+            <w:r/>
+            <w:r>
+              <w:rPr>
+                <w:rFonts w:ascii="Aptos" w:hAnsi="Aptos"/>
+                <w:b w:val="0"/>
+                <w:color w:val="1E293B"/>
+                <w:sz w:val="16"/>
+              </w:rPr>
+              <w:t>Stage 4</w:t>
+            </w:r>
+          </w:p>
+        </w:tc>
+        <w:tc>
+          <w:tcPr>
+            <w:tcW w:type="dxa" w:w="3672"/>
+            <w:vAlign w:val="center"/>
+          </w:tcPr>
+          <w:p>
+            <w:pPr>
+              <w:spacing w:after="0"/>
+            </w:pPr>
+            <w:r/>
+            <w:r>
+              <w:rPr>
+                <w:rFonts w:ascii="Aptos" w:hAnsi="Aptos"/>
+                <w:b w:val="0"/>
+                <w:color w:val="1E293B"/>
+                <w:sz w:val="16"/>
+              </w:rPr>
+              <w:t>Outbox, idempotency, redelivery, checkpoint and approval</w:t>
+            </w:r>
+          </w:p>
+        </w:tc>
+        <w:tc>
+          <w:tcPr>
+            <w:tcW w:type="dxa" w:w="2304"/>
+            <w:vAlign w:val="center"/>
+          </w:tcPr>
+          <w:p>
+            <w:pPr>
+              <w:spacing w:after="0"/>
+            </w:pPr>
+            <w:r/>
+            <w:r>
+              <w:rPr>
+                <w:rFonts w:ascii="Aptos" w:hAnsi="Aptos"/>
+                <w:b w:val="0"/>
+                <w:color w:val="1E293B"/>
+                <w:sz w:val="16"/>
+              </w:rPr>
+              <w:t>Platform / operations — DECISION REQUIRED</w:t>
+            </w:r>
+          </w:p>
+        </w:tc>
+      </w:tr>
+      <w:tr>
+        <w:trPr>
+          <w:cantSplit/>
+        </w:trPr>
+        <w:tc>
+          <w:tcPr>
+            <w:tcW w:type="dxa" w:w="2664"/>
+            <w:shd w:val="clear" w:fill="F1F5F9"/>
+            <w:vAlign w:val="center"/>
+          </w:tcPr>
+          <w:p>
+            <w:pPr>
+              <w:spacing w:after="0"/>
+            </w:pPr>
+            <w:r/>
+            <w:r>
+              <w:rPr>
+                <w:rFonts w:ascii="Aptos" w:hAnsi="Aptos"/>
+                <w:b w:val="0"/>
+                <w:color w:val="1E293B"/>
+                <w:sz w:val="16"/>
+              </w:rPr>
+              <w:t>Mobile task client and notifications</w:t>
+            </w:r>
+          </w:p>
+        </w:tc>
+        <w:tc>
+          <w:tcPr>
+            <w:tcW w:type="dxa" w:w="1152"/>
+            <w:shd w:val="clear" w:fill="F1F5F9"/>
+            <w:vAlign w:val="center"/>
+          </w:tcPr>
+          <w:p>
+            <w:pPr>
+              <w:spacing w:after="0"/>
+            </w:pPr>
+            <w:r/>
+            <w:r>
+              <w:rPr>
+                <w:rFonts w:ascii="Aptos" w:hAnsi="Aptos"/>
+                <w:b w:val="0"/>
+                <w:color w:val="1E293B"/>
+                <w:sz w:val="16"/>
+              </w:rPr>
+              <w:t>Stage 5</w:t>
+            </w:r>
+          </w:p>
+        </w:tc>
+        <w:tc>
+          <w:tcPr>
+            <w:tcW w:type="dxa" w:w="3672"/>
+            <w:shd w:val="clear" w:fill="F1F5F9"/>
+            <w:vAlign w:val="center"/>
+          </w:tcPr>
+          <w:p>
+            <w:pPr>
+              <w:spacing w:after="0"/>
+            </w:pPr>
+            <w:r/>
+            <w:r>
+              <w:rPr>
+                <w:rFonts w:ascii="Aptos" w:hAnsi="Aptos"/>
+                <w:b w:val="0"/>
+                <w:color w:val="1E293B"/>
+                <w:sz w:val="16"/>
+              </w:rPr>
+              <w:t>Reconnect, event-gap replay, scoped approvals and Stop</w:t>
+            </w:r>
+          </w:p>
+        </w:tc>
+        <w:tc>
+          <w:tcPr>
+            <w:tcW w:type="dxa" w:w="2304"/>
+            <w:shd w:val="clear" w:fill="F1F5F9"/>
+            <w:vAlign w:val="center"/>
+          </w:tcPr>
+          <w:p>
+            <w:pPr>
+              <w:spacing w:after="0"/>
+            </w:pPr>
+            <w:r/>
+            <w:r>
+              <w:rPr>
+                <w:rFonts w:ascii="Aptos" w:hAnsi="Aptos"/>
+                <w:b w:val="0"/>
+                <w:color w:val="1E293B"/>
+                <w:sz w:val="16"/>
+              </w:rPr>
+              <w:t>Product / platform — DECISION REQUIRED</w:t>
+            </w:r>
+          </w:p>
+        </w:tc>
+      </w:tr>
+      <w:tr>
+        <w:trPr>
+          <w:cantSplit/>
+        </w:trPr>
+        <w:tc>
+          <w:tcPr>
+            <w:tcW w:type="dxa" w:w="2664"/>
+            <w:vAlign w:val="center"/>
+          </w:tcPr>
+          <w:p>
+            <w:pPr>
+              <w:spacing w:after="0"/>
+            </w:pPr>
+            <w:r/>
+            <w:r>
+              <w:rPr>
+                <w:rFonts w:ascii="Aptos" w:hAnsi="Aptos"/>
+                <w:b w:val="0"/>
+                <w:color w:val="1E293B"/>
+                <w:sz w:val="16"/>
+              </w:rPr>
+              <w:t>Detached preview, advanced sandbox, graph evidence and full DR</w:t>
+            </w:r>
+          </w:p>
+        </w:tc>
+        <w:tc>
+          <w:tcPr>
+            <w:tcW w:type="dxa" w:w="1152"/>
+            <w:vAlign w:val="center"/>
+          </w:tcPr>
+          <w:p>
+            <w:pPr>
+              <w:spacing w:after="0"/>
+            </w:pPr>
+            <w:r/>
+            <w:r>
+              <w:rPr>
+                <w:rFonts w:ascii="Aptos" w:hAnsi="Aptos"/>
+                <w:b w:val="0"/>
+                <w:color w:val="1E293B"/>
+                <w:sz w:val="16"/>
+              </w:rPr>
+              <w:t>Stage 6 / evidence-led</w:t>
+            </w:r>
+          </w:p>
+        </w:tc>
+        <w:tc>
+          <w:tcPr>
+            <w:tcW w:type="dxa" w:w="3672"/>
+            <w:vAlign w:val="center"/>
+          </w:tcPr>
+          <w:p>
+            <w:pPr>
+              <w:spacing w:after="0"/>
+            </w:pPr>
+            <w:r/>
+            <w:r>
+              <w:rPr>
+                <w:rFonts w:ascii="Aptos" w:hAnsi="Aptos"/>
+                <w:b w:val="0"/>
+                <w:color w:val="1E293B"/>
+                <w:sz w:val="16"/>
+              </w:rPr>
+              <w:t>Separate business case, risk and operating-owner approval</w:t>
+            </w:r>
+          </w:p>
+        </w:tc>
+        <w:tc>
+          <w:tcPr>
+            <w:tcW w:type="dxa" w:w="2304"/>
+            <w:vAlign w:val="center"/>
+          </w:tcPr>
+          <w:p>
+            <w:pPr>
+              <w:spacing w:after="0"/>
+            </w:pPr>
+            <w:r/>
+            <w:r>
+              <w:rPr>
+                <w:rFonts w:ascii="Aptos" w:hAnsi="Aptos"/>
+                <w:b w:val="0"/>
+                <w:color w:val="1E293B"/>
+                <w:sz w:val="16"/>
+              </w:rPr>
+              <w:t>Sponsor / security / operations — DECISION REQUIRED</w:t>
+            </w:r>
+          </w:p>
+        </w:tc>
+      </w:tr>
+    </w:tbl>
+    <w:p>
+      <w:pPr>
+        <w:spacing w:after="0"/>
+      </w:pPr>
+    </w:p>
+    <w:p>
+      <w:r>
+        <w:br w:type="page"/>
+      </w:r>
+    </w:p>
+    <w:p>
+      <w:pPr>
+        <w:pStyle w:val="Heading2"/>
+      </w:pPr>
+      <w:r>
+        <w:t>Production questions to close before design freeze</w:t>
+      </w:r>
+    </w:p>
+    <w:tbl>
+      <w:tblPr>
+        <w:tblStyle w:val="TableGrid"/>
+        <w:tblW w:type="auto" w:w="0"/>
+        <w:jc w:val="center"/>
+        <w:tblLook w:firstColumn="1" w:firstRow="1" w:lastColumn="0" w:lastRow="0" w:noHBand="0" w:noVBand="1" w:val="04A0"/>
+      </w:tblPr>
+      <w:tblGrid>
+        <w:gridCol w:w="2541"/>
+        <w:gridCol w:w="2541"/>
+        <w:gridCol w:w="2541"/>
+        <w:gridCol w:w="2541"/>
+      </w:tblGrid>
+      <w:tr>
+        <w:trPr>
+          <w:cantSplit/>
+        </w:trPr>
+        <w:tc>
+          <w:tcPr>
+            <w:tcW w:type="dxa" w:w="1512"/>
+            <w:shd w:val="clear" w:fill="DBEAFE"/>
+            <w:vAlign w:val="center"/>
+          </w:tcPr>
+          <w:p>
+            <w:pPr>
+              <w:spacing w:after="0"/>
+            </w:pPr>
+            <w:r/>
+            <w:r>
+              <w:rPr>
+                <w:rFonts w:ascii="Aptos" w:hAnsi="Aptos"/>
+                <w:b/>
+                <w:color w:val="1E3A8A"/>
+                <w:sz w:val="17"/>
+              </w:rPr>
+              <w:t>Decision area</w:t>
+            </w:r>
+          </w:p>
+        </w:tc>
+        <w:tc>
+          <w:tcPr>
+            <w:tcW w:type="dxa" w:w="3312"/>
+            <w:shd w:val="clear" w:fill="DBEAFE"/>
+            <w:vAlign w:val="center"/>
+          </w:tcPr>
+          <w:p>
+            <w:pPr>
+              <w:spacing w:after="0"/>
+            </w:pPr>
+            <w:r/>
+            <w:r>
+              <w:rPr>
+                <w:rFonts w:ascii="Aptos" w:hAnsi="Aptos"/>
+                <w:b/>
+                <w:color w:val="1E3A8A"/>
+                <w:sz w:val="17"/>
+              </w:rPr>
+              <w:t>Question to raise</w:t>
+            </w:r>
+          </w:p>
+        </w:tc>
+        <w:tc>
+          <w:tcPr>
+            <w:tcW w:type="dxa" w:w="2664"/>
+            <w:shd w:val="clear" w:fill="DBEAFE"/>
+            <w:vAlign w:val="center"/>
+          </w:tcPr>
+          <w:p>
+            <w:pPr>
+              <w:spacing w:after="0"/>
+            </w:pPr>
+            <w:r/>
+            <w:r>
+              <w:rPr>
+                <w:rFonts w:ascii="Aptos" w:hAnsi="Aptos"/>
+                <w:b/>
+                <w:color w:val="1E3A8A"/>
+                <w:sz w:val="17"/>
+              </w:rPr>
+              <w:t>Current hypothesis</w:t>
+            </w:r>
+          </w:p>
+        </w:tc>
+        <w:tc>
+          <w:tcPr>
+            <w:tcW w:type="dxa" w:w="2376"/>
+            <w:shd w:val="clear" w:fill="DBEAFE"/>
+            <w:vAlign w:val="center"/>
+          </w:tcPr>
+          <w:p>
+            <w:pPr>
+              <w:spacing w:after="0"/>
+            </w:pPr>
+            <w:r/>
+            <w:r>
+              <w:rPr>
+                <w:rFonts w:ascii="Aptos" w:hAnsi="Aptos"/>
+                <w:b/>
+                <w:color w:val="1E3A8A"/>
+                <w:sz w:val="17"/>
+              </w:rPr>
+              <w:t>Evidence / approver</w:t>
+            </w:r>
+          </w:p>
+        </w:tc>
+      </w:tr>
+      <w:tr>
+        <w:trPr>
+          <w:cantSplit/>
+        </w:trPr>
+        <w:tc>
+          <w:tcPr>
+            <w:tcW w:type="dxa" w:w="1512"/>
+            <w:vAlign w:val="center"/>
+          </w:tcPr>
+          <w:p>
+            <w:pPr>
+              <w:spacing w:after="0"/>
+            </w:pPr>
+            <w:r/>
+            <w:r>
+              <w:rPr>
+                <w:rFonts w:ascii="Aptos" w:hAnsi="Aptos"/>
+                <w:b w:val="0"/>
+                <w:color w:val="1E293B"/>
+                <w:sz w:val="16"/>
+              </w:rPr>
+              <w:t>Users / concurrency</w:t>
+            </w:r>
+          </w:p>
+        </w:tc>
+        <w:tc>
+          <w:tcPr>
+            <w:tcW w:type="dxa" w:w="3312"/>
+            <w:vAlign w:val="center"/>
+          </w:tcPr>
+          <w:p>
+            <w:pPr>
+              <w:spacing w:after="0"/>
+            </w:pPr>
+            <w:r/>
+            <w:r>
+              <w:rPr>
+                <w:rFonts w:ascii="Aptos" w:hAnsi="Aptos"/>
+                <w:b w:val="0"/>
+                <w:color w:val="1E293B"/>
+                <w:sz w:val="16"/>
+              </w:rPr>
+              <w:t>Registered, daily active and peak concurrent IDE, preview, build and AI-stream users?</w:t>
+            </w:r>
+          </w:p>
+        </w:tc>
+        <w:tc>
+          <w:tcPr>
+            <w:tcW w:type="dxa" w:w="2664"/>
+            <w:vAlign w:val="center"/>
+          </w:tcPr>
+          <w:p>
+            <w:pPr>
+              <w:spacing w:after="0"/>
+            </w:pPr>
+            <w:r/>
+            <w:r>
+              <w:rPr>
+                <w:rFonts w:ascii="Aptos" w:hAnsi="Aptos"/>
+                <w:b w:val="0"/>
+                <w:color w:val="1E293B"/>
+                <w:sz w:val="16"/>
+              </w:rPr>
+              <w:t>30 pre-warmed; 50 target; test 80</w:t>
+            </w:r>
+          </w:p>
+        </w:tc>
+        <w:tc>
+          <w:tcPr>
+            <w:tcW w:type="dxa" w:w="2376"/>
+            <w:vAlign w:val="center"/>
+          </w:tcPr>
+          <w:p>
+            <w:pPr>
+              <w:spacing w:after="0"/>
+            </w:pPr>
+            <w:r/>
+            <w:r>
+              <w:rPr>
+                <w:rFonts w:ascii="Aptos" w:hAnsi="Aptos"/>
+                <w:b w:val="0"/>
+                <w:color w:val="1E293B"/>
+                <w:sz w:val="16"/>
+              </w:rPr>
+              <w:t>Forecast + mixed-load test; sponsor / infrastructure</w:t>
+            </w:r>
+          </w:p>
+        </w:tc>
+      </w:tr>
+      <w:tr>
+        <w:trPr>
+          <w:cantSplit/>
+        </w:trPr>
+        <w:tc>
+          <w:tcPr>
+            <w:tcW w:type="dxa" w:w="1512"/>
+            <w:shd w:val="clear" w:fill="F1F5F9"/>
+            <w:vAlign w:val="center"/>
+          </w:tcPr>
+          <w:p>
+            <w:pPr>
+              <w:spacing w:after="0"/>
+            </w:pPr>
+            <w:r/>
+            <w:r>
+              <w:rPr>
+                <w:rFonts w:ascii="Aptos" w:hAnsi="Aptos"/>
+                <w:b w:val="0"/>
+                <w:color w:val="1E293B"/>
+                <w:sz w:val="16"/>
+              </w:rPr>
+              <w:t>Resource mix</w:t>
+            </w:r>
+          </w:p>
+        </w:tc>
+        <w:tc>
+          <w:tcPr>
+            <w:tcW w:type="dxa" w:w="3312"/>
+            <w:shd w:val="clear" w:fill="F1F5F9"/>
+            <w:vAlign w:val="center"/>
+          </w:tcPr>
+          <w:p>
+            <w:pPr>
+              <w:spacing w:after="0"/>
+            </w:pPr>
+            <w:r/>
+            <w:r>
+              <w:rPr>
+                <w:rFonts w:ascii="Aptos" w:hAnsi="Aptos"/>
+                <w:b w:val="0"/>
+                <w:color w:val="1E293B"/>
+                <w:sz w:val="16"/>
+              </w:rPr>
+              <w:t>Expected Light/Standard/Heavy mix and team override limits?</w:t>
+            </w:r>
+          </w:p>
+        </w:tc>
+        <w:tc>
+          <w:tcPr>
+            <w:tcW w:type="dxa" w:w="2664"/>
+            <w:shd w:val="clear" w:fill="F1F5F9"/>
+            <w:vAlign w:val="center"/>
+          </w:tcPr>
+          <w:p>
+            <w:pPr>
+              <w:spacing w:after="0"/>
+            </w:pPr>
+            <w:r/>
+            <w:r>
+              <w:rPr>
+                <w:rFonts w:ascii="Aptos" w:hAnsi="Aptos"/>
+                <w:b w:val="0"/>
+                <w:color w:val="1E293B"/>
+                <w:sz w:val="16"/>
+              </w:rPr>
+              <w:t>50/40/10%; PVC 10/20/50 GiB</w:t>
+            </w:r>
+          </w:p>
+        </w:tc>
+        <w:tc>
+          <w:tcPr>
+            <w:tcW w:type="dxa" w:w="2376"/>
+            <w:shd w:val="clear" w:fill="F1F5F9"/>
+            <w:vAlign w:val="center"/>
+          </w:tcPr>
+          <w:p>
+            <w:pPr>
+              <w:spacing w:after="0"/>
+            </w:pPr>
+            <w:r/>
+            <w:r>
+              <w:rPr>
+                <w:rFonts w:ascii="Aptos" w:hAnsi="Aptos"/>
+                <w:b w:val="0"/>
+                <w:color w:val="1E293B"/>
+                <w:sz w:val="16"/>
+              </w:rPr>
+              <w:t>Pilot telemetry + noisy-neighbour test; platform</w:t>
+            </w:r>
+          </w:p>
+        </w:tc>
+      </w:tr>
+      <w:tr>
+        <w:trPr>
+          <w:cantSplit/>
+        </w:trPr>
+        <w:tc>
+          <w:tcPr>
+            <w:tcW w:type="dxa" w:w="1512"/>
+            <w:vAlign w:val="center"/>
+          </w:tcPr>
+          <w:p>
+            <w:pPr>
+              <w:spacing w:after="0"/>
+            </w:pPr>
+            <w:r/>
+            <w:r>
+              <w:rPr>
+                <w:rFonts w:ascii="Aptos" w:hAnsi="Aptos"/>
+                <w:b w:val="0"/>
+                <w:color w:val="1E293B"/>
+                <w:sz w:val="16"/>
+              </w:rPr>
+              <w:t>Data residency</w:t>
+            </w:r>
+          </w:p>
+        </w:tc>
+        <w:tc>
+          <w:tcPr>
+            <w:tcW w:type="dxa" w:w="3312"/>
+            <w:vAlign w:val="center"/>
+          </w:tcPr>
+          <w:p>
+            <w:pPr>
+              <w:spacing w:after="0"/>
+            </w:pPr>
+            <w:r/>
+            <w:r>
+              <w:rPr>
+                <w:rFonts w:ascii="Aptos" w:hAnsi="Aptos"/>
+                <w:b w:val="0"/>
+                <w:color w:val="1E293B"/>
+                <w:sz w:val="16"/>
+              </w:rPr>
+              <w:t>Must identity, source, workspace, artifact, backup, logs, traces and prompts all remain in HK?</w:t>
+            </w:r>
+          </w:p>
+        </w:tc>
+        <w:tc>
+          <w:tcPr>
+            <w:tcW w:type="dxa" w:w="2664"/>
+            <w:vAlign w:val="center"/>
+          </w:tcPr>
+          <w:p>
+            <w:pPr>
+              <w:spacing w:after="0"/>
+            </w:pPr>
+            <w:r/>
+            <w:r>
+              <w:rPr>
+                <w:rFonts w:ascii="Aptos" w:hAnsi="Aptos"/>
+                <w:b w:val="0"/>
+                <w:color w:val="1E293B"/>
+                <w:sz w:val="16"/>
+              </w:rPr>
+              <w:t>Platform/DR in HK; AI route policy-gated</w:t>
+            </w:r>
+          </w:p>
+        </w:tc>
+        <w:tc>
+          <w:tcPr>
+            <w:tcW w:type="dxa" w:w="2376"/>
+            <w:vAlign w:val="center"/>
+          </w:tcPr>
+          <w:p>
+            <w:pPr>
+              <w:spacing w:after="0"/>
+            </w:pPr>
+            <w:r/>
+            <w:r>
+              <w:rPr>
+                <w:rFonts w:ascii="Aptos" w:hAnsi="Aptos"/>
+                <w:b w:val="0"/>
+                <w:color w:val="1E293B"/>
+                <w:sz w:val="16"/>
+              </w:rPr>
+              <w:t>Data-flow map + provider terms; data owner / security</w:t>
+            </w:r>
+          </w:p>
+        </w:tc>
+      </w:tr>
+      <w:tr>
+        <w:trPr>
+          <w:cantSplit/>
+        </w:trPr>
+        <w:tc>
+          <w:tcPr>
+            <w:tcW w:type="dxa" w:w="1512"/>
+            <w:shd w:val="clear" w:fill="F1F5F9"/>
+            <w:vAlign w:val="center"/>
+          </w:tcPr>
+          <w:p>
+            <w:pPr>
+              <w:spacing w:after="0"/>
+            </w:pPr>
+            <w:r/>
+            <w:r>
+              <w:rPr>
+                <w:rFonts w:ascii="Aptos" w:hAnsi="Aptos"/>
+                <w:b w:val="0"/>
+                <w:color w:val="1E293B"/>
+                <w:sz w:val="16"/>
+              </w:rPr>
+              <w:t>Data ownership</w:t>
+            </w:r>
+          </w:p>
+        </w:tc>
+        <w:tc>
+          <w:tcPr>
+            <w:tcW w:type="dxa" w:w="3312"/>
+            <w:shd w:val="clear" w:fill="F1F5F9"/>
+            <w:vAlign w:val="center"/>
+          </w:tcPr>
+          <w:p>
+            <w:pPr>
+              <w:spacing w:after="0"/>
+            </w:pPr>
+            <w:r/>
+            <w:r>
+              <w:rPr>
+                <w:rFonts w:ascii="Aptos" w:hAnsi="Aptos"/>
+                <w:b w:val="0"/>
+                <w:color w:val="1E293B"/>
+                <w:sz w:val="16"/>
+              </w:rPr>
+              <w:t>Authoritative system and read/export/delete owner for every data class?</w:t>
+            </w:r>
+          </w:p>
+        </w:tc>
+        <w:tc>
+          <w:tcPr>
+            <w:tcW w:type="dxa" w:w="2664"/>
+            <w:shd w:val="clear" w:fill="F1F5F9"/>
+            <w:vAlign w:val="center"/>
+          </w:tcPr>
+          <w:p>
+            <w:pPr>
+              <w:spacing w:after="0"/>
+            </w:pPr>
+            <w:r/>
+            <w:r>
+              <w:rPr>
+                <w:rFonts w:ascii="Aptos" w:hAnsi="Aptos"/>
+                <w:b w:val="0"/>
+                <w:color w:val="1E293B"/>
+                <w:sz w:val="16"/>
+              </w:rPr>
+              <w:t>PostgreSQL/Git/PVC/object/Redis/Vault split</w:t>
+            </w:r>
+          </w:p>
+        </w:tc>
+        <w:tc>
+          <w:tcPr>
+            <w:tcW w:type="dxa" w:w="2376"/>
+            <w:shd w:val="clear" w:fill="F1F5F9"/>
+            <w:vAlign w:val="center"/>
+          </w:tcPr>
+          <w:p>
+            <w:pPr>
+              <w:spacing w:after="0"/>
+            </w:pPr>
+            <w:r/>
+            <w:r>
+              <w:rPr>
+                <w:rFonts w:ascii="Aptos" w:hAnsi="Aptos"/>
+                <w:b w:val="0"/>
+                <w:color w:val="1E293B"/>
+                <w:sz w:val="16"/>
+              </w:rPr>
+              <w:t>Classification + RACI + access tests; data owner</w:t>
+            </w:r>
+          </w:p>
+        </w:tc>
+      </w:tr>
+      <w:tr>
+        <w:trPr>
+          <w:cantSplit/>
+        </w:trPr>
+        <w:tc>
+          <w:tcPr>
+            <w:tcW w:type="dxa" w:w="1512"/>
+            <w:vAlign w:val="center"/>
+          </w:tcPr>
+          <w:p>
+            <w:pPr>
+              <w:spacing w:after="0"/>
+            </w:pPr>
+            <w:r/>
+            <w:r>
+              <w:rPr>
+                <w:rFonts w:ascii="Aptos" w:hAnsi="Aptos"/>
+                <w:b w:val="0"/>
+                <w:color w:val="1E293B"/>
+                <w:sz w:val="16"/>
+              </w:rPr>
+              <w:t>Retention</w:t>
+            </w:r>
+          </w:p>
+        </w:tc>
+        <w:tc>
+          <w:tcPr>
+            <w:tcW w:type="dxa" w:w="3312"/>
+            <w:vAlign w:val="center"/>
+          </w:tcPr>
+          <w:p>
+            <w:pPr>
+              <w:spacing w:after="0"/>
+            </w:pPr>
+            <w:r/>
+            <w:r>
+              <w:rPr>
+                <w:rFonts w:ascii="Aptos" w:hAnsi="Aptos"/>
+                <w:b w:val="0"/>
+                <w:color w:val="1E293B"/>
+                <w:sz w:val="16"/>
+              </w:rPr>
+              <w:t>Retention for snapshots, previews, artifacts, audit, logs, prompts/traces and handover?</w:t>
+            </w:r>
+          </w:p>
+        </w:tc>
+        <w:tc>
+          <w:tcPr>
+            <w:tcW w:type="dxa" w:w="2664"/>
+            <w:vAlign w:val="center"/>
+          </w:tcPr>
+          <w:p>
+            <w:pPr>
+              <w:spacing w:after="0"/>
+            </w:pPr>
+            <w:r/>
+            <w:r>
+              <w:rPr>
+                <w:rFonts w:ascii="Aptos" w:hAnsi="Aptos"/>
+                <w:b w:val="0"/>
+                <w:color w:val="1E293B"/>
+                <w:sz w:val="16"/>
+              </w:rPr>
+              <w:t>DECISION REQUIRED — never inherit defaults</w:t>
+            </w:r>
+          </w:p>
+        </w:tc>
+        <w:tc>
+          <w:tcPr>
+            <w:tcW w:type="dxa" w:w="2376"/>
+            <w:vAlign w:val="center"/>
+          </w:tcPr>
+          <w:p>
+            <w:pPr>
+              <w:spacing w:after="0"/>
+            </w:pPr>
+            <w:r/>
+            <w:r>
+              <w:rPr>
+                <w:rFonts w:ascii="Aptos" w:hAnsi="Aptos"/>
+                <w:b w:val="0"/>
+                <w:color w:val="1E293B"/>
+                <w:sz w:val="16"/>
+              </w:rPr>
+              <w:t>Legal/privacy schedule + deletion test</w:t>
+            </w:r>
+          </w:p>
+        </w:tc>
+      </w:tr>
+      <w:tr>
+        <w:trPr>
+          <w:cantSplit/>
+        </w:trPr>
+        <w:tc>
+          <w:tcPr>
+            <w:tcW w:type="dxa" w:w="1512"/>
+            <w:shd w:val="clear" w:fill="F1F5F9"/>
+            <w:vAlign w:val="center"/>
+          </w:tcPr>
+          <w:p>
+            <w:pPr>
+              <w:spacing w:after="0"/>
+            </w:pPr>
+            <w:r/>
+            <w:r>
+              <w:rPr>
+                <w:rFonts w:ascii="Aptos" w:hAnsi="Aptos"/>
+                <w:b w:val="0"/>
+                <w:color w:val="1E293B"/>
+                <w:sz w:val="16"/>
+              </w:rPr>
+              <w:t>Backup period</w:t>
+            </w:r>
+          </w:p>
+        </w:tc>
+        <w:tc>
+          <w:tcPr>
+            <w:tcW w:type="dxa" w:w="3312"/>
+            <w:shd w:val="clear" w:fill="F1F5F9"/>
+            <w:vAlign w:val="center"/>
+          </w:tcPr>
+          <w:p>
+            <w:pPr>
+              <w:spacing w:after="0"/>
+            </w:pPr>
+            <w:r/>
+            <w:r>
+              <w:rPr>
+                <w:rFonts w:ascii="Aptos" w:hAnsi="Aptos"/>
+                <w:b w:val="0"/>
+                <w:color w:val="1E293B"/>
+                <w:sz w:val="16"/>
+              </w:rPr>
+              <w:t>Frequency, immutability and DR copy for DB, Git, PVC, object, registry and Vault?</w:t>
+            </w:r>
+          </w:p>
+        </w:tc>
+        <w:tc>
+          <w:tcPr>
+            <w:tcW w:type="dxa" w:w="2664"/>
+            <w:shd w:val="clear" w:fill="F1F5F9"/>
+            <w:vAlign w:val="center"/>
+          </w:tcPr>
+          <w:p>
+            <w:pPr>
+              <w:spacing w:after="0"/>
+            </w:pPr>
+            <w:r/>
+            <w:r>
+              <w:rPr>
+                <w:rFonts w:ascii="Aptos" w:hAnsi="Aptos"/>
+                <w:b w:val="0"/>
+                <w:color w:val="1E293B"/>
+                <w:sz w:val="16"/>
+              </w:rPr>
+              <w:t>PITR + scheduled snapshots + replication</w:t>
+            </w:r>
+          </w:p>
+        </w:tc>
+        <w:tc>
+          <w:tcPr>
+            <w:tcW w:type="dxa" w:w="2376"/>
+            <w:shd w:val="clear" w:fill="F1F5F9"/>
+            <w:vAlign w:val="center"/>
+          </w:tcPr>
+          <w:p>
+            <w:pPr>
+              <w:spacing w:after="0"/>
+            </w:pPr>
+            <w:r/>
+            <w:r>
+              <w:rPr>
+                <w:rFonts w:ascii="Aptos" w:hAnsi="Aptos"/>
+                <w:b w:val="0"/>
+                <w:color w:val="1E293B"/>
+                <w:sz w:val="16"/>
+              </w:rPr>
+              <w:t>Backup matrix + restore drill; operations / data owner</w:t>
+            </w:r>
+          </w:p>
+        </w:tc>
+      </w:tr>
+      <w:tr>
+        <w:trPr>
+          <w:cantSplit/>
+        </w:trPr>
+        <w:tc>
+          <w:tcPr>
+            <w:tcW w:type="dxa" w:w="1512"/>
+            <w:vAlign w:val="center"/>
+          </w:tcPr>
+          <w:p>
+            <w:pPr>
+              <w:spacing w:after="0"/>
+            </w:pPr>
+            <w:r/>
+            <w:r>
+              <w:rPr>
+                <w:rFonts w:ascii="Aptos" w:hAnsi="Aptos"/>
+                <w:b w:val="0"/>
+                <w:color w:val="1E293B"/>
+                <w:sz w:val="16"/>
+              </w:rPr>
+              <w:t>RPO / RTO</w:t>
+            </w:r>
+          </w:p>
+        </w:tc>
+        <w:tc>
+          <w:tcPr>
+            <w:tcW w:type="dxa" w:w="3312"/>
+            <w:vAlign w:val="center"/>
+          </w:tcPr>
+          <w:p>
+            <w:pPr>
+              <w:spacing w:after="0"/>
+            </w:pPr>
+            <w:r/>
+            <w:r>
+              <w:rPr>
+                <w:rFonts w:ascii="Aptos" w:hAnsi="Aptos"/>
+                <w:b w:val="0"/>
+                <w:color w:val="1E293B"/>
+                <w:sz w:val="16"/>
+              </w:rPr>
+              <w:t>Approved objectives for control, source, workspace, jobs and regional failure?</w:t>
+            </w:r>
+          </w:p>
+        </w:tc>
+        <w:tc>
+          <w:tcPr>
+            <w:tcW w:type="dxa" w:w="2664"/>
+            <w:vAlign w:val="center"/>
+          </w:tcPr>
+          <w:p>
+            <w:pPr>
+              <w:spacing w:after="0"/>
+            </w:pPr>
+            <w:r/>
+            <w:r>
+              <w:rPr>
+                <w:rFonts w:ascii="Aptos" w:hAnsi="Aptos"/>
+                <w:b w:val="0"/>
+                <w:color w:val="1E293B"/>
+                <w:sz w:val="16"/>
+              </w:rPr>
+              <w:t>Regional RTO ≤2 h / RPO ≤15 min hypothesis</w:t>
+            </w:r>
+          </w:p>
+        </w:tc>
+        <w:tc>
+          <w:tcPr>
+            <w:tcW w:type="dxa" w:w="2376"/>
+            <w:vAlign w:val="center"/>
+          </w:tcPr>
+          <w:p>
+            <w:pPr>
+              <w:spacing w:after="0"/>
+            </w:pPr>
+            <w:r/>
+            <w:r>
+              <w:rPr>
+                <w:rFonts w:ascii="Aptos" w:hAnsi="Aptos"/>
+                <w:b w:val="0"/>
+                <w:color w:val="1E293B"/>
+                <w:sz w:val="16"/>
+              </w:rPr>
+              <w:t>Impact assessment + timed DR drill; business / operations</w:t>
+            </w:r>
+          </w:p>
+        </w:tc>
+      </w:tr>
+      <w:tr>
+        <w:trPr>
+          <w:cantSplit/>
+        </w:trPr>
+        <w:tc>
+          <w:tcPr>
+            <w:tcW w:type="dxa" w:w="1512"/>
+            <w:shd w:val="clear" w:fill="F1F5F9"/>
+            <w:vAlign w:val="center"/>
+          </w:tcPr>
+          <w:p>
+            <w:pPr>
+              <w:spacing w:after="0"/>
+            </w:pPr>
+            <w:r/>
+            <w:r>
+              <w:rPr>
+                <w:rFonts w:ascii="Aptos" w:hAnsi="Aptos"/>
+                <w:b w:val="0"/>
+                <w:color w:val="1E293B"/>
+                <w:sz w:val="16"/>
+              </w:rPr>
+              <w:t>Office bandwidth</w:t>
+            </w:r>
+          </w:p>
+        </w:tc>
+        <w:tc>
+          <w:tcPr>
+            <w:tcW w:type="dxa" w:w="3312"/>
+            <w:shd w:val="clear" w:fill="F1F5F9"/>
+            <w:vAlign w:val="center"/>
+          </w:tcPr>
+          <w:p>
+            <w:pPr>
+              <w:spacing w:after="0"/>
+            </w:pPr>
+            <w:r/>
+            <w:r>
+              <w:rPr>
+                <w:rFonts w:ascii="Aptos" w:hAnsi="Aptos"/>
+                <w:b w:val="0"/>
+                <w:color w:val="1E293B"/>
+                <w:sz w:val="16"/>
+              </w:rPr>
+              <w:t>Concurrent developers and committed primary/secondary bandwidth per site?</w:t>
+            </w:r>
+          </w:p>
+        </w:tc>
+        <w:tc>
+          <w:tcPr>
+            <w:tcW w:type="dxa" w:w="2664"/>
+            <w:shd w:val="clear" w:fill="F1F5F9"/>
+            <w:vAlign w:val="center"/>
+          </w:tcPr>
+          <w:p>
+            <w:pPr>
+              <w:spacing w:after="0"/>
+            </w:pPr>
+            <w:r/>
+            <w:r>
+              <w:rPr>
+                <w:rFonts w:ascii="Aptos" w:hAnsi="Aptos"/>
+                <w:b w:val="0"/>
+                <w:color w:val="1E293B"/>
+                <w:sz w:val="16"/>
+              </w:rPr>
+              <w:t>5 Mbps/user × 1.3; local HK breakout</w:t>
+            </w:r>
+          </w:p>
+        </w:tc>
+        <w:tc>
+          <w:tcPr>
+            <w:tcW w:type="dxa" w:w="2376"/>
+            <w:shd w:val="clear" w:fill="F1F5F9"/>
+            <w:vAlign w:val="center"/>
+          </w:tcPr>
+          <w:p>
+            <w:pPr>
+              <w:spacing w:after="0"/>
+            </w:pPr>
+            <w:r/>
+            <w:r>
+              <w:rPr>
+                <w:rFonts w:ascii="Aptos" w:hAnsi="Aptos"/>
+                <w:b w:val="0"/>
+                <w:color w:val="1E293B"/>
+                <w:sz w:val="16"/>
+              </w:rPr>
+              <w:t>Site inventory + latency/loss/failover test; network</w:t>
+            </w:r>
+          </w:p>
+        </w:tc>
+      </w:tr>
+      <w:tr>
+        <w:trPr>
+          <w:cantSplit/>
+        </w:trPr>
+        <w:tc>
+          <w:tcPr>
+            <w:tcW w:type="dxa" w:w="1512"/>
+            <w:vAlign w:val="center"/>
+          </w:tcPr>
+          <w:p>
+            <w:pPr>
+              <w:spacing w:after="0"/>
+            </w:pPr>
+            <w:r/>
+            <w:r>
+              <w:rPr>
+                <w:rFonts w:ascii="Aptos" w:hAnsi="Aptos"/>
+                <w:b w:val="0"/>
+                <w:color w:val="1E293B"/>
+                <w:sz w:val="16"/>
+              </w:rPr>
+              <w:t>Cluster bandwidth</w:t>
+            </w:r>
+          </w:p>
+        </w:tc>
+        <w:tc>
+          <w:tcPr>
+            <w:tcW w:type="dxa" w:w="3312"/>
+            <w:vAlign w:val="center"/>
+          </w:tcPr>
+          <w:p>
+            <w:pPr>
+              <w:spacing w:after="0"/>
+            </w:pPr>
+            <w:r/>
+            <w:r>
+              <w:rPr>
+                <w:rFonts w:ascii="Aptos" w:hAnsi="Aptos"/>
+                <w:b w:val="0"/>
+                <w:color w:val="1E293B"/>
+                <w:sz w:val="16"/>
+              </w:rPr>
+              <w:t>Peak IDE/preview, image pull, build/artifact and east-west throughput?</w:t>
+            </w:r>
+          </w:p>
+        </w:tc>
+        <w:tc>
+          <w:tcPr>
+            <w:tcW w:type="dxa" w:w="2664"/>
+            <w:vAlign w:val="center"/>
+          </w:tcPr>
+          <w:p>
+            <w:pPr>
+              <w:spacing w:after="0"/>
+            </w:pPr>
+            <w:r/>
+            <w:r>
+              <w:rPr>
+                <w:rFonts w:ascii="Aptos" w:hAnsi="Aptos"/>
+                <w:b w:val="0"/>
+                <w:color w:val="1E293B"/>
+                <w:sz w:val="16"/>
+              </w:rPr>
+              <w:t>≥1 Gbps node/registry/cache path test start</w:t>
+            </w:r>
+          </w:p>
+        </w:tc>
+        <w:tc>
+          <w:tcPr>
+            <w:tcW w:type="dxa" w:w="2376"/>
+            <w:vAlign w:val="center"/>
+          </w:tcPr>
+          <w:p>
+            <w:pPr>
+              <w:spacing w:after="0"/>
+            </w:pPr>
+            <w:r/>
+            <w:r>
+              <w:rPr>
+                <w:rFonts w:ascii="Aptos" w:hAnsi="Aptos"/>
+                <w:b w:val="0"/>
+                <w:color w:val="1E293B"/>
+                <w:sz w:val="16"/>
+              </w:rPr>
+              <w:t>WAF/LB/NAT/registry/PVC test; infrastructure</w:t>
+            </w:r>
+          </w:p>
+        </w:tc>
+      </w:tr>
+    </w:tbl>
+    <w:p>
+      <w:pPr>
+        <w:spacing w:after="0"/>
+      </w:pPr>
+    </w:p>
+    <w:p>
+      <w:r>
+        <w:br w:type="page"/>
+      </w:r>
+    </w:p>
+    <w:tbl>
+      <w:tblPr>
+        <w:tblStyle w:val="TableGrid"/>
+        <w:tblW w:type="auto" w:w="0"/>
+        <w:jc w:val="center"/>
+        <w:tblLook w:firstColumn="1" w:firstRow="1" w:lastColumn="0" w:lastRow="0" w:noHBand="0" w:noVBand="1" w:val="04A0"/>
+      </w:tblPr>
+      <w:tblGrid>
+        <w:gridCol w:w="2541"/>
+        <w:gridCol w:w="2541"/>
+        <w:gridCol w:w="2541"/>
+        <w:gridCol w:w="2541"/>
+      </w:tblGrid>
+      <w:tr>
+        <w:trPr>
+          <w:cantSplit/>
+        </w:trPr>
+        <w:tc>
+          <w:tcPr>
+            <w:tcW w:type="dxa" w:w="1512"/>
+            <w:shd w:val="clear" w:fill="DBEAFE"/>
+            <w:vAlign w:val="center"/>
+          </w:tcPr>
+          <w:p>
+            <w:pPr>
+              <w:spacing w:after="0"/>
+            </w:pPr>
+            <w:r/>
+            <w:r>
+              <w:rPr>
+                <w:rFonts w:ascii="Aptos" w:hAnsi="Aptos"/>
+                <w:b/>
+                <w:color w:val="1E3A8A"/>
+                <w:sz w:val="17"/>
+              </w:rPr>
+              <w:t>Decision area</w:t>
+            </w:r>
+          </w:p>
+        </w:tc>
+        <w:tc>
+          <w:tcPr>
+            <w:tcW w:type="dxa" w:w="3312"/>
+            <w:shd w:val="clear" w:fill="DBEAFE"/>
+            <w:vAlign w:val="center"/>
+          </w:tcPr>
+          <w:p>
+            <w:pPr>
+              <w:spacing w:after="0"/>
+            </w:pPr>
+            <w:r/>
+            <w:r>
+              <w:rPr>
+                <w:rFonts w:ascii="Aptos" w:hAnsi="Aptos"/>
+                <w:b/>
+                <w:color w:val="1E3A8A"/>
+                <w:sz w:val="17"/>
+              </w:rPr>
+              <w:t>Question to raise</w:t>
+            </w:r>
+          </w:p>
+        </w:tc>
+        <w:tc>
+          <w:tcPr>
+            <w:tcW w:type="dxa" w:w="2664"/>
+            <w:shd w:val="clear" w:fill="DBEAFE"/>
+            <w:vAlign w:val="center"/>
+          </w:tcPr>
+          <w:p>
+            <w:pPr>
+              <w:spacing w:after="0"/>
+            </w:pPr>
+            <w:r/>
+            <w:r>
+              <w:rPr>
+                <w:rFonts w:ascii="Aptos" w:hAnsi="Aptos"/>
+                <w:b/>
+                <w:color w:val="1E3A8A"/>
+                <w:sz w:val="17"/>
+              </w:rPr>
+              <w:t>Current hypothesis</w:t>
+            </w:r>
+          </w:p>
+        </w:tc>
+        <w:tc>
+          <w:tcPr>
+            <w:tcW w:type="dxa" w:w="2376"/>
+            <w:shd w:val="clear" w:fill="DBEAFE"/>
+            <w:vAlign w:val="center"/>
+          </w:tcPr>
+          <w:p>
+            <w:pPr>
+              <w:spacing w:after="0"/>
+            </w:pPr>
+            <w:r/>
+            <w:r>
+              <w:rPr>
+                <w:rFonts w:ascii="Aptos" w:hAnsi="Aptos"/>
+                <w:b/>
+                <w:color w:val="1E3A8A"/>
+                <w:sz w:val="17"/>
+              </w:rPr>
+              <w:t>Evidence / approver</w:t>
+            </w:r>
+          </w:p>
+        </w:tc>
+      </w:tr>
+      <w:tr>
+        <w:trPr>
+          <w:cantSplit/>
+        </w:trPr>
+        <w:tc>
+          <w:tcPr>
+            <w:tcW w:type="dxa" w:w="1512"/>
+            <w:vAlign w:val="center"/>
+          </w:tcPr>
+          <w:p>
+            <w:pPr>
+              <w:spacing w:after="0"/>
+            </w:pPr>
+            <w:r/>
+            <w:r>
+              <w:rPr>
+                <w:rFonts w:ascii="Aptos" w:hAnsi="Aptos"/>
+                <w:b w:val="0"/>
+                <w:color w:val="1E293B"/>
+                <w:sz w:val="16"/>
+              </w:rPr>
+              <w:t>Spike control</w:t>
+            </w:r>
+          </w:p>
+        </w:tc>
+        <w:tc>
+          <w:tcPr>
+            <w:tcW w:type="dxa" w:w="3312"/>
+            <w:vAlign w:val="center"/>
+          </w:tcPr>
+          <w:p>
+            <w:pPr>
+              <w:spacing w:after="0"/>
+            </w:pPr>
+            <w:r/>
+            <w:r>
+              <w:rPr>
+                <w:rFonts w:ascii="Aptos" w:hAnsi="Aptos"/>
+                <w:b w:val="0"/>
+                <w:color w:val="1E293B"/>
+                <w:sz w:val="16"/>
+              </w:rPr>
+              <w:t>What is admitted, queued, throttled or deprioritized when compute, storage, quota or bandwidth is exhausted?</w:t>
+            </w:r>
+          </w:p>
+        </w:tc>
+        <w:tc>
+          <w:tcPr>
+            <w:tcW w:type="dxa" w:w="2664"/>
+            <w:vAlign w:val="center"/>
+          </w:tcPr>
+          <w:p>
+            <w:pPr>
+              <w:spacing w:after="0"/>
+            </w:pPr>
+            <w:r/>
+            <w:r>
+              <w:rPr>
+                <w:rFonts w:ascii="Aptos" w:hAnsi="Aptos"/>
+                <w:b w:val="0"/>
+                <w:color w:val="1E293B"/>
+                <w:sz w:val="16"/>
+              </w:rPr>
+              <w:t>Preserve login/running IDEs; queue starts; lower background priority</w:t>
+            </w:r>
+          </w:p>
+        </w:tc>
+        <w:tc>
+          <w:tcPr>
+            <w:tcW w:type="dxa" w:w="2376"/>
+            <w:vAlign w:val="center"/>
+          </w:tcPr>
+          <w:p>
+            <w:pPr>
+              <w:spacing w:after="0"/>
+            </w:pPr>
+            <w:r/>
+            <w:r>
+              <w:rPr>
+                <w:rFonts w:ascii="Aptos" w:hAnsi="Aptos"/>
+                <w:b w:val="0"/>
+                <w:color w:val="1E293B"/>
+                <w:sz w:val="16"/>
+              </w:rPr>
+              <w:t>Morning-storm + exhaustion tests; platform / operations</w:t>
+            </w:r>
+          </w:p>
+        </w:tc>
+      </w:tr>
+      <w:tr>
+        <w:trPr>
+          <w:cantSplit/>
+        </w:trPr>
+        <w:tc>
+          <w:tcPr>
+            <w:tcW w:type="dxa" w:w="1512"/>
+            <w:shd w:val="clear" w:fill="F1F5F9"/>
+            <w:vAlign w:val="center"/>
+          </w:tcPr>
+          <w:p>
+            <w:pPr>
+              <w:spacing w:after="0"/>
+            </w:pPr>
+            <w:r/>
+            <w:r>
+              <w:rPr>
+                <w:rFonts w:ascii="Aptos" w:hAnsi="Aptos"/>
+                <w:b w:val="0"/>
+                <w:color w:val="1E293B"/>
+                <w:sz w:val="16"/>
+              </w:rPr>
+              <w:t>Autoscaling / spend</w:t>
+            </w:r>
+          </w:p>
+        </w:tc>
+        <w:tc>
+          <w:tcPr>
+            <w:tcW w:type="dxa" w:w="3312"/>
+            <w:shd w:val="clear" w:fill="F1F5F9"/>
+            <w:vAlign w:val="center"/>
+          </w:tcPr>
+          <w:p>
+            <w:pPr>
+              <w:spacing w:after="0"/>
+            </w:pPr>
+            <w:r/>
+            <w:r>
+              <w:rPr>
+                <w:rFonts w:ascii="Aptos" w:hAnsi="Aptos"/>
+                <w:b w:val="0"/>
+                <w:color w:val="1E293B"/>
+                <w:sz w:val="16"/>
+              </w:rPr>
+              <w:t>Approved min/pre-warm/max nodes, warm slots, provider quota and hard cost cap?</w:t>
+            </w:r>
+          </w:p>
+        </w:tc>
+        <w:tc>
+          <w:tcPr>
+            <w:tcW w:type="dxa" w:w="2664"/>
+            <w:shd w:val="clear" w:fill="F1F5F9"/>
+            <w:vAlign w:val="center"/>
+          </w:tcPr>
+          <w:p>
+            <w:pPr>
+              <w:spacing w:after="0"/>
+            </w:pPr>
+            <w:r/>
+            <w:r>
+              <w:rPr>
+                <w:rFonts w:ascii="Aptos" w:hAnsi="Aptos"/>
+                <w:b w:val="0"/>
+                <w:color w:val="1E293B"/>
+                <w:sz w:val="16"/>
+              </w:rPr>
+              <w:t>Pre-warm 30; scale 50; test 80; 10–20% warm slots</w:t>
+            </w:r>
+          </w:p>
+        </w:tc>
+        <w:tc>
+          <w:tcPr>
+            <w:tcW w:type="dxa" w:w="2376"/>
+            <w:shd w:val="clear" w:fill="F1F5F9"/>
+            <w:vAlign w:val="center"/>
+          </w:tcPr>
+          <w:p>
+            <w:pPr>
+              <w:spacing w:after="0"/>
+            </w:pPr>
+            <w:r/>
+            <w:r>
+              <w:rPr>
+                <w:rFonts w:ascii="Aptos" w:hAnsi="Aptos"/>
+                <w:b w:val="0"/>
+                <w:color w:val="1E293B"/>
+                <w:sz w:val="16"/>
+              </w:rPr>
+              <w:t>Node timing + quota + cost cap; FinOps / infrastructure</w:t>
+            </w:r>
+          </w:p>
+        </w:tc>
+      </w:tr>
+      <w:tr>
+        <w:trPr>
+          <w:cantSplit/>
+        </w:trPr>
+        <w:tc>
+          <w:tcPr>
+            <w:tcW w:type="dxa" w:w="1512"/>
+            <w:vAlign w:val="center"/>
+          </w:tcPr>
+          <w:p>
+            <w:pPr>
+              <w:spacing w:after="0"/>
+            </w:pPr>
+            <w:r/>
+            <w:r>
+              <w:rPr>
+                <w:rFonts w:ascii="Aptos" w:hAnsi="Aptos"/>
+                <w:b w:val="0"/>
+                <w:color w:val="1E293B"/>
+                <w:sz w:val="16"/>
+              </w:rPr>
+              <w:t>Availability</w:t>
+            </w:r>
+          </w:p>
+        </w:tc>
+        <w:tc>
+          <w:tcPr>
+            <w:tcW w:type="dxa" w:w="3312"/>
+            <w:vAlign w:val="center"/>
+          </w:tcPr>
+          <w:p>
+            <w:pPr>
+              <w:spacing w:after="0"/>
+            </w:pPr>
+            <w:r/>
+            <w:r>
+              <w:rPr>
+                <w:rFonts w:ascii="Aptos" w:hAnsi="Aptos"/>
+                <w:b w:val="0"/>
+                <w:color w:val="1E293B"/>
+                <w:sz w:val="16"/>
+              </w:rPr>
+              <w:t>Funded SLO for portal/API, IDE routing, workspace start and AI gateway?</w:t>
+            </w:r>
+          </w:p>
+        </w:tc>
+        <w:tc>
+          <w:tcPr>
+            <w:tcW w:type="dxa" w:w="2664"/>
+            <w:vAlign w:val="center"/>
+          </w:tcPr>
+          <w:p>
+            <w:pPr>
+              <w:spacing w:after="0"/>
+            </w:pPr>
+            <w:r/>
+            <w:r>
+              <w:rPr>
+                <w:rFonts w:ascii="Aptos" w:hAnsi="Aptos"/>
+                <w:b w:val="0"/>
+                <w:color w:val="1E293B"/>
+                <w:sz w:val="16"/>
+              </w:rPr>
+              <w:t>99.9% first; 99.95% after failover evidence</w:t>
+            </w:r>
+          </w:p>
+        </w:tc>
+        <w:tc>
+          <w:tcPr>
+            <w:tcW w:type="dxa" w:w="2376"/>
+            <w:vAlign w:val="center"/>
+          </w:tcPr>
+          <w:p>
+            <w:pPr>
+              <w:spacing w:after="0"/>
+            </w:pPr>
+            <w:r/>
+            <w:r>
+              <w:rPr>
+                <w:rFonts w:ascii="Aptos" w:hAnsi="Aptos"/>
+                <w:b w:val="0"/>
+                <w:color w:val="1E293B"/>
+                <w:sz w:val="16"/>
+              </w:rPr>
+              <w:t>Error budget + on-call commitment; sponsor / operations</w:t>
+            </w:r>
+          </w:p>
+        </w:tc>
+      </w:tr>
+      <w:tr>
+        <w:trPr>
+          <w:cantSplit/>
+        </w:trPr>
+        <w:tc>
+          <w:tcPr>
+            <w:tcW w:type="dxa" w:w="1512"/>
+            <w:shd w:val="clear" w:fill="F1F5F9"/>
+            <w:vAlign w:val="center"/>
+          </w:tcPr>
+          <w:p>
+            <w:pPr>
+              <w:spacing w:after="0"/>
+            </w:pPr>
+            <w:r/>
+            <w:r>
+              <w:rPr>
+                <w:rFonts w:ascii="Aptos" w:hAnsi="Aptos"/>
+                <w:b w:val="0"/>
+                <w:color w:val="1E293B"/>
+                <w:sz w:val="16"/>
+              </w:rPr>
+              <w:t>Security boundary</w:t>
+            </w:r>
+          </w:p>
+        </w:tc>
+        <w:tc>
+          <w:tcPr>
+            <w:tcW w:type="dxa" w:w="3312"/>
+            <w:shd w:val="clear" w:fill="F1F5F9"/>
+            <w:vAlign w:val="center"/>
+          </w:tcPr>
+          <w:p>
+            <w:pPr>
+              <w:spacing w:after="0"/>
+            </w:pPr>
+            <w:r/>
+            <w:r>
+              <w:rPr>
+                <w:rFonts w:ascii="Aptos" w:hAnsi="Aptos"/>
+                <w:b w:val="0"/>
+                <w:color w:val="1E293B"/>
+                <w:sz w:val="16"/>
+              </w:rPr>
+              <w:t>Default egress, packages, model aliases and raw ports; which exceptions need approval?</w:t>
+            </w:r>
+          </w:p>
+        </w:tc>
+        <w:tc>
+          <w:tcPr>
+            <w:tcW w:type="dxa" w:w="2664"/>
+            <w:shd w:val="clear" w:fill="F1F5F9"/>
+            <w:vAlign w:val="center"/>
+          </w:tcPr>
+          <w:p>
+            <w:pPr>
+              <w:spacing w:after="0"/>
+            </w:pPr>
+            <w:r/>
+            <w:r>
+              <w:rPr>
+                <w:rFonts w:ascii="Aptos" w:hAnsi="Aptos"/>
+                <w:b w:val="0"/>
+                <w:color w:val="1E293B"/>
+                <w:sz w:val="16"/>
+              </w:rPr>
+              <w:t>Audited Internet egress; block metadata/private networks</w:t>
+            </w:r>
+          </w:p>
+        </w:tc>
+        <w:tc>
+          <w:tcPr>
+            <w:tcW w:type="dxa" w:w="2376"/>
+            <w:shd w:val="clear" w:fill="F1F5F9"/>
+            <w:vAlign w:val="center"/>
+          </w:tcPr>
+          <w:p>
+            <w:pPr>
+              <w:spacing w:after="0"/>
+            </w:pPr>
+            <w:r/>
+            <w:r>
+              <w:rPr>
+                <w:rFonts w:ascii="Aptos" w:hAnsi="Aptos"/>
+                <w:b w:val="0"/>
+                <w:color w:val="1E293B"/>
+                <w:sz w:val="16"/>
+              </w:rPr>
+              <w:t>Threat model + NetworkPolicy test + exception flow</w:t>
+            </w:r>
+          </w:p>
+        </w:tc>
+      </w:tr>
+      <w:tr>
+        <w:trPr>
+          <w:cantSplit/>
+        </w:trPr>
+        <w:tc>
+          <w:tcPr>
+            <w:tcW w:type="dxa" w:w="1512"/>
+            <w:vAlign w:val="center"/>
+          </w:tcPr>
+          <w:p>
+            <w:pPr>
+              <w:spacing w:after="0"/>
+            </w:pPr>
+            <w:r/>
+            <w:r>
+              <w:rPr>
+                <w:rFonts w:ascii="Aptos" w:hAnsi="Aptos"/>
+                <w:b w:val="0"/>
+                <w:color w:val="1E293B"/>
+                <w:sz w:val="16"/>
+              </w:rPr>
+              <w:t>Identity / revoke</w:t>
+            </w:r>
+          </w:p>
+        </w:tc>
+        <w:tc>
+          <w:tcPr>
+            <w:tcW w:type="dxa" w:w="3312"/>
+            <w:vAlign w:val="center"/>
+          </w:tcPr>
+          <w:p>
+            <w:pPr>
+              <w:spacing w:after="0"/>
+            </w:pPr>
+            <w:r/>
+            <w:r>
+              <w:rPr>
+                <w:rFonts w:ascii="Aptos" w:hAnsi="Aptos"/>
+                <w:b w:val="0"/>
+                <w:color w:val="1E293B"/>
+                <w:sz w:val="16"/>
+              </w:rPr>
+              <w:t>IdP, role mapping, session lifetime and revoke target?</w:t>
+            </w:r>
+          </w:p>
+        </w:tc>
+        <w:tc>
+          <w:tcPr>
+            <w:tcW w:type="dxa" w:w="2664"/>
+            <w:vAlign w:val="center"/>
+          </w:tcPr>
+          <w:p>
+            <w:pPr>
+              <w:spacing w:after="0"/>
+            </w:pPr>
+            <w:r/>
+            <w:r>
+              <w:rPr>
+                <w:rFonts w:ascii="Aptos" w:hAnsi="Aptos"/>
+                <w:b w:val="0"/>
+                <w:color w:val="1E293B"/>
+                <w:sz w:val="16"/>
+              </w:rPr>
+              <w:t>Company SSO; disable effects within 60 seconds</w:t>
+            </w:r>
+          </w:p>
+        </w:tc>
+        <w:tc>
+          <w:tcPr>
+            <w:tcW w:type="dxa" w:w="2376"/>
+            <w:vAlign w:val="center"/>
+          </w:tcPr>
+          <w:p>
+            <w:pPr>
+              <w:spacing w:after="0"/>
+            </w:pPr>
+            <w:r/>
+            <w:r>
+              <w:rPr>
+                <w:rFonts w:ascii="Aptos" w:hAnsi="Aptos"/>
+                <w:b w:val="0"/>
+                <w:color w:val="1E293B"/>
+                <w:sz w:val="16"/>
+              </w:rPr>
+              <w:t>IdP/revoke E2E; identity owner</w:t>
+            </w:r>
+          </w:p>
+        </w:tc>
+      </w:tr>
+      <w:tr>
+        <w:trPr>
+          <w:cantSplit/>
+        </w:trPr>
+        <w:tc>
+          <w:tcPr>
+            <w:tcW w:type="dxa" w:w="1512"/>
+            <w:shd w:val="clear" w:fill="F1F5F9"/>
+            <w:vAlign w:val="center"/>
+          </w:tcPr>
+          <w:p>
+            <w:pPr>
+              <w:spacing w:after="0"/>
+            </w:pPr>
+            <w:r/>
+            <w:r>
+              <w:rPr>
+                <w:rFonts w:ascii="Aptos" w:hAnsi="Aptos"/>
+                <w:b w:val="0"/>
+                <w:color w:val="1E293B"/>
+                <w:sz w:val="16"/>
+              </w:rPr>
+              <w:t>AI privacy / cost</w:t>
+            </w:r>
+          </w:p>
+        </w:tc>
+        <w:tc>
+          <w:tcPr>
+            <w:tcW w:type="dxa" w:w="3312"/>
+            <w:shd w:val="clear" w:fill="F1F5F9"/>
+            <w:vAlign w:val="center"/>
+          </w:tcPr>
+          <w:p>
+            <w:pPr>
+              <w:spacing w:after="0"/>
+            </w:pPr>
+            <w:r/>
+            <w:r>
+              <w:rPr>
+                <w:rFonts w:ascii="Aptos" w:hAnsi="Aptos"/>
+                <w:b w:val="0"/>
+                <w:color w:val="1E293B"/>
+                <w:sz w:val="16"/>
+              </w:rPr>
+              <w:t>May prompts/code leave HK, be retained/trained on; what budgets and rate limits?</w:t>
+            </w:r>
+          </w:p>
+        </w:tc>
+        <w:tc>
+          <w:tcPr>
+            <w:tcW w:type="dxa" w:w="2664"/>
+            <w:shd w:val="clear" w:fill="F1F5F9"/>
+            <w:vAlign w:val="center"/>
+          </w:tcPr>
+          <w:p>
+            <w:pPr>
+              <w:spacing w:after="0"/>
+            </w:pPr>
+            <w:r/>
+            <w:r>
+              <w:rPr>
+                <w:rFonts w:ascii="Aptos" w:hAnsi="Aptos"/>
+                <w:b w:val="0"/>
+                <w:color w:val="1E293B"/>
+                <w:sz w:val="16"/>
+              </w:rPr>
+              <w:t>Metadata-only trace; provider route policy-gated</w:t>
+            </w:r>
+          </w:p>
+        </w:tc>
+        <w:tc>
+          <w:tcPr>
+            <w:tcW w:type="dxa" w:w="2376"/>
+            <w:shd w:val="clear" w:fill="F1F5F9"/>
+            <w:vAlign w:val="center"/>
+          </w:tcPr>
+          <w:p>
+            <w:pPr>
+              <w:spacing w:after="0"/>
+            </w:pPr>
+            <w:r/>
+            <w:r>
+              <w:rPr>
+                <w:rFonts w:ascii="Aptos" w:hAnsi="Aptos"/>
+                <w:b w:val="0"/>
+                <w:color w:val="1E293B"/>
+                <w:sz w:val="16"/>
+              </w:rPr>
+              <w:t>DPA/terms + redaction + invoice reconciliation + hard cap</w:t>
+            </w:r>
+          </w:p>
+        </w:tc>
+      </w:tr>
+      <w:tr>
+        <w:trPr>
+          <w:cantSplit/>
+        </w:trPr>
+        <w:tc>
+          <w:tcPr>
+            <w:tcW w:type="dxa" w:w="1512"/>
+            <w:vAlign w:val="center"/>
+          </w:tcPr>
+          <w:p>
+            <w:pPr>
+              <w:spacing w:after="0"/>
+            </w:pPr>
+            <w:r/>
+            <w:r>
+              <w:rPr>
+                <w:rFonts w:ascii="Aptos" w:hAnsi="Aptos"/>
+                <w:b w:val="0"/>
+                <w:color w:val="1E293B"/>
+                <w:sz w:val="16"/>
+              </w:rPr>
+              <w:t>Operating ownership</w:t>
+            </w:r>
+          </w:p>
+        </w:tc>
+        <w:tc>
+          <w:tcPr>
+            <w:tcW w:type="dxa" w:w="3312"/>
+            <w:vAlign w:val="center"/>
+          </w:tcPr>
+          <w:p>
+            <w:pPr>
+              <w:spacing w:after="0"/>
+            </w:pPr>
+            <w:r/>
+            <w:r>
+              <w:rPr>
+                <w:rFonts w:ascii="Aptos" w:hAnsi="Aptos"/>
+                <w:b w:val="0"/>
+                <w:color w:val="1E293B"/>
+                <w:sz w:val="16"/>
+              </w:rPr>
+              <w:t>Who owns platform, templates, policy, backup, alert, incidents and support?</w:t>
+            </w:r>
+          </w:p>
+        </w:tc>
+        <w:tc>
+          <w:tcPr>
+            <w:tcW w:type="dxa" w:w="2664"/>
+            <w:vAlign w:val="center"/>
+          </w:tcPr>
+          <w:p>
+            <w:pPr>
+              <w:spacing w:after="0"/>
+            </w:pPr>
+            <w:r/>
+            <w:r>
+              <w:rPr>
+                <w:rFonts w:ascii="Aptos" w:hAnsi="Aptos"/>
+                <w:b w:val="0"/>
+                <w:color w:val="1E293B"/>
+                <w:sz w:val="16"/>
+              </w:rPr>
+              <w:t>DECISION REQUIRED before shared production</w:t>
+            </w:r>
+          </w:p>
+        </w:tc>
+        <w:tc>
+          <w:tcPr>
+            <w:tcW w:type="dxa" w:w="2376"/>
+            <w:vAlign w:val="center"/>
+          </w:tcPr>
+          <w:p>
+            <w:pPr>
+              <w:spacing w:after="0"/>
+            </w:pPr>
+            <w:r/>
+            <w:r>
+              <w:rPr>
+                <w:rFonts w:ascii="Aptos" w:hAnsi="Aptos"/>
+                <w:b w:val="0"/>
+                <w:color w:val="1E293B"/>
+                <w:sz w:val="16"/>
+              </w:rPr>
+              <w:t>RACI + on-call + runbooks + service acceptance</w:t>
+            </w:r>
+          </w:p>
+        </w:tc>
+      </w:tr>
+      <w:tr>
+        <w:trPr>
+          <w:cantSplit/>
+        </w:trPr>
+        <w:tc>
+          <w:tcPr>
+            <w:tcW w:type="dxa" w:w="1512"/>
+            <w:shd w:val="clear" w:fill="F1F5F9"/>
+            <w:vAlign w:val="center"/>
+          </w:tcPr>
+          <w:p>
+            <w:pPr>
+              <w:spacing w:after="0"/>
+            </w:pPr>
+            <w:r/>
+            <w:r>
+              <w:rPr>
+                <w:rFonts w:ascii="Aptos" w:hAnsi="Aptos"/>
+                <w:b w:val="0"/>
+                <w:color w:val="1E293B"/>
+                <w:sz w:val="16"/>
+              </w:rPr>
+              <w:t>Exit / decommission</w:t>
+            </w:r>
+          </w:p>
+        </w:tc>
+        <w:tc>
+          <w:tcPr>
+            <w:tcW w:type="dxa" w:w="3312"/>
+            <w:shd w:val="clear" w:fill="F1F5F9"/>
+            <w:vAlign w:val="center"/>
+          </w:tcPr>
+          <w:p>
+            <w:pPr>
+              <w:spacing w:after="0"/>
+            </w:pPr>
+            <w:r/>
+            <w:r>
+              <w:rPr>
+                <w:rFonts w:ascii="Aptos" w:hAnsi="Aptos"/>
+                <w:b w:val="0"/>
+                <w:color w:val="1E293B"/>
+                <w:sz w:val="16"/>
+              </w:rPr>
+              <w:t>How are project/user/team data exported, retained, held or deleted?</w:t>
+            </w:r>
+          </w:p>
+        </w:tc>
+        <w:tc>
+          <w:tcPr>
+            <w:tcW w:type="dxa" w:w="2664"/>
+            <w:shd w:val="clear" w:fill="F1F5F9"/>
+            <w:vAlign w:val="center"/>
+          </w:tcPr>
+          <w:p>
+            <w:pPr>
+              <w:spacing w:after="0"/>
+            </w:pPr>
+            <w:r/>
+            <w:r>
+              <w:rPr>
+                <w:rFonts w:ascii="Aptos" w:hAnsi="Aptos"/>
+                <w:b w:val="0"/>
+                <w:color w:val="1E293B"/>
+                <w:sz w:val="16"/>
+              </w:rPr>
+              <w:t>Git export + controlled deletion; no orphan PVC</w:t>
+            </w:r>
+          </w:p>
+        </w:tc>
+        <w:tc>
+          <w:tcPr>
+            <w:tcW w:type="dxa" w:w="2376"/>
+            <w:shd w:val="clear" w:fill="F1F5F9"/>
+            <w:vAlign w:val="center"/>
+          </w:tcPr>
+          <w:p>
+            <w:pPr>
+              <w:spacing w:after="0"/>
+            </w:pPr>
+            <w:r/>
+            <w:r>
+              <w:rPr>
+                <w:rFonts w:ascii="Aptos" w:hAnsi="Aptos"/>
+                <w:b w:val="0"/>
+                <w:color w:val="1E293B"/>
+                <w:sz w:val="16"/>
+              </w:rPr>
+              <w:t>Export/delete E2E + legal hold + decommission runbook</w:t>
+            </w:r>
+          </w:p>
+        </w:tc>
+      </w:tr>
+    </w:tbl>
+    <w:p>
+      <w:pPr>
+        <w:spacing w:after="0"/>
+      </w:pPr>
+    </w:p>
+    <w:p>
+      <w:pPr>
+        <w:pStyle w:val="Heading2"/>
+      </w:pPr>
+      <w:r>
+        <w:t>Decision record template</w:t>
+      </w:r>
+    </w:p>
+    <w:tbl>
+      <w:tblPr>
+        <w:tblW w:type="auto" w:w="0"/>
+        <w:jc w:val="center"/>
+        <w:tblLook w:firstColumn="1" w:firstRow="1" w:lastColumn="0" w:lastRow="0" w:noHBand="0" w:noVBand="1" w:val="04A0"/>
+      </w:tblPr>
+      <w:tblGrid>
+        <w:gridCol w:w="10166"/>
+      </w:tblGrid>
+      <w:tr>
+        <w:trPr>
+          <w:cantSplit/>
+        </w:trPr>
+        <w:tc>
+          <w:tcPr>
+            <w:tcW w:type="dxa" w:w="10166"/>
+            <w:shd w:val="clear" w:fill="EFF6FF"/>
+          </w:tcPr>
+          <w:p>
+            <w:pPr>
+              <w:pStyle w:val="Callout"/>
+            </w:pPr>
+            <w:r>
+              <w:t>For every unresolved item record: decision ID; question; options considered; recommendation; decision owner; approvers; due date; evidence link; cost/operational impact; decision; and revisit trigger. A planning hypothesis must not become a procurement commitment without approved evidence.</w:t>
+            </w:r>
+          </w:p>
+        </w:tc>
+      </w:tr>
+    </w:tbl>
+    <w:p>
+      <w:pPr>
+        <w:spacing w:after="0"/>
+      </w:pPr>
+    </w:p>
+    <w:p>
+      <w:pPr>
+        <w:pStyle w:val="Heading1"/>
+      </w:pPr>
+      <w:r>
+        <w:t>10. Immediate decision package</w:t>
       </w:r>
     </w:p>
     <w:p>
@@ -6262,7 +8869,7 @@
         <w:pStyle w:val="Heading1"/>
       </w:pPr>
       <w:r>
-        <w:t>10. Repository references</w:t>
+        <w:t>11. Repository references</w:t>
       </w:r>
     </w:p>
     <w:tbl>

</xml_diff>

<commit_message>
docs: add functional scope and feature catalogue
</commit_message>
<xml_diff>
--- a/wiki/architecture/reports/vibe-code-platform-architecture-and-plan.docx
+++ b/wiki/architecture/reports/vibe-code-platform-architecture-and-plan.docx
@@ -34,7 +34,7 @@
           <w:color w:val="475569"/>
           <w:sz w:val="30"/>
         </w:rPr>
-        <w:t>Hong Kong production topology, scaling, user-data placement, staged roadmap and Stage 0 decision package</w:t>
+        <w:t>Product actors, epics, user stories and use cases; Hong Kong production topology, scaling, data placement and staged roadmap</w:t>
       </w:r>
     </w:p>
     <w:tbl>
@@ -81,7 +81,7 @@
     </w:p>
     <w:p>
       <w:r>
-        <w:t>Provide a pragmatic architecture and investment sequence for a freedom-first internal Vibe-Code platform. The design prioritises a complete user journey, isolation, portability, traceability and operational reality over an all-at-once “north-star” build.</w:t>
+        <w:t>Define the required product features and actor journeys, then provide a pragmatic architecture and investment sequence for a freedom-first internal Vibe-Code platform. The package prioritises a complete user journey, isolation, portability, traceability and operational reality over an all-at-once “north-star” build.</w:t>
       </w:r>
     </w:p>
     <w:tbl>
@@ -2211,7 +2211,4435 @@
         <w:pStyle w:val="Heading1"/>
       </w:pPr>
       <w:r>
-        <w:t>4. Production topology, scaling and data placement</w:t>
+        <w:t>4. Functional scope: epics, stories and use cases</w:t>
+      </w:r>
+    </w:p>
+    <w:p>
+      <w:r>
+        <w:t>Architecture components do not define a product by themselves. The following scope catalogue identifies who uses the platform, which outcomes and features are required, and which actor journeys must be demonstrable. The canonical detailed catalogue is wiki/product/vibe-code-platform-functional-scope.md.</w:t>
+      </w:r>
+    </w:p>
+    <w:p>
+      <w:pPr>
+        <w:pStyle w:val="Heading2"/>
+      </w:pPr>
+      <w:r>
+        <w:t>Actors</w:t>
+      </w:r>
+    </w:p>
+    <w:tbl>
+      <w:tblPr>
+        <w:tblStyle w:val="TableGrid"/>
+        <w:tblW w:type="auto" w:w="0"/>
+        <w:jc w:val="center"/>
+        <w:tblLook w:firstColumn="1" w:firstRow="1" w:lastColumn="0" w:lastRow="0" w:noHBand="0" w:noVBand="1" w:val="04A0"/>
+      </w:tblPr>
+      <w:tblGrid>
+        <w:gridCol w:w="3389"/>
+        <w:gridCol w:w="3389"/>
+        <w:gridCol w:w="3389"/>
+      </w:tblGrid>
+      <w:tr>
+        <w:trPr>
+          <w:cantSplit/>
+        </w:trPr>
+        <w:tc>
+          <w:tcPr>
+            <w:tcW w:type="dxa" w:w="2232"/>
+            <w:shd w:val="clear" w:fill="DBEAFE"/>
+            <w:vAlign w:val="center"/>
+          </w:tcPr>
+          <w:p>
+            <w:pPr>
+              <w:spacing w:after="0"/>
+            </w:pPr>
+            <w:r/>
+            <w:r>
+              <w:rPr>
+                <w:rFonts w:ascii="Aptos" w:hAnsi="Aptos"/>
+                <w:b/>
+                <w:color w:val="1E3A8A"/>
+                <w:sz w:val="17"/>
+              </w:rPr>
+              <w:t>Actor</w:t>
+            </w:r>
+          </w:p>
+        </w:tc>
+        <w:tc>
+          <w:tcPr>
+            <w:tcW w:type="dxa" w:w="4320"/>
+            <w:shd w:val="clear" w:fill="DBEAFE"/>
+            <w:vAlign w:val="center"/>
+          </w:tcPr>
+          <w:p>
+            <w:pPr>
+              <w:spacing w:after="0"/>
+            </w:pPr>
+            <w:r/>
+            <w:r>
+              <w:rPr>
+                <w:rFonts w:ascii="Aptos" w:hAnsi="Aptos"/>
+                <w:b/>
+                <w:color w:val="1E3A8A"/>
+                <w:sz w:val="17"/>
+              </w:rPr>
+              <w:t>Primary goal</w:t>
+            </w:r>
+          </w:p>
+        </w:tc>
+        <w:tc>
+          <w:tcPr>
+            <w:tcW w:type="dxa" w:w="3240"/>
+            <w:shd w:val="clear" w:fill="DBEAFE"/>
+            <w:vAlign w:val="center"/>
+          </w:tcPr>
+          <w:p>
+            <w:pPr>
+              <w:spacing w:after="0"/>
+            </w:pPr>
+            <w:r/>
+            <w:r>
+              <w:rPr>
+                <w:rFonts w:ascii="Aptos" w:hAnsi="Aptos"/>
+                <w:b/>
+                <w:color w:val="1E3A8A"/>
+                <w:sz w:val="17"/>
+              </w:rPr>
+              <w:t>Boundary</w:t>
+            </w:r>
+          </w:p>
+        </w:tc>
+      </w:tr>
+      <w:tr>
+        <w:trPr>
+          <w:cantSplit/>
+        </w:trPr>
+        <w:tc>
+          <w:tcPr>
+            <w:tcW w:type="dxa" w:w="2232"/>
+            <w:vAlign w:val="center"/>
+          </w:tcPr>
+          <w:p>
+            <w:pPr>
+              <w:spacing w:after="0"/>
+            </w:pPr>
+            <w:r/>
+            <w:r>
+              <w:rPr>
+                <w:rFonts w:ascii="Aptos" w:hAnsi="Aptos"/>
+                <w:b w:val="0"/>
+                <w:color w:val="1E293B"/>
+                <w:sz w:val="16"/>
+              </w:rPr>
+              <w:t>Citizen developer</w:t>
+            </w:r>
+          </w:p>
+        </w:tc>
+        <w:tc>
+          <w:tcPr>
+            <w:tcW w:type="dxa" w:w="4320"/>
+            <w:vAlign w:val="center"/>
+          </w:tcPr>
+          <w:p>
+            <w:pPr>
+              <w:spacing w:after="0"/>
+            </w:pPr>
+            <w:r/>
+            <w:r>
+              <w:rPr>
+                <w:rFonts w:ascii="Aptos" w:hAnsi="Aptos"/>
+                <w:b w:val="0"/>
+                <w:color w:val="1E293B"/>
+                <w:sz w:val="16"/>
+              </w:rPr>
+              <w:t>Create, continue, preview and hand over a POC</w:t>
+            </w:r>
+          </w:p>
+        </w:tc>
+        <w:tc>
+          <w:tcPr>
+            <w:tcW w:type="dxa" w:w="3240"/>
+            <w:vAlign w:val="center"/>
+          </w:tcPr>
+          <w:p>
+            <w:pPr>
+              <w:spacing w:after="0"/>
+            </w:pPr>
+            <w:r/>
+            <w:r>
+              <w:rPr>
+                <w:rFonts w:ascii="Aptos" w:hAnsi="Aptos"/>
+                <w:b w:val="0"/>
+                <w:color w:val="1E293B"/>
+                <w:sz w:val="16"/>
+              </w:rPr>
+              <w:t>Own projects only; no platform admin or production credentials.</w:t>
+            </w:r>
+          </w:p>
+        </w:tc>
+      </w:tr>
+      <w:tr>
+        <w:trPr>
+          <w:cantSplit/>
+        </w:trPr>
+        <w:tc>
+          <w:tcPr>
+            <w:tcW w:type="dxa" w:w="2232"/>
+            <w:shd w:val="clear" w:fill="F1F5F9"/>
+            <w:vAlign w:val="center"/>
+          </w:tcPr>
+          <w:p>
+            <w:pPr>
+              <w:spacing w:after="0"/>
+            </w:pPr>
+            <w:r/>
+            <w:r>
+              <w:rPr>
+                <w:rFonts w:ascii="Aptos" w:hAnsi="Aptos"/>
+                <w:b w:val="0"/>
+                <w:color w:val="1E293B"/>
+                <w:sz w:val="16"/>
+              </w:rPr>
+              <w:t>Team / project owner</w:t>
+            </w:r>
+          </w:p>
+        </w:tc>
+        <w:tc>
+          <w:tcPr>
+            <w:tcW w:type="dxa" w:w="4320"/>
+            <w:shd w:val="clear" w:fill="F1F5F9"/>
+            <w:vAlign w:val="center"/>
+          </w:tcPr>
+          <w:p>
+            <w:pPr>
+              <w:spacing w:after="0"/>
+            </w:pPr>
+            <w:r/>
+            <w:r>
+              <w:rPr>
+                <w:rFonts w:ascii="Aptos" w:hAnsi="Aptos"/>
+                <w:b w:val="0"/>
+                <w:color w:val="1E293B"/>
+                <w:sz w:val="16"/>
+              </w:rPr>
+              <w:t>Govern team projects, budgets, approvals and handover</w:t>
+            </w:r>
+          </w:p>
+        </w:tc>
+        <w:tc>
+          <w:tcPr>
+            <w:tcW w:type="dxa" w:w="3240"/>
+            <w:shd w:val="clear" w:fill="F1F5F9"/>
+            <w:vAlign w:val="center"/>
+          </w:tcPr>
+          <w:p>
+            <w:pPr>
+              <w:spacing w:after="0"/>
+            </w:pPr>
+            <w:r/>
+            <w:r>
+              <w:rPr>
+                <w:rFonts w:ascii="Aptos" w:hAnsi="Aptos"/>
+                <w:b w:val="0"/>
+                <w:color w:val="1E293B"/>
+                <w:sz w:val="16"/>
+              </w:rPr>
+              <w:t>Team/project scope; cannot bypass security policy.</w:t>
+            </w:r>
+          </w:p>
+        </w:tc>
+      </w:tr>
+      <w:tr>
+        <w:trPr>
+          <w:cantSplit/>
+        </w:trPr>
+        <w:tc>
+          <w:tcPr>
+            <w:tcW w:type="dxa" w:w="2232"/>
+            <w:vAlign w:val="center"/>
+          </w:tcPr>
+          <w:p>
+            <w:pPr>
+              <w:spacing w:after="0"/>
+            </w:pPr>
+            <w:r/>
+            <w:r>
+              <w:rPr>
+                <w:rFonts w:ascii="Aptos" w:hAnsi="Aptos"/>
+                <w:b w:val="0"/>
+                <w:color w:val="1E293B"/>
+                <w:sz w:val="16"/>
+              </w:rPr>
+              <w:t>Platform administrator</w:t>
+            </w:r>
+          </w:p>
+        </w:tc>
+        <w:tc>
+          <w:tcPr>
+            <w:tcW w:type="dxa" w:w="4320"/>
+            <w:vAlign w:val="center"/>
+          </w:tcPr>
+          <w:p>
+            <w:pPr>
+              <w:spacing w:after="0"/>
+            </w:pPr>
+            <w:r/>
+            <w:r>
+              <w:rPr>
+                <w:rFonts w:ascii="Aptos" w:hAnsi="Aptos"/>
+                <w:b w:val="0"/>
+                <w:color w:val="1E293B"/>
+                <w:sz w:val="16"/>
+              </w:rPr>
+              <w:t>Manage users, roles, policy, templates and capacity</w:t>
+            </w:r>
+          </w:p>
+        </w:tc>
+        <w:tc>
+          <w:tcPr>
+            <w:tcW w:type="dxa" w:w="3240"/>
+            <w:vAlign w:val="center"/>
+          </w:tcPr>
+          <w:p>
+            <w:pPr>
+              <w:spacing w:after="0"/>
+            </w:pPr>
+            <w:r/>
+            <w:r>
+              <w:rPr>
+                <w:rFonts w:ascii="Aptos" w:hAnsi="Aptos"/>
+                <w:b w:val="0"/>
+                <w:color w:val="1E293B"/>
+                <w:sz w:val="16"/>
+              </w:rPr>
+              <w:t>Privileged mutations audited; break-glass has reason/expiry.</w:t>
+            </w:r>
+          </w:p>
+        </w:tc>
+      </w:tr>
+      <w:tr>
+        <w:trPr>
+          <w:cantSplit/>
+        </w:trPr>
+        <w:tc>
+          <w:tcPr>
+            <w:tcW w:type="dxa" w:w="2232"/>
+            <w:shd w:val="clear" w:fill="F1F5F9"/>
+            <w:vAlign w:val="center"/>
+          </w:tcPr>
+          <w:p>
+            <w:pPr>
+              <w:spacing w:after="0"/>
+            </w:pPr>
+            <w:r/>
+            <w:r>
+              <w:rPr>
+                <w:rFonts w:ascii="Aptos" w:hAnsi="Aptos"/>
+                <w:b w:val="0"/>
+                <w:color w:val="1E293B"/>
+                <w:sz w:val="16"/>
+              </w:rPr>
+              <w:t>Platform operator</w:t>
+            </w:r>
+          </w:p>
+        </w:tc>
+        <w:tc>
+          <w:tcPr>
+            <w:tcW w:type="dxa" w:w="4320"/>
+            <w:shd w:val="clear" w:fill="F1F5F9"/>
+            <w:vAlign w:val="center"/>
+          </w:tcPr>
+          <w:p>
+            <w:pPr>
+              <w:spacing w:after="0"/>
+            </w:pPr>
+            <w:r/>
+            <w:r>
+              <w:rPr>
+                <w:rFonts w:ascii="Aptos" w:hAnsi="Aptos"/>
+                <w:b w:val="0"/>
+                <w:color w:val="1E293B"/>
+                <w:sz w:val="16"/>
+              </w:rPr>
+              <w:t>Operate clusters, data, backups, alerts and recovery</w:t>
+            </w:r>
+          </w:p>
+        </w:tc>
+        <w:tc>
+          <w:tcPr>
+            <w:tcW w:type="dxa" w:w="3240"/>
+            <w:shd w:val="clear" w:fill="F1F5F9"/>
+            <w:vAlign w:val="center"/>
+          </w:tcPr>
+          <w:p>
+            <w:pPr>
+              <w:spacing w:after="0"/>
+            </w:pPr>
+            <w:r/>
+            <w:r>
+              <w:rPr>
+                <w:rFonts w:ascii="Aptos" w:hAnsi="Aptos"/>
+                <w:b w:val="0"/>
+                <w:color w:val="1E293B"/>
+                <w:sz w:val="16"/>
+              </w:rPr>
+              <w:t>Private admin path; user workspaces are untrusted.</w:t>
+            </w:r>
+          </w:p>
+        </w:tc>
+      </w:tr>
+      <w:tr>
+        <w:trPr>
+          <w:cantSplit/>
+        </w:trPr>
+        <w:tc>
+          <w:tcPr>
+            <w:tcW w:type="dxa" w:w="2232"/>
+            <w:vAlign w:val="center"/>
+          </w:tcPr>
+          <w:p>
+            <w:pPr>
+              <w:spacing w:after="0"/>
+            </w:pPr>
+            <w:r/>
+            <w:r>
+              <w:rPr>
+                <w:rFonts w:ascii="Aptos" w:hAnsi="Aptos"/>
+                <w:b w:val="0"/>
+                <w:color w:val="1E293B"/>
+                <w:sz w:val="16"/>
+              </w:rPr>
+              <w:t>Security / privacy reviewer</w:t>
+            </w:r>
+          </w:p>
+        </w:tc>
+        <w:tc>
+          <w:tcPr>
+            <w:tcW w:type="dxa" w:w="4320"/>
+            <w:vAlign w:val="center"/>
+          </w:tcPr>
+          <w:p>
+            <w:pPr>
+              <w:spacing w:after="0"/>
+            </w:pPr>
+            <w:r/>
+            <w:r>
+              <w:rPr>
+                <w:rFonts w:ascii="Aptos" w:hAnsi="Aptos"/>
+                <w:b w:val="0"/>
+                <w:color w:val="1E293B"/>
+                <w:sz w:val="16"/>
+              </w:rPr>
+              <w:t>Approve policy, data flow, provider route and exception</w:t>
+            </w:r>
+          </w:p>
+        </w:tc>
+        <w:tc>
+          <w:tcPr>
+            <w:tcW w:type="dxa" w:w="3240"/>
+            <w:vAlign w:val="center"/>
+          </w:tcPr>
+          <w:p>
+            <w:pPr>
+              <w:spacing w:after="0"/>
+            </w:pPr>
+            <w:r/>
+            <w:r>
+              <w:rPr>
+                <w:rFonts w:ascii="Aptos" w:hAnsi="Aptos"/>
+                <w:b w:val="0"/>
+                <w:color w:val="1E293B"/>
+                <w:sz w:val="16"/>
+              </w:rPr>
+              <w:t>Evidence-based, narrow and expiring approvals.</w:t>
+            </w:r>
+          </w:p>
+        </w:tc>
+      </w:tr>
+      <w:tr>
+        <w:trPr>
+          <w:cantSplit/>
+        </w:trPr>
+        <w:tc>
+          <w:tcPr>
+            <w:tcW w:type="dxa" w:w="2232"/>
+            <w:shd w:val="clear" w:fill="F1F5F9"/>
+            <w:vAlign w:val="center"/>
+          </w:tcPr>
+          <w:p>
+            <w:pPr>
+              <w:spacing w:after="0"/>
+            </w:pPr>
+            <w:r/>
+            <w:r>
+              <w:rPr>
+                <w:rFonts w:ascii="Aptos" w:hAnsi="Aptos"/>
+                <w:b w:val="0"/>
+                <w:color w:val="1E293B"/>
+                <w:sz w:val="16"/>
+              </w:rPr>
+              <w:t>Identity owner</w:t>
+            </w:r>
+          </w:p>
+        </w:tc>
+        <w:tc>
+          <w:tcPr>
+            <w:tcW w:type="dxa" w:w="4320"/>
+            <w:shd w:val="clear" w:fill="F1F5F9"/>
+            <w:vAlign w:val="center"/>
+          </w:tcPr>
+          <w:p>
+            <w:pPr>
+              <w:spacing w:after="0"/>
+            </w:pPr>
+            <w:r/>
+            <w:r>
+              <w:rPr>
+                <w:rFonts w:ascii="Aptos" w:hAnsi="Aptos"/>
+                <w:b w:val="0"/>
+                <w:color w:val="1E293B"/>
+                <w:sz w:val="16"/>
+              </w:rPr>
+              <w:t>Approve SSO, group/role mapping, session and revoke</w:t>
+            </w:r>
+          </w:p>
+        </w:tc>
+        <w:tc>
+          <w:tcPr>
+            <w:tcW w:type="dxa" w:w="3240"/>
+            <w:shd w:val="clear" w:fill="F1F5F9"/>
+            <w:vAlign w:val="center"/>
+          </w:tcPr>
+          <w:p>
+            <w:pPr>
+              <w:spacing w:after="0"/>
+            </w:pPr>
+            <w:r/>
+            <w:r>
+              <w:rPr>
+                <w:rFonts w:ascii="Aptos" w:hAnsi="Aptos"/>
+                <w:b w:val="0"/>
+                <w:color w:val="1E293B"/>
+                <w:sz w:val="16"/>
+              </w:rPr>
+              <w:t>Platform and generated-app clients remain separate.</w:t>
+            </w:r>
+          </w:p>
+        </w:tc>
+      </w:tr>
+      <w:tr>
+        <w:trPr>
+          <w:cantSplit/>
+        </w:trPr>
+        <w:tc>
+          <w:tcPr>
+            <w:tcW w:type="dxa" w:w="2232"/>
+            <w:vAlign w:val="center"/>
+          </w:tcPr>
+          <w:p>
+            <w:pPr>
+              <w:spacing w:after="0"/>
+            </w:pPr>
+            <w:r/>
+            <w:r>
+              <w:rPr>
+                <w:rFonts w:ascii="Aptos" w:hAnsi="Aptos"/>
+                <w:b w:val="0"/>
+                <w:color w:val="1E293B"/>
+                <w:sz w:val="16"/>
+              </w:rPr>
+              <w:t>Network / infrastructure owner</w:t>
+            </w:r>
+          </w:p>
+        </w:tc>
+        <w:tc>
+          <w:tcPr>
+            <w:tcW w:type="dxa" w:w="4320"/>
+            <w:vAlign w:val="center"/>
+          </w:tcPr>
+          <w:p>
+            <w:pPr>
+              <w:spacing w:after="0"/>
+            </w:pPr>
+            <w:r/>
+            <w:r>
+              <w:rPr>
+                <w:rFonts w:ascii="Aptos" w:hAnsi="Aptos"/>
+                <w:b w:val="0"/>
+                <w:color w:val="1E293B"/>
+                <w:sz w:val="16"/>
+              </w:rPr>
+              <w:t>Approve HK placement, WAF, bandwidth, storage and DR</w:t>
+            </w:r>
+          </w:p>
+        </w:tc>
+        <w:tc>
+          <w:tcPr>
+            <w:tcW w:type="dxa" w:w="3240"/>
+            <w:vAlign w:val="center"/>
+          </w:tcPr>
+          <w:p>
+            <w:pPr>
+              <w:spacing w:after="0"/>
+            </w:pPr>
+            <w:r/>
+            <w:r>
+              <w:rPr>
+                <w:rFonts w:ascii="Aptos" w:hAnsi="Aptos"/>
+                <w:b w:val="0"/>
+                <w:color w:val="1E293B"/>
+                <w:sz w:val="16"/>
+              </w:rPr>
+              <w:t>Measured capacity and budget approval required.</w:t>
+            </w:r>
+          </w:p>
+        </w:tc>
+      </w:tr>
+      <w:tr>
+        <w:trPr>
+          <w:cantSplit/>
+        </w:trPr>
+        <w:tc>
+          <w:tcPr>
+            <w:tcW w:type="dxa" w:w="2232"/>
+            <w:shd w:val="clear" w:fill="F1F5F9"/>
+            <w:vAlign w:val="center"/>
+          </w:tcPr>
+          <w:p>
+            <w:pPr>
+              <w:spacing w:after="0"/>
+            </w:pPr>
+            <w:r/>
+            <w:r>
+              <w:rPr>
+                <w:rFonts w:ascii="Aptos" w:hAnsi="Aptos"/>
+                <w:b w:val="0"/>
+                <w:color w:val="1E293B"/>
+                <w:sz w:val="16"/>
+              </w:rPr>
+              <w:t>IT delivery owner</w:t>
+            </w:r>
+          </w:p>
+        </w:tc>
+        <w:tc>
+          <w:tcPr>
+            <w:tcW w:type="dxa" w:w="4320"/>
+            <w:shd w:val="clear" w:fill="F1F5F9"/>
+            <w:vAlign w:val="center"/>
+          </w:tcPr>
+          <w:p>
+            <w:pPr>
+              <w:spacing w:after="0"/>
+            </w:pPr>
+            <w:r/>
+            <w:r>
+              <w:rPr>
+                <w:rFonts w:ascii="Aptos" w:hAnsi="Aptos"/>
+                <w:b w:val="0"/>
+                <w:color w:val="1E293B"/>
+                <w:sz w:val="16"/>
+              </w:rPr>
+              <w:t>Accept/reject handover for enterprise re-engineering</w:t>
+            </w:r>
+          </w:p>
+        </w:tc>
+        <w:tc>
+          <w:tcPr>
+            <w:tcW w:type="dxa" w:w="3240"/>
+            <w:shd w:val="clear" w:fill="F1F5F9"/>
+            <w:vAlign w:val="center"/>
+          </w:tcPr>
+          <w:p>
+            <w:pPr>
+              <w:spacing w:after="0"/>
+            </w:pPr>
+            <w:r/>
+            <w:r>
+              <w:rPr>
+                <w:rFonts w:ascii="Aptos" w:hAnsi="Aptos"/>
+                <w:b w:val="0"/>
+                <w:color w:val="1E293B"/>
+                <w:sz w:val="16"/>
+              </w:rPr>
+              <w:t>Never directly promotes POC image or credentials.</w:t>
+            </w:r>
+          </w:p>
+        </w:tc>
+      </w:tr>
+      <w:tr>
+        <w:trPr>
+          <w:cantSplit/>
+        </w:trPr>
+        <w:tc>
+          <w:tcPr>
+            <w:tcW w:type="dxa" w:w="2232"/>
+            <w:vAlign w:val="center"/>
+          </w:tcPr>
+          <w:p>
+            <w:pPr>
+              <w:spacing w:after="0"/>
+            </w:pPr>
+            <w:r/>
+            <w:r>
+              <w:rPr>
+                <w:rFonts w:ascii="Aptos" w:hAnsi="Aptos"/>
+                <w:b w:val="0"/>
+                <w:color w:val="1E293B"/>
+                <w:sz w:val="16"/>
+              </w:rPr>
+              <w:t>Product sponsor</w:t>
+            </w:r>
+          </w:p>
+        </w:tc>
+        <w:tc>
+          <w:tcPr>
+            <w:tcW w:type="dxa" w:w="4320"/>
+            <w:vAlign w:val="center"/>
+          </w:tcPr>
+          <w:p>
+            <w:pPr>
+              <w:spacing w:after="0"/>
+            </w:pPr>
+            <w:r/>
+            <w:r>
+              <w:rPr>
+                <w:rFonts w:ascii="Aptos" w:hAnsi="Aptos"/>
+                <w:b w:val="0"/>
+                <w:color w:val="1E293B"/>
+                <w:sz w:val="16"/>
+              </w:rPr>
+              <w:t>Approve stage scope, SLO and funding</w:t>
+            </w:r>
+          </w:p>
+        </w:tc>
+        <w:tc>
+          <w:tcPr>
+            <w:tcW w:type="dxa" w:w="3240"/>
+            <w:vAlign w:val="center"/>
+          </w:tcPr>
+          <w:p>
+            <w:pPr>
+              <w:spacing w:after="0"/>
+            </w:pPr>
+            <w:r/>
+            <w:r>
+              <w:rPr>
+                <w:rFonts w:ascii="Aptos" w:hAnsi="Aptos"/>
+                <w:b w:val="0"/>
+                <w:color w:val="1E293B"/>
+                <w:sz w:val="16"/>
+              </w:rPr>
+              <w:t>Next phase requires adoption/failure/cost/security evidence.</w:t>
+            </w:r>
+          </w:p>
+        </w:tc>
+      </w:tr>
+    </w:tbl>
+    <w:p>
+      <w:pPr>
+        <w:spacing w:after="0"/>
+      </w:pPr>
+    </w:p>
+    <w:p>
+      <w:r>
+        <w:br w:type="page"/>
+      </w:r>
+    </w:p>
+    <w:p>
+      <w:pPr>
+        <w:pStyle w:val="Heading2"/>
+      </w:pPr>
+      <w:r>
+        <w:t>Epic and feature map</w:t>
+      </w:r>
+    </w:p>
+    <w:tbl>
+      <w:tblPr>
+        <w:tblStyle w:val="TableGrid"/>
+        <w:tblW w:type="auto" w:w="0"/>
+        <w:jc w:val="center"/>
+        <w:tblLook w:firstColumn="1" w:firstRow="1" w:lastColumn="0" w:lastRow="0" w:noHBand="0" w:noVBand="1" w:val="04A0"/>
+      </w:tblPr>
+      <w:tblGrid>
+        <w:gridCol w:w="2541"/>
+        <w:gridCol w:w="2541"/>
+        <w:gridCol w:w="2541"/>
+        <w:gridCol w:w="2541"/>
+      </w:tblGrid>
+      <w:tr>
+        <w:trPr>
+          <w:cantSplit/>
+        </w:trPr>
+        <w:tc>
+          <w:tcPr>
+            <w:tcW w:type="dxa" w:w="2376"/>
+            <w:shd w:val="clear" w:fill="DBEAFE"/>
+            <w:vAlign w:val="center"/>
+          </w:tcPr>
+          <w:p>
+            <w:pPr>
+              <w:spacing w:after="0"/>
+            </w:pPr>
+            <w:r/>
+            <w:r>
+              <w:rPr>
+                <w:rFonts w:ascii="Aptos" w:hAnsi="Aptos"/>
+                <w:b/>
+                <w:color w:val="1E3A8A"/>
+                <w:sz w:val="17"/>
+              </w:rPr>
+              <w:t>Epic</w:t>
+            </w:r>
+          </w:p>
+        </w:tc>
+        <w:tc>
+          <w:tcPr>
+            <w:tcW w:type="dxa" w:w="2520"/>
+            <w:shd w:val="clear" w:fill="DBEAFE"/>
+            <w:vAlign w:val="center"/>
+          </w:tcPr>
+          <w:p>
+            <w:pPr>
+              <w:spacing w:after="0"/>
+            </w:pPr>
+            <w:r/>
+            <w:r>
+              <w:rPr>
+                <w:rFonts w:ascii="Aptos" w:hAnsi="Aptos"/>
+                <w:b/>
+                <w:color w:val="1E3A8A"/>
+                <w:sz w:val="17"/>
+              </w:rPr>
+              <w:t>Outcome</w:t>
+            </w:r>
+          </w:p>
+        </w:tc>
+        <w:tc>
+          <w:tcPr>
+            <w:tcW w:type="dxa" w:w="3960"/>
+            <w:shd w:val="clear" w:fill="DBEAFE"/>
+            <w:vAlign w:val="center"/>
+          </w:tcPr>
+          <w:p>
+            <w:pPr>
+              <w:spacing w:after="0"/>
+            </w:pPr>
+            <w:r/>
+            <w:r>
+              <w:rPr>
+                <w:rFonts w:ascii="Aptos" w:hAnsi="Aptos"/>
+                <w:b/>
+                <w:color w:val="1E3A8A"/>
+                <w:sz w:val="17"/>
+              </w:rPr>
+              <w:t>Required feature groups</w:t>
+            </w:r>
+          </w:p>
+        </w:tc>
+        <w:tc>
+          <w:tcPr>
+            <w:tcW w:type="dxa" w:w="936"/>
+            <w:shd w:val="clear" w:fill="DBEAFE"/>
+            <w:vAlign w:val="center"/>
+          </w:tcPr>
+          <w:p>
+            <w:pPr>
+              <w:spacing w:after="0"/>
+            </w:pPr>
+            <w:r/>
+            <w:r>
+              <w:rPr>
+                <w:rFonts w:ascii="Aptos" w:hAnsi="Aptos"/>
+                <w:b/>
+                <w:color w:val="1E3A8A"/>
+                <w:sz w:val="17"/>
+              </w:rPr>
+              <w:t>Phase</w:t>
+            </w:r>
+          </w:p>
+        </w:tc>
+      </w:tr>
+      <w:tr>
+        <w:trPr>
+          <w:cantSplit/>
+        </w:trPr>
+        <w:tc>
+          <w:tcPr>
+            <w:tcW w:type="dxa" w:w="2376"/>
+            <w:vAlign w:val="center"/>
+          </w:tcPr>
+          <w:p>
+            <w:pPr>
+              <w:spacing w:after="0"/>
+            </w:pPr>
+            <w:r/>
+            <w:r>
+              <w:rPr>
+                <w:rFonts w:ascii="Aptos" w:hAnsi="Aptos"/>
+                <w:b w:val="0"/>
+                <w:color w:val="1E293B"/>
+                <w:sz w:val="16"/>
+              </w:rPr>
+              <w:t>EP-01 Identity, access and ownership</w:t>
+            </w:r>
+          </w:p>
+        </w:tc>
+        <w:tc>
+          <w:tcPr>
+            <w:tcW w:type="dxa" w:w="2520"/>
+            <w:vAlign w:val="center"/>
+          </w:tcPr>
+          <w:p>
+            <w:pPr>
+              <w:spacing w:after="0"/>
+            </w:pPr>
+            <w:r/>
+            <w:r>
+              <w:rPr>
+                <w:rFonts w:ascii="Aptos" w:hAnsi="Aptos"/>
+                <w:b w:val="0"/>
+                <w:color w:val="1E293B"/>
+                <w:sz w:val="16"/>
+              </w:rPr>
+              <w:t>Safe entry and owner-scoped actions</w:t>
+            </w:r>
+          </w:p>
+        </w:tc>
+        <w:tc>
+          <w:tcPr>
+            <w:tcW w:type="dxa" w:w="3960"/>
+            <w:vAlign w:val="center"/>
+          </w:tcPr>
+          <w:p>
+            <w:pPr>
+              <w:spacing w:after="0"/>
+            </w:pPr>
+            <w:r/>
+            <w:r>
+              <w:rPr>
+                <w:rFonts w:ascii="Aptos" w:hAnsi="Aptos"/>
+                <w:b w:val="0"/>
+                <w:color w:val="1E293B"/>
+                <w:sz w:val="16"/>
+              </w:rPr>
+              <w:t>SSO, sessions, roles, ownership, revoke, break-glass audit</w:t>
+            </w:r>
+          </w:p>
+        </w:tc>
+        <w:tc>
+          <w:tcPr>
+            <w:tcW w:type="dxa" w:w="936"/>
+            <w:vAlign w:val="center"/>
+          </w:tcPr>
+          <w:p>
+            <w:pPr>
+              <w:spacing w:after="0"/>
+            </w:pPr>
+            <w:r/>
+            <w:r>
+              <w:rPr>
+                <w:rFonts w:ascii="Aptos" w:hAnsi="Aptos"/>
+                <w:b w:val="0"/>
+                <w:color w:val="1E293B"/>
+                <w:sz w:val="16"/>
+              </w:rPr>
+              <w:t>1–3</w:t>
+            </w:r>
+          </w:p>
+        </w:tc>
+      </w:tr>
+      <w:tr>
+        <w:trPr>
+          <w:cantSplit/>
+        </w:trPr>
+        <w:tc>
+          <w:tcPr>
+            <w:tcW w:type="dxa" w:w="2376"/>
+            <w:shd w:val="clear" w:fill="F1F5F9"/>
+            <w:vAlign w:val="center"/>
+          </w:tcPr>
+          <w:p>
+            <w:pPr>
+              <w:spacing w:after="0"/>
+            </w:pPr>
+            <w:r/>
+            <w:r>
+              <w:rPr>
+                <w:rFonts w:ascii="Aptos" w:hAnsi="Aptos"/>
+                <w:b w:val="0"/>
+                <w:color w:val="1E293B"/>
+                <w:sz w:val="16"/>
+              </w:rPr>
+              <w:t>EP-02 Project, template and package lifecycle</w:t>
+            </w:r>
+          </w:p>
+        </w:tc>
+        <w:tc>
+          <w:tcPr>
+            <w:tcW w:type="dxa" w:w="2520"/>
+            <w:shd w:val="clear" w:fill="F1F5F9"/>
+            <w:vAlign w:val="center"/>
+          </w:tcPr>
+          <w:p>
+            <w:pPr>
+              <w:spacing w:after="0"/>
+            </w:pPr>
+            <w:r/>
+            <w:r>
+              <w:rPr>
+                <w:rFonts w:ascii="Aptos" w:hAnsi="Aptos"/>
+                <w:b w:val="0"/>
+                <w:color w:val="1E293B"/>
+                <w:sz w:val="16"/>
+              </w:rPr>
+              <w:t>Governed reusable project creation</w:t>
+            </w:r>
+          </w:p>
+        </w:tc>
+        <w:tc>
+          <w:tcPr>
+            <w:tcW w:type="dxa" w:w="3960"/>
+            <w:shd w:val="clear" w:fill="F1F5F9"/>
+            <w:vAlign w:val="center"/>
+          </w:tcPr>
+          <w:p>
+            <w:pPr>
+              <w:spacing w:after="0"/>
+            </w:pPr>
+            <w:r/>
+            <w:r>
+              <w:rPr>
+                <w:rFonts w:ascii="Aptos" w:hAnsi="Aptos"/>
+                <w:b w:val="0"/>
+                <w:color w:val="1E293B"/>
+                <w:sz w:val="16"/>
+              </w:rPr>
+              <w:t>Project Passport, templates/channels, package compatibility/upgrade/remove</w:t>
+            </w:r>
+          </w:p>
+        </w:tc>
+        <w:tc>
+          <w:tcPr>
+            <w:tcW w:type="dxa" w:w="936"/>
+            <w:shd w:val="clear" w:fill="F1F5F9"/>
+            <w:vAlign w:val="center"/>
+          </w:tcPr>
+          <w:p>
+            <w:pPr>
+              <w:spacing w:after="0"/>
+            </w:pPr>
+            <w:r/>
+            <w:r>
+              <w:rPr>
+                <w:rFonts w:ascii="Aptos" w:hAnsi="Aptos"/>
+                <w:b w:val="0"/>
+                <w:color w:val="1E293B"/>
+                <w:sz w:val="16"/>
+              </w:rPr>
+              <w:t>0–2 / 6</w:t>
+            </w:r>
+          </w:p>
+        </w:tc>
+      </w:tr>
+      <w:tr>
+        <w:trPr>
+          <w:cantSplit/>
+        </w:trPr>
+        <w:tc>
+          <w:tcPr>
+            <w:tcW w:type="dxa" w:w="2376"/>
+            <w:vAlign w:val="center"/>
+          </w:tcPr>
+          <w:p>
+            <w:pPr>
+              <w:spacing w:after="0"/>
+            </w:pPr>
+            <w:r/>
+            <w:r>
+              <w:rPr>
+                <w:rFonts w:ascii="Aptos" w:hAnsi="Aptos"/>
+                <w:b w:val="0"/>
+                <w:color w:val="1E293B"/>
+                <w:sz w:val="16"/>
+              </w:rPr>
+              <w:t>EP-03 Workspace and browser IDE</w:t>
+            </w:r>
+          </w:p>
+        </w:tc>
+        <w:tc>
+          <w:tcPr>
+            <w:tcW w:type="dxa" w:w="2520"/>
+            <w:vAlign w:val="center"/>
+          </w:tcPr>
+          <w:p>
+            <w:pPr>
+              <w:spacing w:after="0"/>
+            </w:pPr>
+            <w:r/>
+            <w:r>
+              <w:rPr>
+                <w:rFonts w:ascii="Aptos" w:hAnsi="Aptos"/>
+                <w:b w:val="0"/>
+                <w:color w:val="1E293B"/>
+                <w:sz w:val="16"/>
+              </w:rPr>
+              <w:t>Isolated persistent coding environment</w:t>
+            </w:r>
+          </w:p>
+        </w:tc>
+        <w:tc>
+          <w:tcPr>
+            <w:tcW w:type="dxa" w:w="3960"/>
+            <w:vAlign w:val="center"/>
+          </w:tcPr>
+          <w:p>
+            <w:pPr>
+              <w:spacing w:after="0"/>
+            </w:pPr>
+            <w:r/>
+            <w:r>
+              <w:rPr>
+                <w:rFonts w:ascii="Aptos" w:hAnsi="Aptos"/>
+                <w:b w:val="0"/>
+                <w:color w:val="1E293B"/>
+                <w:sz w:val="16"/>
+              </w:rPr>
+              <w:t>Coder, code-server/Cline, PVC, router, quotas, checkpoints, rescue</w:t>
+            </w:r>
+          </w:p>
+        </w:tc>
+        <w:tc>
+          <w:tcPr>
+            <w:tcW w:type="dxa" w:w="936"/>
+            <w:vAlign w:val="center"/>
+          </w:tcPr>
+          <w:p>
+            <w:pPr>
+              <w:spacing w:after="0"/>
+            </w:pPr>
+            <w:r/>
+            <w:r>
+              <w:rPr>
+                <w:rFonts w:ascii="Aptos" w:hAnsi="Aptos"/>
+                <w:b w:val="0"/>
+                <w:color w:val="1E293B"/>
+                <w:sz w:val="16"/>
+              </w:rPr>
+              <w:t>0–3</w:t>
+            </w:r>
+          </w:p>
+        </w:tc>
+      </w:tr>
+      <w:tr>
+        <w:trPr>
+          <w:cantSplit/>
+        </w:trPr>
+        <w:tc>
+          <w:tcPr>
+            <w:tcW w:type="dxa" w:w="2376"/>
+            <w:shd w:val="clear" w:fill="F1F5F9"/>
+            <w:vAlign w:val="center"/>
+          </w:tcPr>
+          <w:p>
+            <w:pPr>
+              <w:spacing w:after="0"/>
+            </w:pPr>
+            <w:r/>
+            <w:r>
+              <w:rPr>
+                <w:rFonts w:ascii="Aptos" w:hAnsi="Aptos"/>
+                <w:b w:val="0"/>
+                <w:color w:val="1E293B"/>
+                <w:sz w:val="16"/>
+              </w:rPr>
+              <w:t>EP-04 AI coding and model governance</w:t>
+            </w:r>
+          </w:p>
+        </w:tc>
+        <w:tc>
+          <w:tcPr>
+            <w:tcW w:type="dxa" w:w="2520"/>
+            <w:shd w:val="clear" w:fill="F1F5F9"/>
+            <w:vAlign w:val="center"/>
+          </w:tcPr>
+          <w:p>
+            <w:pPr>
+              <w:spacing w:after="0"/>
+            </w:pPr>
+            <w:r/>
+            <w:r>
+              <w:rPr>
+                <w:rFonts w:ascii="Aptos" w:hAnsi="Aptos"/>
+                <w:b w:val="0"/>
+                <w:color w:val="1E293B"/>
+                <w:sz w:val="16"/>
+              </w:rPr>
+              <w:t>Approved models without master-key exposure</w:t>
+            </w:r>
+          </w:p>
+        </w:tc>
+        <w:tc>
+          <w:tcPr>
+            <w:tcW w:type="dxa" w:w="3960"/>
+            <w:shd w:val="clear" w:fill="F1F5F9"/>
+            <w:vAlign w:val="center"/>
+          </w:tcPr>
+          <w:p>
+            <w:pPr>
+              <w:spacing w:after="0"/>
+            </w:pPr>
+            <w:r/>
+            <w:r>
+              <w:rPr>
+                <w:rFonts w:ascii="Aptos" w:hAnsi="Aptos"/>
+                <w:b w:val="0"/>
+                <w:color w:val="1E293B"/>
+                <w:sz w:val="16"/>
+              </w:rPr>
+              <w:t>LiteLLM key/alias, streaming, tools, budget, fallback, traces</w:t>
+            </w:r>
+          </w:p>
+        </w:tc>
+        <w:tc>
+          <w:tcPr>
+            <w:tcW w:type="dxa" w:w="936"/>
+            <w:shd w:val="clear" w:fill="F1F5F9"/>
+            <w:vAlign w:val="center"/>
+          </w:tcPr>
+          <w:p>
+            <w:pPr>
+              <w:spacing w:after="0"/>
+            </w:pPr>
+            <w:r/>
+            <w:r>
+              <w:rPr>
+                <w:rFonts w:ascii="Aptos" w:hAnsi="Aptos"/>
+                <w:b w:val="0"/>
+                <w:color w:val="1E293B"/>
+                <w:sz w:val="16"/>
+              </w:rPr>
+              <w:t>0–2</w:t>
+            </w:r>
+          </w:p>
+        </w:tc>
+      </w:tr>
+      <w:tr>
+        <w:trPr>
+          <w:cantSplit/>
+        </w:trPr>
+        <w:tc>
+          <w:tcPr>
+            <w:tcW w:type="dxa" w:w="2376"/>
+            <w:vAlign w:val="center"/>
+          </w:tcPr>
+          <w:p>
+            <w:pPr>
+              <w:spacing w:after="0"/>
+            </w:pPr>
+            <w:r/>
+            <w:r>
+              <w:rPr>
+                <w:rFonts w:ascii="Aptos" w:hAnsi="Aptos"/>
+                <w:b w:val="0"/>
+                <w:color w:val="1E293B"/>
+                <w:sz w:val="16"/>
+              </w:rPr>
+              <w:t>EP-05 Preview and POC data</w:t>
+            </w:r>
+          </w:p>
+        </w:tc>
+        <w:tc>
+          <w:tcPr>
+            <w:tcW w:type="dxa" w:w="2520"/>
+            <w:vAlign w:val="center"/>
+          </w:tcPr>
+          <w:p>
+            <w:pPr>
+              <w:spacing w:after="0"/>
+            </w:pPr>
+            <w:r/>
+            <w:r>
+              <w:rPr>
+                <w:rFonts w:ascii="Aptos" w:hAnsi="Aptos"/>
+                <w:b w:val="0"/>
+                <w:color w:val="1E293B"/>
+                <w:sz w:val="16"/>
+              </w:rPr>
+              <w:t>Complete frontend/API/database demonstration</w:t>
+            </w:r>
+          </w:p>
+        </w:tc>
+        <w:tc>
+          <w:tcPr>
+            <w:tcW w:type="dxa" w:w="3960"/>
+            <w:vAlign w:val="center"/>
+          </w:tcPr>
+          <w:p>
+            <w:pPr>
+              <w:spacing w:after="0"/>
+            </w:pPr>
+            <w:r/>
+            <w:r>
+              <w:rPr>
+                <w:rFonts w:ascii="Aptos" w:hAnsi="Aptos"/>
+                <w:b w:val="0"/>
+                <w:color w:val="1E293B"/>
+                <w:sz w:val="16"/>
+              </w:rPr>
+              <w:t>Authenticated preview, port broker, readiness, persistence, TTL</w:t>
+            </w:r>
+          </w:p>
+        </w:tc>
+        <w:tc>
+          <w:tcPr>
+            <w:tcW w:type="dxa" w:w="936"/>
+            <w:vAlign w:val="center"/>
+          </w:tcPr>
+          <w:p>
+            <w:pPr>
+              <w:spacing w:after="0"/>
+            </w:pPr>
+            <w:r/>
+            <w:r>
+              <w:rPr>
+                <w:rFonts w:ascii="Aptos" w:hAnsi="Aptos"/>
+                <w:b w:val="0"/>
+                <w:color w:val="1E293B"/>
+                <w:sz w:val="16"/>
+              </w:rPr>
+              <w:t>0–3 / 6</w:t>
+            </w:r>
+          </w:p>
+        </w:tc>
+      </w:tr>
+      <w:tr>
+        <w:trPr>
+          <w:cantSplit/>
+        </w:trPr>
+        <w:tc>
+          <w:tcPr>
+            <w:tcW w:type="dxa" w:w="2376"/>
+            <w:shd w:val="clear" w:fill="F1F5F9"/>
+            <w:vAlign w:val="center"/>
+          </w:tcPr>
+          <w:p>
+            <w:pPr>
+              <w:spacing w:after="0"/>
+            </w:pPr>
+            <w:r/>
+            <w:r>
+              <w:rPr>
+                <w:rFonts w:ascii="Aptos" w:hAnsi="Aptos"/>
+                <w:b w:val="0"/>
+                <w:color w:val="1E293B"/>
+                <w:sz w:val="16"/>
+              </w:rPr>
+              <w:t>EP-06 Source, quality and IT handover</w:t>
+            </w:r>
+          </w:p>
+        </w:tc>
+        <w:tc>
+          <w:tcPr>
+            <w:tcW w:type="dxa" w:w="2520"/>
+            <w:shd w:val="clear" w:fill="F1F5F9"/>
+            <w:vAlign w:val="center"/>
+          </w:tcPr>
+          <w:p>
+            <w:pPr>
+              <w:spacing w:after="0"/>
+            </w:pPr>
+            <w:r/>
+            <w:r>
+              <w:rPr>
+                <w:rFonts w:ascii="Aptos" w:hAnsi="Aptos"/>
+                <w:b w:val="0"/>
+                <w:color w:val="1E293B"/>
+                <w:sz w:val="16"/>
+              </w:rPr>
+              <w:t>Immutable source and reviewable evidence</w:t>
+            </w:r>
+          </w:p>
+        </w:tc>
+        <w:tc>
+          <w:tcPr>
+            <w:tcW w:type="dxa" w:w="3960"/>
+            <w:shd w:val="clear" w:fill="F1F5F9"/>
+            <w:vAlign w:val="center"/>
+          </w:tcPr>
+          <w:p>
+            <w:pPr>
+              <w:spacing w:after="0"/>
+            </w:pPr>
+            <w:r/>
+            <w:r>
+              <w:rPr>
+                <w:rFonts w:ascii="Aptos" w:hAnsi="Aptos"/>
+                <w:b w:val="0"/>
+                <w:color w:val="1E293B"/>
+                <w:sz w:val="16"/>
+              </w:rPr>
+              <w:t>Git/CI, tests, SBOM/scans, Failure Capsule, signed handover</w:t>
+            </w:r>
+          </w:p>
+        </w:tc>
+        <w:tc>
+          <w:tcPr>
+            <w:tcW w:type="dxa" w:w="936"/>
+            <w:shd w:val="clear" w:fill="F1F5F9"/>
+            <w:vAlign w:val="center"/>
+          </w:tcPr>
+          <w:p>
+            <w:pPr>
+              <w:spacing w:after="0"/>
+            </w:pPr>
+            <w:r/>
+            <w:r>
+              <w:rPr>
+                <w:rFonts w:ascii="Aptos" w:hAnsi="Aptos"/>
+                <w:b w:val="0"/>
+                <w:color w:val="1E293B"/>
+                <w:sz w:val="16"/>
+              </w:rPr>
+              <w:t>1–3 / 6</w:t>
+            </w:r>
+          </w:p>
+        </w:tc>
+      </w:tr>
+      <w:tr>
+        <w:trPr>
+          <w:cantSplit/>
+        </w:trPr>
+        <w:tc>
+          <w:tcPr>
+            <w:tcW w:type="dxa" w:w="2376"/>
+            <w:vAlign w:val="center"/>
+          </w:tcPr>
+          <w:p>
+            <w:pPr>
+              <w:spacing w:after="0"/>
+            </w:pPr>
+            <w:r/>
+            <w:r>
+              <w:rPr>
+                <w:rFonts w:ascii="Aptos" w:hAnsi="Aptos"/>
+                <w:b w:val="0"/>
+                <w:color w:val="1E293B"/>
+                <w:sz w:val="16"/>
+              </w:rPr>
+              <w:t>EP-07 Administration, policy and FinOps</w:t>
+            </w:r>
+          </w:p>
+        </w:tc>
+        <w:tc>
+          <w:tcPr>
+            <w:tcW w:type="dxa" w:w="2520"/>
+            <w:vAlign w:val="center"/>
+          </w:tcPr>
+          <w:p>
+            <w:pPr>
+              <w:spacing w:after="0"/>
+            </w:pPr>
+            <w:r/>
+            <w:r>
+              <w:rPr>
+                <w:rFonts w:ascii="Aptos" w:hAnsi="Aptos"/>
+                <w:b w:val="0"/>
+                <w:color w:val="1E293B"/>
+                <w:sz w:val="16"/>
+              </w:rPr>
+              <w:t>Transparent governance, cost and audit</w:t>
+            </w:r>
+          </w:p>
+        </w:tc>
+        <w:tc>
+          <w:tcPr>
+            <w:tcW w:type="dxa" w:w="3960"/>
+            <w:vAlign w:val="center"/>
+          </w:tcPr>
+          <w:p>
+            <w:pPr>
+              <w:spacing w:after="0"/>
+            </w:pPr>
+            <w:r/>
+            <w:r>
+              <w:rPr>
+                <w:rFonts w:ascii="Aptos" w:hAnsi="Aptos"/>
+                <w:b w:val="0"/>
+                <w:color w:val="1E293B"/>
+                <w:sz w:val="16"/>
+              </w:rPr>
+              <w:t>Admin CMS, policy/quota, usage/cost, audit, suspend/kill</w:t>
+            </w:r>
+          </w:p>
+        </w:tc>
+        <w:tc>
+          <w:tcPr>
+            <w:tcW w:type="dxa" w:w="936"/>
+            <w:vAlign w:val="center"/>
+          </w:tcPr>
+          <w:p>
+            <w:pPr>
+              <w:spacing w:after="0"/>
+            </w:pPr>
+            <w:r/>
+            <w:r>
+              <w:rPr>
+                <w:rFonts w:ascii="Aptos" w:hAnsi="Aptos"/>
+                <w:b w:val="0"/>
+                <w:color w:val="1E293B"/>
+                <w:sz w:val="16"/>
+              </w:rPr>
+              <w:t>1–3</w:t>
+            </w:r>
+          </w:p>
+        </w:tc>
+      </w:tr>
+      <w:tr>
+        <w:trPr>
+          <w:cantSplit/>
+        </w:trPr>
+        <w:tc>
+          <w:tcPr>
+            <w:tcW w:type="dxa" w:w="2376"/>
+            <w:shd w:val="clear" w:fill="F1F5F9"/>
+            <w:vAlign w:val="center"/>
+          </w:tcPr>
+          <w:p>
+            <w:pPr>
+              <w:spacing w:after="0"/>
+            </w:pPr>
+            <w:r/>
+            <w:r>
+              <w:rPr>
+                <w:rFonts w:ascii="Aptos" w:hAnsi="Aptos"/>
+                <w:b w:val="0"/>
+                <w:color w:val="1E293B"/>
+                <w:sz w:val="16"/>
+              </w:rPr>
+              <w:t>EP-08 Durable agents and mobile</w:t>
+            </w:r>
+          </w:p>
+        </w:tc>
+        <w:tc>
+          <w:tcPr>
+            <w:tcW w:type="dxa" w:w="2520"/>
+            <w:shd w:val="clear" w:fill="F1F5F9"/>
+            <w:vAlign w:val="center"/>
+          </w:tcPr>
+          <w:p>
+            <w:pPr>
+              <w:spacing w:after="0"/>
+            </w:pPr>
+            <w:r/>
+            <w:r>
+              <w:rPr>
+                <w:rFonts w:ascii="Aptos" w:hAnsi="Aptos"/>
+                <w:b w:val="0"/>
+                <w:color w:val="1E293B"/>
+                <w:sz w:val="16"/>
+              </w:rPr>
+              <w:t>Recoverable tasks independent of browser connection</w:t>
+            </w:r>
+          </w:p>
+        </w:tc>
+        <w:tc>
+          <w:tcPr>
+            <w:tcW w:type="dxa" w:w="3960"/>
+            <w:shd w:val="clear" w:fill="F1F5F9"/>
+            <w:vAlign w:val="center"/>
+          </w:tcPr>
+          <w:p>
+            <w:pPr>
+              <w:spacing w:after="0"/>
+            </w:pPr>
+            <w:r/>
+            <w:r>
+              <w:rPr>
+                <w:rFonts w:ascii="Aptos" w:hAnsi="Aptos"/>
+                <w:b w:val="0"/>
+                <w:color w:val="1E293B"/>
+                <w:sz w:val="16"/>
+              </w:rPr>
+              <w:t>Outbox, RabbitMQ, runner, approval, replay, Stop, PWA</w:t>
+            </w:r>
+          </w:p>
+        </w:tc>
+        <w:tc>
+          <w:tcPr>
+            <w:tcW w:type="dxa" w:w="936"/>
+            <w:shd w:val="clear" w:fill="F1F5F9"/>
+            <w:vAlign w:val="center"/>
+          </w:tcPr>
+          <w:p>
+            <w:pPr>
+              <w:spacing w:after="0"/>
+            </w:pPr>
+            <w:r/>
+            <w:r>
+              <w:rPr>
+                <w:rFonts w:ascii="Aptos" w:hAnsi="Aptos"/>
+                <w:b w:val="0"/>
+                <w:color w:val="1E293B"/>
+                <w:sz w:val="16"/>
+              </w:rPr>
+              <w:t>4–5</w:t>
+            </w:r>
+          </w:p>
+        </w:tc>
+      </w:tr>
+      <w:tr>
+        <w:trPr>
+          <w:cantSplit/>
+        </w:trPr>
+        <w:tc>
+          <w:tcPr>
+            <w:tcW w:type="dxa" w:w="2376"/>
+            <w:vAlign w:val="center"/>
+          </w:tcPr>
+          <w:p>
+            <w:pPr>
+              <w:spacing w:after="0"/>
+            </w:pPr>
+            <w:r/>
+            <w:r>
+              <w:rPr>
+                <w:rFonts w:ascii="Aptos" w:hAnsi="Aptos"/>
+                <w:b w:val="0"/>
+                <w:color w:val="1E293B"/>
+                <w:sz w:val="16"/>
+              </w:rPr>
+              <w:t>EP-09 Operations, capacity and recovery</w:t>
+            </w:r>
+          </w:p>
+        </w:tc>
+        <w:tc>
+          <w:tcPr>
+            <w:tcW w:type="dxa" w:w="2520"/>
+            <w:vAlign w:val="center"/>
+          </w:tcPr>
+          <w:p>
+            <w:pPr>
+              <w:spacing w:after="0"/>
+            </w:pPr>
+            <w:r/>
+            <w:r>
+              <w:rPr>
+                <w:rFonts w:ascii="Aptos" w:hAnsi="Aptos"/>
+                <w:b w:val="0"/>
+                <w:color w:val="1E293B"/>
+                <w:sz w:val="16"/>
+              </w:rPr>
+              <w:t>Operable under load and recoverable from failure</w:t>
+            </w:r>
+          </w:p>
+        </w:tc>
+        <w:tc>
+          <w:tcPr>
+            <w:tcW w:type="dxa" w:w="3960"/>
+            <w:vAlign w:val="center"/>
+          </w:tcPr>
+          <w:p>
+            <w:pPr>
+              <w:spacing w:after="0"/>
+            </w:pPr>
+            <w:r/>
+            <w:r>
+              <w:rPr>
+                <w:rFonts w:ascii="Aptos" w:hAnsi="Aptos"/>
+                <w:b w:val="0"/>
+                <w:color w:val="1E293B"/>
+                <w:sz w:val="16"/>
+              </w:rPr>
+              <w:t>Admission, autoscaling, SLO, backup/restore, multi-AZ, HK DR</w:t>
+            </w:r>
+          </w:p>
+        </w:tc>
+        <w:tc>
+          <w:tcPr>
+            <w:tcW w:type="dxa" w:w="936"/>
+            <w:vAlign w:val="center"/>
+          </w:tcPr>
+          <w:p>
+            <w:pPr>
+              <w:spacing w:after="0"/>
+            </w:pPr>
+            <w:r/>
+            <w:r>
+              <w:rPr>
+                <w:rFonts w:ascii="Aptos" w:hAnsi="Aptos"/>
+                <w:b w:val="0"/>
+                <w:color w:val="1E293B"/>
+                <w:sz w:val="16"/>
+              </w:rPr>
+              <w:t>2–6</w:t>
+            </w:r>
+          </w:p>
+        </w:tc>
+      </w:tr>
+      <w:tr>
+        <w:trPr>
+          <w:cantSplit/>
+        </w:trPr>
+        <w:tc>
+          <w:tcPr>
+            <w:tcW w:type="dxa" w:w="2376"/>
+            <w:shd w:val="clear" w:fill="F1F5F9"/>
+            <w:vAlign w:val="center"/>
+          </w:tcPr>
+          <w:p>
+            <w:pPr>
+              <w:spacing w:after="0"/>
+            </w:pPr>
+            <w:r/>
+            <w:r>
+              <w:rPr>
+                <w:rFonts w:ascii="Aptos" w:hAnsi="Aptos"/>
+                <w:b w:val="0"/>
+                <w:color w:val="1E293B"/>
+                <w:sz w:val="16"/>
+              </w:rPr>
+              <w:t>EP-10 Supply chain and integrations</w:t>
+            </w:r>
+          </w:p>
+        </w:tc>
+        <w:tc>
+          <w:tcPr>
+            <w:tcW w:type="dxa" w:w="2520"/>
+            <w:shd w:val="clear" w:fill="F1F5F9"/>
+            <w:vAlign w:val="center"/>
+          </w:tcPr>
+          <w:p>
+            <w:pPr>
+              <w:spacing w:after="0"/>
+            </w:pPr>
+            <w:r/>
+            <w:r>
+              <w:rPr>
+                <w:rFonts w:ascii="Aptos" w:hAnsi="Aptos"/>
+                <w:b w:val="0"/>
+                <w:color w:val="1E293B"/>
+                <w:sz w:val="16"/>
+              </w:rPr>
+              <w:t>Controlled reusable artifacts and integrations</w:t>
+            </w:r>
+          </w:p>
+        </w:tc>
+        <w:tc>
+          <w:tcPr>
+            <w:tcW w:type="dxa" w:w="3960"/>
+            <w:shd w:val="clear" w:fill="F1F5F9"/>
+            <w:vAlign w:val="center"/>
+          </w:tcPr>
+          <w:p>
+            <w:pPr>
+              <w:spacing w:after="0"/>
+            </w:pPr>
+            <w:r/>
+            <w:r>
+              <w:rPr>
+                <w:rFonts w:ascii="Aptos" w:hAnsi="Aptos"/>
+                <w:b w:val="0"/>
+                <w:color w:val="1E293B"/>
+                <w:sz w:val="16"/>
+              </w:rPr>
+              <w:t>Git/OCI, mirrors, signed packages, IdP, provider, notifications</w:t>
+            </w:r>
+          </w:p>
+        </w:tc>
+        <w:tc>
+          <w:tcPr>
+            <w:tcW w:type="dxa" w:w="936"/>
+            <w:shd w:val="clear" w:fill="F1F5F9"/>
+            <w:vAlign w:val="center"/>
+          </w:tcPr>
+          <w:p>
+            <w:pPr>
+              <w:spacing w:after="0"/>
+            </w:pPr>
+            <w:r/>
+            <w:r>
+              <w:rPr>
+                <w:rFonts w:ascii="Aptos" w:hAnsi="Aptos"/>
+                <w:b w:val="0"/>
+                <w:color w:val="1E293B"/>
+                <w:sz w:val="16"/>
+              </w:rPr>
+              <w:t>1–6</w:t>
+            </w:r>
+          </w:p>
+        </w:tc>
+      </w:tr>
+    </w:tbl>
+    <w:p>
+      <w:pPr>
+        <w:spacing w:after="0"/>
+      </w:pPr>
+    </w:p>
+    <w:p>
+      <w:pPr>
+        <w:pStyle w:val="Heading2"/>
+      </w:pPr>
+      <w:r>
+        <w:t>Representative user-story catalogue</w:t>
+      </w:r>
+    </w:p>
+    <w:tbl>
+      <w:tblPr>
+        <w:tblStyle w:val="TableGrid"/>
+        <w:tblW w:type="auto" w:w="0"/>
+        <w:jc w:val="center"/>
+        <w:tblLook w:firstColumn="1" w:firstRow="1" w:lastColumn="0" w:lastRow="0" w:noHBand="0" w:noVBand="1" w:val="04A0"/>
+      </w:tblPr>
+      <w:tblGrid>
+        <w:gridCol w:w="3389"/>
+        <w:gridCol w:w="3389"/>
+        <w:gridCol w:w="3389"/>
+      </w:tblGrid>
+      <w:tr>
+        <w:trPr>
+          <w:cantSplit/>
+        </w:trPr>
+        <w:tc>
+          <w:tcPr>
+            <w:tcW w:type="dxa" w:w="1656"/>
+            <w:shd w:val="clear" w:fill="DBEAFE"/>
+            <w:vAlign w:val="center"/>
+          </w:tcPr>
+          <w:p>
+            <w:pPr>
+              <w:spacing w:after="0"/>
+            </w:pPr>
+            <w:r/>
+            <w:r>
+              <w:rPr>
+                <w:rFonts w:ascii="Aptos" w:hAnsi="Aptos"/>
+                <w:b/>
+                <w:color w:val="1E3A8A"/>
+                <w:sz w:val="17"/>
+              </w:rPr>
+              <w:t>ID / epic</w:t>
+            </w:r>
+          </w:p>
+        </w:tc>
+        <w:tc>
+          <w:tcPr>
+            <w:tcW w:type="dxa" w:w="7056"/>
+            <w:shd w:val="clear" w:fill="DBEAFE"/>
+            <w:vAlign w:val="center"/>
+          </w:tcPr>
+          <w:p>
+            <w:pPr>
+              <w:spacing w:after="0"/>
+            </w:pPr>
+            <w:r/>
+            <w:r>
+              <w:rPr>
+                <w:rFonts w:ascii="Aptos" w:hAnsi="Aptos"/>
+                <w:b/>
+                <w:color w:val="1E3A8A"/>
+                <w:sz w:val="17"/>
+              </w:rPr>
+              <w:t>User story</w:t>
+            </w:r>
+          </w:p>
+        </w:tc>
+        <w:tc>
+          <w:tcPr>
+            <w:tcW w:type="dxa" w:w="1080"/>
+            <w:shd w:val="clear" w:fill="DBEAFE"/>
+            <w:vAlign w:val="center"/>
+          </w:tcPr>
+          <w:p>
+            <w:pPr>
+              <w:spacing w:after="0"/>
+            </w:pPr>
+            <w:r/>
+            <w:r>
+              <w:rPr>
+                <w:rFonts w:ascii="Aptos" w:hAnsi="Aptos"/>
+                <w:b/>
+                <w:color w:val="1E3A8A"/>
+                <w:sz w:val="17"/>
+              </w:rPr>
+              <w:t>Phase</w:t>
+            </w:r>
+          </w:p>
+        </w:tc>
+      </w:tr>
+      <w:tr>
+        <w:trPr>
+          <w:cantSplit/>
+        </w:trPr>
+        <w:tc>
+          <w:tcPr>
+            <w:tcW w:type="dxa" w:w="1656"/>
+            <w:vAlign w:val="center"/>
+          </w:tcPr>
+          <w:p>
+            <w:pPr>
+              <w:spacing w:after="0"/>
+            </w:pPr>
+            <w:r/>
+            <w:r>
+              <w:rPr>
+                <w:rFonts w:ascii="Aptos" w:hAnsi="Aptos"/>
+                <w:b w:val="0"/>
+                <w:color w:val="1E293B"/>
+                <w:sz w:val="16"/>
+              </w:rPr>
+              <w:t>US-01 / EP-01</w:t>
+            </w:r>
+          </w:p>
+        </w:tc>
+        <w:tc>
+          <w:tcPr>
+            <w:tcW w:type="dxa" w:w="7056"/>
+            <w:vAlign w:val="center"/>
+          </w:tcPr>
+          <w:p>
+            <w:pPr>
+              <w:spacing w:after="0"/>
+            </w:pPr>
+            <w:r/>
+            <w:r>
+              <w:rPr>
+                <w:rFonts w:ascii="Aptos" w:hAnsi="Aptos"/>
+                <w:b w:val="0"/>
+                <w:color w:val="1E293B"/>
+                <w:sz w:val="16"/>
+              </w:rPr>
+              <w:t>As a developer, I sign in with company identity and see only authorized projects.</w:t>
+            </w:r>
+          </w:p>
+        </w:tc>
+        <w:tc>
+          <w:tcPr>
+            <w:tcW w:type="dxa" w:w="1080"/>
+            <w:vAlign w:val="center"/>
+          </w:tcPr>
+          <w:p>
+            <w:pPr>
+              <w:spacing w:after="0"/>
+            </w:pPr>
+            <w:r/>
+            <w:r>
+              <w:rPr>
+                <w:rFonts w:ascii="Aptos" w:hAnsi="Aptos"/>
+                <w:b w:val="0"/>
+                <w:color w:val="1E293B"/>
+                <w:sz w:val="16"/>
+              </w:rPr>
+              <w:t>1</w:t>
+            </w:r>
+          </w:p>
+        </w:tc>
+      </w:tr>
+      <w:tr>
+        <w:trPr>
+          <w:cantSplit/>
+        </w:trPr>
+        <w:tc>
+          <w:tcPr>
+            <w:tcW w:type="dxa" w:w="1656"/>
+            <w:shd w:val="clear" w:fill="F1F5F9"/>
+            <w:vAlign w:val="center"/>
+          </w:tcPr>
+          <w:p>
+            <w:pPr>
+              <w:spacing w:after="0"/>
+            </w:pPr>
+            <w:r/>
+            <w:r>
+              <w:rPr>
+                <w:rFonts w:ascii="Aptos" w:hAnsi="Aptos"/>
+                <w:b w:val="0"/>
+                <w:color w:val="1E293B"/>
+                <w:sz w:val="16"/>
+              </w:rPr>
+              <w:t>US-03 / EP-01</w:t>
+            </w:r>
+          </w:p>
+        </w:tc>
+        <w:tc>
+          <w:tcPr>
+            <w:tcW w:type="dxa" w:w="7056"/>
+            <w:shd w:val="clear" w:fill="F1F5F9"/>
+            <w:vAlign w:val="center"/>
+          </w:tcPr>
+          <w:p>
+            <w:pPr>
+              <w:spacing w:after="0"/>
+            </w:pPr>
+            <w:r/>
+            <w:r>
+              <w:rPr>
+                <w:rFonts w:ascii="Aptos" w:hAnsi="Aptos"/>
+                <w:b w:val="0"/>
+                <w:color w:val="1E293B"/>
+                <w:sz w:val="16"/>
+              </w:rPr>
+              <w:t>As an administrator, I suspend a user and revoke session, route and AI key within target.</w:t>
+            </w:r>
+          </w:p>
+        </w:tc>
+        <w:tc>
+          <w:tcPr>
+            <w:tcW w:type="dxa" w:w="1080"/>
+            <w:shd w:val="clear" w:fill="F1F5F9"/>
+            <w:vAlign w:val="center"/>
+          </w:tcPr>
+          <w:p>
+            <w:pPr>
+              <w:spacing w:after="0"/>
+            </w:pPr>
+            <w:r/>
+            <w:r>
+              <w:rPr>
+                <w:rFonts w:ascii="Aptos" w:hAnsi="Aptos"/>
+                <w:b w:val="0"/>
+                <w:color w:val="1E293B"/>
+                <w:sz w:val="16"/>
+              </w:rPr>
+              <w:t>1–3</w:t>
+            </w:r>
+          </w:p>
+        </w:tc>
+      </w:tr>
+      <w:tr>
+        <w:trPr>
+          <w:cantSplit/>
+        </w:trPr>
+        <w:tc>
+          <w:tcPr>
+            <w:tcW w:type="dxa" w:w="1656"/>
+            <w:vAlign w:val="center"/>
+          </w:tcPr>
+          <w:p>
+            <w:pPr>
+              <w:spacing w:after="0"/>
+            </w:pPr>
+            <w:r/>
+            <w:r>
+              <w:rPr>
+                <w:rFonts w:ascii="Aptos" w:hAnsi="Aptos"/>
+                <w:b w:val="0"/>
+                <w:color w:val="1E293B"/>
+                <w:sz w:val="16"/>
+              </w:rPr>
+              <w:t>US-05 / EP-02</w:t>
+            </w:r>
+          </w:p>
+        </w:tc>
+        <w:tc>
+          <w:tcPr>
+            <w:tcW w:type="dxa" w:w="7056"/>
+            <w:vAlign w:val="center"/>
+          </w:tcPr>
+          <w:p>
+            <w:pPr>
+              <w:spacing w:after="0"/>
+            </w:pPr>
+            <w:r/>
+            <w:r>
+              <w:rPr>
+                <w:rFonts w:ascii="Aptos" w:hAnsi="Aptos"/>
+                <w:b w:val="0"/>
+                <w:color w:val="1E293B"/>
+                <w:sz w:val="16"/>
+              </w:rPr>
+              <w:t>As a developer, I create a project from an approved golden template without manual setup.</w:t>
+            </w:r>
+          </w:p>
+        </w:tc>
+        <w:tc>
+          <w:tcPr>
+            <w:tcW w:type="dxa" w:w="1080"/>
+            <w:vAlign w:val="center"/>
+          </w:tcPr>
+          <w:p>
+            <w:pPr>
+              <w:spacing w:after="0"/>
+            </w:pPr>
+            <w:r/>
+            <w:r>
+              <w:rPr>
+                <w:rFonts w:ascii="Aptos" w:hAnsi="Aptos"/>
+                <w:b w:val="0"/>
+                <w:color w:val="1E293B"/>
+                <w:sz w:val="16"/>
+              </w:rPr>
+              <w:t>0–1</w:t>
+            </w:r>
+          </w:p>
+        </w:tc>
+      </w:tr>
+      <w:tr>
+        <w:trPr>
+          <w:cantSplit/>
+        </w:trPr>
+        <w:tc>
+          <w:tcPr>
+            <w:tcW w:type="dxa" w:w="1656"/>
+            <w:shd w:val="clear" w:fill="F1F5F9"/>
+            <w:vAlign w:val="center"/>
+          </w:tcPr>
+          <w:p>
+            <w:pPr>
+              <w:spacing w:after="0"/>
+            </w:pPr>
+            <w:r/>
+            <w:r>
+              <w:rPr>
+                <w:rFonts w:ascii="Aptos" w:hAnsi="Aptos"/>
+                <w:b w:val="0"/>
+                <w:color w:val="1E293B"/>
+                <w:sz w:val="16"/>
+              </w:rPr>
+              <w:t>US-08 / EP-02</w:t>
+            </w:r>
+          </w:p>
+        </w:tc>
+        <w:tc>
+          <w:tcPr>
+            <w:tcW w:type="dxa" w:w="7056"/>
+            <w:shd w:val="clear" w:fill="F1F5F9"/>
+            <w:vAlign w:val="center"/>
+          </w:tcPr>
+          <w:p>
+            <w:pPr>
+              <w:spacing w:after="0"/>
+            </w:pPr>
+            <w:r/>
+            <w:r>
+              <w:rPr>
+                <w:rFonts w:ascii="Aptos" w:hAnsi="Aptos"/>
+                <w:b w:val="0"/>
+                <w:color w:val="1E293B"/>
+                <w:sz w:val="16"/>
+              </w:rPr>
+              <w:t>As a project owner, package install/upgrade/remove creates a reviewable branch and evidence.</w:t>
+            </w:r>
+          </w:p>
+        </w:tc>
+        <w:tc>
+          <w:tcPr>
+            <w:tcW w:type="dxa" w:w="1080"/>
+            <w:shd w:val="clear" w:fill="F1F5F9"/>
+            <w:vAlign w:val="center"/>
+          </w:tcPr>
+          <w:p>
+            <w:pPr>
+              <w:spacing w:after="0"/>
+            </w:pPr>
+            <w:r/>
+            <w:r>
+              <w:rPr>
+                <w:rFonts w:ascii="Aptos" w:hAnsi="Aptos"/>
+                <w:b w:val="0"/>
+                <w:color w:val="1E293B"/>
+                <w:sz w:val="16"/>
+              </w:rPr>
+              <w:t>2 / 6</w:t>
+            </w:r>
+          </w:p>
+        </w:tc>
+      </w:tr>
+      <w:tr>
+        <w:trPr>
+          <w:cantSplit/>
+        </w:trPr>
+        <w:tc>
+          <w:tcPr>
+            <w:tcW w:type="dxa" w:w="1656"/>
+            <w:vAlign w:val="center"/>
+          </w:tcPr>
+          <w:p>
+            <w:pPr>
+              <w:spacing w:after="0"/>
+            </w:pPr>
+            <w:r/>
+            <w:r>
+              <w:rPr>
+                <w:rFonts w:ascii="Aptos" w:hAnsi="Aptos"/>
+                <w:b w:val="0"/>
+                <w:color w:val="1E293B"/>
+                <w:sz w:val="16"/>
+              </w:rPr>
+              <w:t>US-09 / EP-03</w:t>
+            </w:r>
+          </w:p>
+        </w:tc>
+        <w:tc>
+          <w:tcPr>
+            <w:tcW w:type="dxa" w:w="7056"/>
+            <w:vAlign w:val="center"/>
+          </w:tcPr>
+          <w:p>
+            <w:pPr>
+              <w:spacing w:after="0"/>
+            </w:pPr>
+            <w:r/>
+            <w:r>
+              <w:rPr>
+                <w:rFonts w:ascii="Aptos" w:hAnsi="Aptos"/>
+                <w:b w:val="0"/>
+                <w:color w:val="1E293B"/>
+                <w:sz w:val="16"/>
+              </w:rPr>
+              <w:t>As a developer, I receive one isolated, persistent workspace per project.</w:t>
+            </w:r>
+          </w:p>
+        </w:tc>
+        <w:tc>
+          <w:tcPr>
+            <w:tcW w:type="dxa" w:w="1080"/>
+            <w:vAlign w:val="center"/>
+          </w:tcPr>
+          <w:p>
+            <w:pPr>
+              <w:spacing w:after="0"/>
+            </w:pPr>
+            <w:r/>
+            <w:r>
+              <w:rPr>
+                <w:rFonts w:ascii="Aptos" w:hAnsi="Aptos"/>
+                <w:b w:val="0"/>
+                <w:color w:val="1E293B"/>
+                <w:sz w:val="16"/>
+              </w:rPr>
+              <w:t>0–1</w:t>
+            </w:r>
+          </w:p>
+        </w:tc>
+      </w:tr>
+      <w:tr>
+        <w:trPr>
+          <w:cantSplit/>
+        </w:trPr>
+        <w:tc>
+          <w:tcPr>
+            <w:tcW w:type="dxa" w:w="1656"/>
+            <w:shd w:val="clear" w:fill="F1F5F9"/>
+            <w:vAlign w:val="center"/>
+          </w:tcPr>
+          <w:p>
+            <w:pPr>
+              <w:spacing w:after="0"/>
+            </w:pPr>
+            <w:r/>
+            <w:r>
+              <w:rPr>
+                <w:rFonts w:ascii="Aptos" w:hAnsi="Aptos"/>
+                <w:b w:val="0"/>
+                <w:color w:val="1E293B"/>
+                <w:sz w:val="16"/>
+              </w:rPr>
+              <w:t>US-11 / EP-03</w:t>
+            </w:r>
+          </w:p>
+        </w:tc>
+        <w:tc>
+          <w:tcPr>
+            <w:tcW w:type="dxa" w:w="7056"/>
+            <w:shd w:val="clear" w:fill="F1F5F9"/>
+            <w:vAlign w:val="center"/>
+          </w:tcPr>
+          <w:p>
+            <w:pPr>
+              <w:spacing w:after="0"/>
+            </w:pPr>
+            <w:r/>
+            <w:r>
+              <w:rPr>
+                <w:rFonts w:ascii="Aptos" w:hAnsi="Aptos"/>
+                <w:b w:val="0"/>
+                <w:color w:val="1E293B"/>
+                <w:sz w:val="16"/>
+              </w:rPr>
+              <w:t>As a developer, I see queued, provisioning, ready, failed and retry states.</w:t>
+            </w:r>
+          </w:p>
+        </w:tc>
+        <w:tc>
+          <w:tcPr>
+            <w:tcW w:type="dxa" w:w="1080"/>
+            <w:shd w:val="clear" w:fill="F1F5F9"/>
+            <w:vAlign w:val="center"/>
+          </w:tcPr>
+          <w:p>
+            <w:pPr>
+              <w:spacing w:after="0"/>
+            </w:pPr>
+            <w:r/>
+            <w:r>
+              <w:rPr>
+                <w:rFonts w:ascii="Aptos" w:hAnsi="Aptos"/>
+                <w:b w:val="0"/>
+                <w:color w:val="1E293B"/>
+                <w:sz w:val="16"/>
+              </w:rPr>
+              <w:t>1–3</w:t>
+            </w:r>
+          </w:p>
+        </w:tc>
+      </w:tr>
+      <w:tr>
+        <w:trPr>
+          <w:cantSplit/>
+        </w:trPr>
+        <w:tc>
+          <w:tcPr>
+            <w:tcW w:type="dxa" w:w="1656"/>
+            <w:vAlign w:val="center"/>
+          </w:tcPr>
+          <w:p>
+            <w:pPr>
+              <w:spacing w:after="0"/>
+            </w:pPr>
+            <w:r/>
+            <w:r>
+              <w:rPr>
+                <w:rFonts w:ascii="Aptos" w:hAnsi="Aptos"/>
+                <w:b w:val="0"/>
+                <w:color w:val="1E293B"/>
+                <w:sz w:val="16"/>
+              </w:rPr>
+              <w:t>US-14 / EP-04</w:t>
+            </w:r>
+          </w:p>
+        </w:tc>
+        <w:tc>
+          <w:tcPr>
+            <w:tcW w:type="dxa" w:w="7056"/>
+            <w:vAlign w:val="center"/>
+          </w:tcPr>
+          <w:p>
+            <w:pPr>
+              <w:spacing w:after="0"/>
+            </w:pPr>
+            <w:r/>
+            <w:r>
+              <w:rPr>
+                <w:rFonts w:ascii="Aptos" w:hAnsi="Aptos"/>
+                <w:b w:val="0"/>
+                <w:color w:val="1E293B"/>
+                <w:sz w:val="16"/>
+              </w:rPr>
+              <w:t>As a developer, Cline streams through an approved model capability alias.</w:t>
+            </w:r>
+          </w:p>
+        </w:tc>
+        <w:tc>
+          <w:tcPr>
+            <w:tcW w:type="dxa" w:w="1080"/>
+            <w:vAlign w:val="center"/>
+          </w:tcPr>
+          <w:p>
+            <w:pPr>
+              <w:spacing w:after="0"/>
+            </w:pPr>
+            <w:r/>
+            <w:r>
+              <w:rPr>
+                <w:rFonts w:ascii="Aptos" w:hAnsi="Aptos"/>
+                <w:b w:val="0"/>
+                <w:color w:val="1E293B"/>
+                <w:sz w:val="16"/>
+              </w:rPr>
+              <w:t>0–1</w:t>
+            </w:r>
+          </w:p>
+        </w:tc>
+      </w:tr>
+      <w:tr>
+        <w:trPr>
+          <w:cantSplit/>
+        </w:trPr>
+        <w:tc>
+          <w:tcPr>
+            <w:tcW w:type="dxa" w:w="1656"/>
+            <w:shd w:val="clear" w:fill="F1F5F9"/>
+            <w:vAlign w:val="center"/>
+          </w:tcPr>
+          <w:p>
+            <w:pPr>
+              <w:spacing w:after="0"/>
+            </w:pPr>
+            <w:r/>
+            <w:r>
+              <w:rPr>
+                <w:rFonts w:ascii="Aptos" w:hAnsi="Aptos"/>
+                <w:b w:val="0"/>
+                <w:color w:val="1E293B"/>
+                <w:sz w:val="16"/>
+              </w:rPr>
+              <w:t>US-16 / EP-04</w:t>
+            </w:r>
+          </w:p>
+        </w:tc>
+        <w:tc>
+          <w:tcPr>
+            <w:tcW w:type="dxa" w:w="7056"/>
+            <w:shd w:val="clear" w:fill="F1F5F9"/>
+            <w:vAlign w:val="center"/>
+          </w:tcPr>
+          <w:p>
+            <w:pPr>
+              <w:spacing w:after="0"/>
+            </w:pPr>
+            <w:r/>
+            <w:r>
+              <w:rPr>
+                <w:rFonts w:ascii="Aptos" w:hAnsi="Aptos"/>
+                <w:b w:val="0"/>
+                <w:color w:val="1E293B"/>
+                <w:sz w:val="16"/>
+              </w:rPr>
+              <w:t>As a privacy reviewer, provider residency/retention terms are enforced by route policy.</w:t>
+            </w:r>
+          </w:p>
+        </w:tc>
+        <w:tc>
+          <w:tcPr>
+            <w:tcW w:type="dxa" w:w="1080"/>
+            <w:shd w:val="clear" w:fill="F1F5F9"/>
+            <w:vAlign w:val="center"/>
+          </w:tcPr>
+          <w:p>
+            <w:pPr>
+              <w:spacing w:after="0"/>
+            </w:pPr>
+            <w:r/>
+            <w:r>
+              <w:rPr>
+                <w:rFonts w:ascii="Aptos" w:hAnsi="Aptos"/>
+                <w:b w:val="0"/>
+                <w:color w:val="1E293B"/>
+                <w:sz w:val="16"/>
+              </w:rPr>
+              <w:t>1–2</w:t>
+            </w:r>
+          </w:p>
+        </w:tc>
+      </w:tr>
+      <w:tr>
+        <w:trPr>
+          <w:cantSplit/>
+        </w:trPr>
+        <w:tc>
+          <w:tcPr>
+            <w:tcW w:type="dxa" w:w="1656"/>
+            <w:vAlign w:val="center"/>
+          </w:tcPr>
+          <w:p>
+            <w:pPr>
+              <w:spacing w:after="0"/>
+            </w:pPr>
+            <w:r/>
+            <w:r>
+              <w:rPr>
+                <w:rFonts w:ascii="Aptos" w:hAnsi="Aptos"/>
+                <w:b w:val="0"/>
+                <w:color w:val="1E293B"/>
+                <w:sz w:val="16"/>
+              </w:rPr>
+              <w:t>US-18 / EP-05</w:t>
+            </w:r>
+          </w:p>
+        </w:tc>
+        <w:tc>
+          <w:tcPr>
+            <w:tcW w:type="dxa" w:w="7056"/>
+            <w:vAlign w:val="center"/>
+          </w:tcPr>
+          <w:p>
+            <w:pPr>
+              <w:spacing w:after="0"/>
+            </w:pPr>
+            <w:r/>
+            <w:r>
+              <w:rPr>
+                <w:rFonts w:ascii="Aptos" w:hAnsi="Aptos"/>
+                <w:b w:val="0"/>
+                <w:color w:val="1E293B"/>
+                <w:sz w:val="16"/>
+              </w:rPr>
+              <w:t>As a developer, I preview the generated frontend, API and database through authenticated routes.</w:t>
+            </w:r>
+          </w:p>
+        </w:tc>
+        <w:tc>
+          <w:tcPr>
+            <w:tcW w:type="dxa" w:w="1080"/>
+            <w:vAlign w:val="center"/>
+          </w:tcPr>
+          <w:p>
+            <w:pPr>
+              <w:spacing w:after="0"/>
+            </w:pPr>
+            <w:r/>
+            <w:r>
+              <w:rPr>
+                <w:rFonts w:ascii="Aptos" w:hAnsi="Aptos"/>
+                <w:b w:val="0"/>
+                <w:color w:val="1E293B"/>
+                <w:sz w:val="16"/>
+              </w:rPr>
+              <w:t>0–1</w:t>
+            </w:r>
+          </w:p>
+        </w:tc>
+      </w:tr>
+      <w:tr>
+        <w:trPr>
+          <w:cantSplit/>
+        </w:trPr>
+        <w:tc>
+          <w:tcPr>
+            <w:tcW w:type="dxa" w:w="1656"/>
+            <w:shd w:val="clear" w:fill="F1F5F9"/>
+            <w:vAlign w:val="center"/>
+          </w:tcPr>
+          <w:p>
+            <w:pPr>
+              <w:spacing w:after="0"/>
+            </w:pPr>
+            <w:r/>
+            <w:r>
+              <w:rPr>
+                <w:rFonts w:ascii="Aptos" w:hAnsi="Aptos"/>
+                <w:b w:val="0"/>
+                <w:color w:val="1E293B"/>
+                <w:sz w:val="16"/>
+              </w:rPr>
+              <w:t>US-21 / EP-05</w:t>
+            </w:r>
+          </w:p>
+        </w:tc>
+        <w:tc>
+          <w:tcPr>
+            <w:tcW w:type="dxa" w:w="7056"/>
+            <w:shd w:val="clear" w:fill="F1F5F9"/>
+            <w:vAlign w:val="center"/>
+          </w:tcPr>
+          <w:p>
+            <w:pPr>
+              <w:spacing w:after="0"/>
+            </w:pPr>
+            <w:r/>
+            <w:r>
+              <w:rPr>
+                <w:rFonts w:ascii="Aptos" w:hAnsi="Aptos"/>
+                <w:b w:val="0"/>
+                <w:color w:val="1E293B"/>
+                <w:sz w:val="16"/>
+              </w:rPr>
+              <w:t>As a project owner, readiness and failure logs exist before a URL is declared usable.</w:t>
+            </w:r>
+          </w:p>
+        </w:tc>
+        <w:tc>
+          <w:tcPr>
+            <w:tcW w:type="dxa" w:w="1080"/>
+            <w:shd w:val="clear" w:fill="F1F5F9"/>
+            <w:vAlign w:val="center"/>
+          </w:tcPr>
+          <w:p>
+            <w:pPr>
+              <w:spacing w:after="0"/>
+            </w:pPr>
+            <w:r/>
+            <w:r>
+              <w:rPr>
+                <w:rFonts w:ascii="Aptos" w:hAnsi="Aptos"/>
+                <w:b w:val="0"/>
+                <w:color w:val="1E293B"/>
+                <w:sz w:val="16"/>
+              </w:rPr>
+              <w:t>1–3</w:t>
+            </w:r>
+          </w:p>
+        </w:tc>
+      </w:tr>
+      <w:tr>
+        <w:trPr>
+          <w:cantSplit/>
+        </w:trPr>
+        <w:tc>
+          <w:tcPr>
+            <w:tcW w:type="dxa" w:w="1656"/>
+            <w:vAlign w:val="center"/>
+          </w:tcPr>
+          <w:p>
+            <w:pPr>
+              <w:spacing w:after="0"/>
+            </w:pPr>
+            <w:r/>
+            <w:r>
+              <w:rPr>
+                <w:rFonts w:ascii="Aptos" w:hAnsi="Aptos"/>
+                <w:b w:val="0"/>
+                <w:color w:val="1E293B"/>
+                <w:sz w:val="16"/>
+              </w:rPr>
+              <w:t>US-22 / EP-06</w:t>
+            </w:r>
+          </w:p>
+        </w:tc>
+        <w:tc>
+          <w:tcPr>
+            <w:tcW w:type="dxa" w:w="7056"/>
+            <w:vAlign w:val="center"/>
+          </w:tcPr>
+          <w:p>
+            <w:pPr>
+              <w:spacing w:after="0"/>
+            </w:pPr>
+            <w:r/>
+            <w:r>
+              <w:rPr>
+                <w:rFonts w:ascii="Aptos" w:hAnsi="Aptos"/>
+                <w:b w:val="0"/>
+                <w:color w:val="1E293B"/>
+                <w:sz w:val="16"/>
+              </w:rPr>
+              <w:t>As a developer, agent/package changes remain on a branch with a diff and human merge authority.</w:t>
+            </w:r>
+          </w:p>
+        </w:tc>
+        <w:tc>
+          <w:tcPr>
+            <w:tcW w:type="dxa" w:w="1080"/>
+            <w:vAlign w:val="center"/>
+          </w:tcPr>
+          <w:p>
+            <w:pPr>
+              <w:spacing w:after="0"/>
+            </w:pPr>
+            <w:r/>
+            <w:r>
+              <w:rPr>
+                <w:rFonts w:ascii="Aptos" w:hAnsi="Aptos"/>
+                <w:b w:val="0"/>
+                <w:color w:val="1E293B"/>
+                <w:sz w:val="16"/>
+              </w:rPr>
+              <w:t>1–4</w:t>
+            </w:r>
+          </w:p>
+        </w:tc>
+      </w:tr>
+      <w:tr>
+        <w:trPr>
+          <w:cantSplit/>
+        </w:trPr>
+        <w:tc>
+          <w:tcPr>
+            <w:tcW w:type="dxa" w:w="1656"/>
+            <w:shd w:val="clear" w:fill="F1F5F9"/>
+            <w:vAlign w:val="center"/>
+          </w:tcPr>
+          <w:p>
+            <w:pPr>
+              <w:spacing w:after="0"/>
+            </w:pPr>
+            <w:r/>
+            <w:r>
+              <w:rPr>
+                <w:rFonts w:ascii="Aptos" w:hAnsi="Aptos"/>
+                <w:b w:val="0"/>
+                <w:color w:val="1E293B"/>
+                <w:sz w:val="16"/>
+              </w:rPr>
+              <w:t>US-24 / EP-06</w:t>
+            </w:r>
+          </w:p>
+        </w:tc>
+        <w:tc>
+          <w:tcPr>
+            <w:tcW w:type="dxa" w:w="7056"/>
+            <w:shd w:val="clear" w:fill="F1F5F9"/>
+            <w:vAlign w:val="center"/>
+          </w:tcPr>
+          <w:p>
+            <w:pPr>
+              <w:spacing w:after="0"/>
+            </w:pPr>
+            <w:r/>
+            <w:r>
+              <w:rPr>
+                <w:rFonts w:ascii="Aptos" w:hAnsi="Aptos"/>
+                <w:b w:val="0"/>
+                <w:color w:val="1E293B"/>
+                <w:sz w:val="16"/>
+              </w:rPr>
+              <w:t>As an IT owner, I receive a signed package with source, locks, tests, scans, data and gaps.</w:t>
+            </w:r>
+          </w:p>
+        </w:tc>
+        <w:tc>
+          <w:tcPr>
+            <w:tcW w:type="dxa" w:w="1080"/>
+            <w:shd w:val="clear" w:fill="F1F5F9"/>
+            <w:vAlign w:val="center"/>
+          </w:tcPr>
+          <w:p>
+            <w:pPr>
+              <w:spacing w:after="0"/>
+            </w:pPr>
+            <w:r/>
+            <w:r>
+              <w:rPr>
+                <w:rFonts w:ascii="Aptos" w:hAnsi="Aptos"/>
+                <w:b w:val="0"/>
+                <w:color w:val="1E293B"/>
+                <w:sz w:val="16"/>
+              </w:rPr>
+              <w:t>1–3</w:t>
+            </w:r>
+          </w:p>
+        </w:tc>
+      </w:tr>
+      <w:tr>
+        <w:trPr>
+          <w:cantSplit/>
+        </w:trPr>
+        <w:tc>
+          <w:tcPr>
+            <w:tcW w:type="dxa" w:w="1656"/>
+            <w:vAlign w:val="center"/>
+          </w:tcPr>
+          <w:p>
+            <w:pPr>
+              <w:spacing w:after="0"/>
+            </w:pPr>
+            <w:r/>
+            <w:r>
+              <w:rPr>
+                <w:rFonts w:ascii="Aptos" w:hAnsi="Aptos"/>
+                <w:b w:val="0"/>
+                <w:color w:val="1E293B"/>
+                <w:sz w:val="16"/>
+              </w:rPr>
+              <w:t>US-26 / EP-07</w:t>
+            </w:r>
+          </w:p>
+        </w:tc>
+        <w:tc>
+          <w:tcPr>
+            <w:tcW w:type="dxa" w:w="7056"/>
+            <w:vAlign w:val="center"/>
+          </w:tcPr>
+          <w:p>
+            <w:pPr>
+              <w:spacing w:after="0"/>
+            </w:pPr>
+            <w:r/>
+            <w:r>
+              <w:rPr>
+                <w:rFonts w:ascii="Aptos" w:hAnsi="Aptos"/>
+                <w:b w:val="0"/>
+                <w:color w:val="1E293B"/>
+                <w:sz w:val="16"/>
+              </w:rPr>
+              <w:t>As an administrator, I search/paginate users, projects, policy and audit at scale.</w:t>
+            </w:r>
+          </w:p>
+        </w:tc>
+        <w:tc>
+          <w:tcPr>
+            <w:tcW w:type="dxa" w:w="1080"/>
+            <w:vAlign w:val="center"/>
+          </w:tcPr>
+          <w:p>
+            <w:pPr>
+              <w:spacing w:after="0"/>
+            </w:pPr>
+            <w:r/>
+            <w:r>
+              <w:rPr>
+                <w:rFonts w:ascii="Aptos" w:hAnsi="Aptos"/>
+                <w:b w:val="0"/>
+                <w:color w:val="1E293B"/>
+                <w:sz w:val="16"/>
+              </w:rPr>
+              <w:t>1–2</w:t>
+            </w:r>
+          </w:p>
+        </w:tc>
+      </w:tr>
+      <w:tr>
+        <w:trPr>
+          <w:cantSplit/>
+        </w:trPr>
+        <w:tc>
+          <w:tcPr>
+            <w:tcW w:type="dxa" w:w="1656"/>
+            <w:shd w:val="clear" w:fill="F1F5F9"/>
+            <w:vAlign w:val="center"/>
+          </w:tcPr>
+          <w:p>
+            <w:pPr>
+              <w:spacing w:after="0"/>
+            </w:pPr>
+            <w:r/>
+            <w:r>
+              <w:rPr>
+                <w:rFonts w:ascii="Aptos" w:hAnsi="Aptos"/>
+                <w:b w:val="0"/>
+                <w:color w:val="1E293B"/>
+                <w:sz w:val="16"/>
+              </w:rPr>
+              <w:t>US-29 / EP-07</w:t>
+            </w:r>
+          </w:p>
+        </w:tc>
+        <w:tc>
+          <w:tcPr>
+            <w:tcW w:type="dxa" w:w="7056"/>
+            <w:shd w:val="clear" w:fill="F1F5F9"/>
+            <w:vAlign w:val="center"/>
+          </w:tcPr>
+          <w:p>
+            <w:pPr>
+              <w:spacing w:after="0"/>
+            </w:pPr>
+            <w:r/>
+            <w:r>
+              <w:rPr>
+                <w:rFonts w:ascii="Aptos" w:hAnsi="Aptos"/>
+                <w:b w:val="0"/>
+                <w:color w:val="1E293B"/>
+                <w:sz w:val="16"/>
+              </w:rPr>
+              <w:t>As a sponsor, I see transparent restrictions, adoption, failure and support evidence.</w:t>
+            </w:r>
+          </w:p>
+        </w:tc>
+        <w:tc>
+          <w:tcPr>
+            <w:tcW w:type="dxa" w:w="1080"/>
+            <w:shd w:val="clear" w:fill="F1F5F9"/>
+            <w:vAlign w:val="center"/>
+          </w:tcPr>
+          <w:p>
+            <w:pPr>
+              <w:spacing w:after="0"/>
+            </w:pPr>
+            <w:r/>
+            <w:r>
+              <w:rPr>
+                <w:rFonts w:ascii="Aptos" w:hAnsi="Aptos"/>
+                <w:b w:val="0"/>
+                <w:color w:val="1E293B"/>
+                <w:sz w:val="16"/>
+              </w:rPr>
+              <w:t>2–3</w:t>
+            </w:r>
+          </w:p>
+        </w:tc>
+      </w:tr>
+      <w:tr>
+        <w:trPr>
+          <w:cantSplit/>
+        </w:trPr>
+        <w:tc>
+          <w:tcPr>
+            <w:tcW w:type="dxa" w:w="1656"/>
+            <w:vAlign w:val="center"/>
+          </w:tcPr>
+          <w:p>
+            <w:pPr>
+              <w:spacing w:after="0"/>
+            </w:pPr>
+            <w:r/>
+            <w:r>
+              <w:rPr>
+                <w:rFonts w:ascii="Aptos" w:hAnsi="Aptos"/>
+                <w:b w:val="0"/>
+                <w:color w:val="1E293B"/>
+                <w:sz w:val="16"/>
+              </w:rPr>
+              <w:t>US-30 / EP-08</w:t>
+            </w:r>
+          </w:p>
+        </w:tc>
+        <w:tc>
+          <w:tcPr>
+            <w:tcW w:type="dxa" w:w="7056"/>
+            <w:vAlign w:val="center"/>
+          </w:tcPr>
+          <w:p>
+            <w:pPr>
+              <w:spacing w:after="0"/>
+            </w:pPr>
+            <w:r/>
+            <w:r>
+              <w:rPr>
+                <w:rFonts w:ascii="Aptos" w:hAnsi="Aptos"/>
+                <w:b w:val="0"/>
+                <w:color w:val="1E293B"/>
+                <w:sz w:val="16"/>
+              </w:rPr>
+              <w:t>As a developer, an agent task continues or fails recoverably after the browser closes.</w:t>
+            </w:r>
+          </w:p>
+        </w:tc>
+        <w:tc>
+          <w:tcPr>
+            <w:tcW w:type="dxa" w:w="1080"/>
+            <w:vAlign w:val="center"/>
+          </w:tcPr>
+          <w:p>
+            <w:pPr>
+              <w:spacing w:after="0"/>
+            </w:pPr>
+            <w:r/>
+            <w:r>
+              <w:rPr>
+                <w:rFonts w:ascii="Aptos" w:hAnsi="Aptos"/>
+                <w:b w:val="0"/>
+                <w:color w:val="1E293B"/>
+                <w:sz w:val="16"/>
+              </w:rPr>
+              <w:t>4</w:t>
+            </w:r>
+          </w:p>
+        </w:tc>
+      </w:tr>
+      <w:tr>
+        <w:trPr>
+          <w:cantSplit/>
+        </w:trPr>
+        <w:tc>
+          <w:tcPr>
+            <w:tcW w:type="dxa" w:w="1656"/>
+            <w:shd w:val="clear" w:fill="F1F5F9"/>
+            <w:vAlign w:val="center"/>
+          </w:tcPr>
+          <w:p>
+            <w:pPr>
+              <w:spacing w:after="0"/>
+            </w:pPr>
+            <w:r/>
+            <w:r>
+              <w:rPr>
+                <w:rFonts w:ascii="Aptos" w:hAnsi="Aptos"/>
+                <w:b w:val="0"/>
+                <w:color w:val="1E293B"/>
+                <w:sz w:val="16"/>
+              </w:rPr>
+              <w:t>US-33 / EP-08</w:t>
+            </w:r>
+          </w:p>
+        </w:tc>
+        <w:tc>
+          <w:tcPr>
+            <w:tcW w:type="dxa" w:w="7056"/>
+            <w:shd w:val="clear" w:fill="F1F5F9"/>
+            <w:vAlign w:val="center"/>
+          </w:tcPr>
+          <w:p>
+            <w:pPr>
+              <w:spacing w:after="0"/>
+            </w:pPr>
+            <w:r/>
+            <w:r>
+              <w:rPr>
+                <w:rFonts w:ascii="Aptos" w:hAnsi="Aptos"/>
+                <w:b w:val="0"/>
+                <w:color w:val="1E293B"/>
+                <w:sz w:val="16"/>
+              </w:rPr>
+              <w:t>As a mobile user, I review timeline, diff, tests, preview, approvals and notifications.</w:t>
+            </w:r>
+          </w:p>
+        </w:tc>
+        <w:tc>
+          <w:tcPr>
+            <w:tcW w:type="dxa" w:w="1080"/>
+            <w:shd w:val="clear" w:fill="F1F5F9"/>
+            <w:vAlign w:val="center"/>
+          </w:tcPr>
+          <w:p>
+            <w:pPr>
+              <w:spacing w:after="0"/>
+            </w:pPr>
+            <w:r/>
+            <w:r>
+              <w:rPr>
+                <w:rFonts w:ascii="Aptos" w:hAnsi="Aptos"/>
+                <w:b w:val="0"/>
+                <w:color w:val="1E293B"/>
+                <w:sz w:val="16"/>
+              </w:rPr>
+              <w:t>5</w:t>
+            </w:r>
+          </w:p>
+        </w:tc>
+      </w:tr>
+      <w:tr>
+        <w:trPr>
+          <w:cantSplit/>
+        </w:trPr>
+        <w:tc>
+          <w:tcPr>
+            <w:tcW w:type="dxa" w:w="1656"/>
+            <w:vAlign w:val="center"/>
+          </w:tcPr>
+          <w:p>
+            <w:pPr>
+              <w:spacing w:after="0"/>
+            </w:pPr>
+            <w:r/>
+            <w:r>
+              <w:rPr>
+                <w:rFonts w:ascii="Aptos" w:hAnsi="Aptos"/>
+                <w:b w:val="0"/>
+                <w:color w:val="1E293B"/>
+                <w:sz w:val="16"/>
+              </w:rPr>
+              <w:t>US-34 / EP-09</w:t>
+            </w:r>
+          </w:p>
+        </w:tc>
+        <w:tc>
+          <w:tcPr>
+            <w:tcW w:type="dxa" w:w="7056"/>
+            <w:vAlign w:val="center"/>
+          </w:tcPr>
+          <w:p>
+            <w:pPr>
+              <w:spacing w:after="0"/>
+            </w:pPr>
+            <w:r/>
+            <w:r>
+              <w:rPr>
+                <w:rFonts w:ascii="Aptos" w:hAnsi="Aptos"/>
+                <w:b w:val="0"/>
+                <w:color w:val="1E293B"/>
+                <w:sz w:val="16"/>
+              </w:rPr>
+              <w:t>As a developer, I can log in and see queue position/ETA when workspace capacity is full.</w:t>
+            </w:r>
+          </w:p>
+        </w:tc>
+        <w:tc>
+          <w:tcPr>
+            <w:tcW w:type="dxa" w:w="1080"/>
+            <w:vAlign w:val="center"/>
+          </w:tcPr>
+          <w:p>
+            <w:pPr>
+              <w:spacing w:after="0"/>
+            </w:pPr>
+            <w:r/>
+            <w:r>
+              <w:rPr>
+                <w:rFonts w:ascii="Aptos" w:hAnsi="Aptos"/>
+                <w:b w:val="0"/>
+                <w:color w:val="1E293B"/>
+                <w:sz w:val="16"/>
+              </w:rPr>
+              <w:t>3</w:t>
+            </w:r>
+          </w:p>
+        </w:tc>
+      </w:tr>
+      <w:tr>
+        <w:trPr>
+          <w:cantSplit/>
+        </w:trPr>
+        <w:tc>
+          <w:tcPr>
+            <w:tcW w:type="dxa" w:w="1656"/>
+            <w:shd w:val="clear" w:fill="F1F5F9"/>
+            <w:vAlign w:val="center"/>
+          </w:tcPr>
+          <w:p>
+            <w:pPr>
+              <w:spacing w:after="0"/>
+            </w:pPr>
+            <w:r/>
+            <w:r>
+              <w:rPr>
+                <w:rFonts w:ascii="Aptos" w:hAnsi="Aptos"/>
+                <w:b w:val="0"/>
+                <w:color w:val="1E293B"/>
+                <w:sz w:val="16"/>
+              </w:rPr>
+              <w:t>US-36 / EP-09</w:t>
+            </w:r>
+          </w:p>
+        </w:tc>
+        <w:tc>
+          <w:tcPr>
+            <w:tcW w:type="dxa" w:w="7056"/>
+            <w:shd w:val="clear" w:fill="F1F5F9"/>
+            <w:vAlign w:val="center"/>
+          </w:tcPr>
+          <w:p>
+            <w:pPr>
+              <w:spacing w:after="0"/>
+            </w:pPr>
+            <w:r/>
+            <w:r>
+              <w:rPr>
+                <w:rFonts w:ascii="Aptos" w:hAnsi="Aptos"/>
+                <w:b w:val="0"/>
+                <w:color w:val="1E293B"/>
+                <w:sz w:val="16"/>
+              </w:rPr>
+              <w:t>As an operator, I execute backup/restore and failover runbooks with measured RPO/RTO.</w:t>
+            </w:r>
+          </w:p>
+        </w:tc>
+        <w:tc>
+          <w:tcPr>
+            <w:tcW w:type="dxa" w:w="1080"/>
+            <w:shd w:val="clear" w:fill="F1F5F9"/>
+            <w:vAlign w:val="center"/>
+          </w:tcPr>
+          <w:p>
+            <w:pPr>
+              <w:spacing w:after="0"/>
+            </w:pPr>
+            <w:r/>
+            <w:r>
+              <w:rPr>
+                <w:rFonts w:ascii="Aptos" w:hAnsi="Aptos"/>
+                <w:b w:val="0"/>
+                <w:color w:val="1E293B"/>
+                <w:sz w:val="16"/>
+              </w:rPr>
+              <w:t>2–6</w:t>
+            </w:r>
+          </w:p>
+        </w:tc>
+      </w:tr>
+      <w:tr>
+        <w:trPr>
+          <w:cantSplit/>
+        </w:trPr>
+        <w:tc>
+          <w:tcPr>
+            <w:tcW w:type="dxa" w:w="1656"/>
+            <w:vAlign w:val="center"/>
+          </w:tcPr>
+          <w:p>
+            <w:pPr>
+              <w:spacing w:after="0"/>
+            </w:pPr>
+            <w:r/>
+            <w:r>
+              <w:rPr>
+                <w:rFonts w:ascii="Aptos" w:hAnsi="Aptos"/>
+                <w:b w:val="0"/>
+                <w:color w:val="1E293B"/>
+                <w:sz w:val="16"/>
+              </w:rPr>
+              <w:t>US-38 / EP-10</w:t>
+            </w:r>
+          </w:p>
+        </w:tc>
+        <w:tc>
+          <w:tcPr>
+            <w:tcW w:type="dxa" w:w="7056"/>
+            <w:vAlign w:val="center"/>
+          </w:tcPr>
+          <w:p>
+            <w:pPr>
+              <w:spacing w:after="0"/>
+            </w:pPr>
+            <w:r/>
+            <w:r>
+              <w:rPr>
+                <w:rFonts w:ascii="Aptos" w:hAnsi="Aptos"/>
+                <w:b w:val="0"/>
+                <w:color w:val="1E293B"/>
+                <w:sz w:val="16"/>
+              </w:rPr>
+              <w:t>As an operator, I pin and cache images/packages to make startup reproducible.</w:t>
+            </w:r>
+          </w:p>
+        </w:tc>
+        <w:tc>
+          <w:tcPr>
+            <w:tcW w:type="dxa" w:w="1080"/>
+            <w:vAlign w:val="center"/>
+          </w:tcPr>
+          <w:p>
+            <w:pPr>
+              <w:spacing w:after="0"/>
+            </w:pPr>
+            <w:r/>
+            <w:r>
+              <w:rPr>
+                <w:rFonts w:ascii="Aptos" w:hAnsi="Aptos"/>
+                <w:b w:val="0"/>
+                <w:color w:val="1E293B"/>
+                <w:sz w:val="16"/>
+              </w:rPr>
+              <w:t>1–3</w:t>
+            </w:r>
+          </w:p>
+        </w:tc>
+      </w:tr>
+      <w:tr>
+        <w:trPr>
+          <w:cantSplit/>
+        </w:trPr>
+        <w:tc>
+          <w:tcPr>
+            <w:tcW w:type="dxa" w:w="1656"/>
+            <w:shd w:val="clear" w:fill="F1F5F9"/>
+            <w:vAlign w:val="center"/>
+          </w:tcPr>
+          <w:p>
+            <w:pPr>
+              <w:spacing w:after="0"/>
+            </w:pPr>
+            <w:r/>
+            <w:r>
+              <w:rPr>
+                <w:rFonts w:ascii="Aptos" w:hAnsi="Aptos"/>
+                <w:b w:val="0"/>
+                <w:color w:val="1E293B"/>
+                <w:sz w:val="16"/>
+              </w:rPr>
+              <w:t>US-40 / EP-10</w:t>
+            </w:r>
+          </w:p>
+        </w:tc>
+        <w:tc>
+          <w:tcPr>
+            <w:tcW w:type="dxa" w:w="7056"/>
+            <w:shd w:val="clear" w:fill="F1F5F9"/>
+            <w:vAlign w:val="center"/>
+          </w:tcPr>
+          <w:p>
+            <w:pPr>
+              <w:spacing w:after="0"/>
+            </w:pPr>
+            <w:r/>
+            <w:r>
+              <w:rPr>
+                <w:rFonts w:ascii="Aptos" w:hAnsi="Aptos"/>
+                <w:b w:val="0"/>
+                <w:color w:val="1E293B"/>
+                <w:sz w:val="16"/>
+              </w:rPr>
+              <w:t>As a developer, I receive approved queue-ready and review-ready notifications.</w:t>
+            </w:r>
+          </w:p>
+        </w:tc>
+        <w:tc>
+          <w:tcPr>
+            <w:tcW w:type="dxa" w:w="1080"/>
+            <w:shd w:val="clear" w:fill="F1F5F9"/>
+            <w:vAlign w:val="center"/>
+          </w:tcPr>
+          <w:p>
+            <w:pPr>
+              <w:spacing w:after="0"/>
+            </w:pPr>
+            <w:r/>
+            <w:r>
+              <w:rPr>
+                <w:rFonts w:ascii="Aptos" w:hAnsi="Aptos"/>
+                <w:b w:val="0"/>
+                <w:color w:val="1E293B"/>
+                <w:sz w:val="16"/>
+              </w:rPr>
+              <w:t>4–5</w:t>
+            </w:r>
+          </w:p>
+        </w:tc>
+      </w:tr>
+    </w:tbl>
+    <w:p>
+      <w:pPr>
+        <w:spacing w:after="0"/>
+      </w:pPr>
+    </w:p>
+    <w:p>
+      <w:pPr>
+        <w:pStyle w:val="SmallNote"/>
+      </w:pPr>
+      <w:r>
+        <w:t>The canonical functional-scope Markdown contains all 40 user stories, epic-specific acceptance outcomes and traceability links.</w:t>
+      </w:r>
+    </w:p>
+    <w:p>
+      <w:pPr>
+        <w:pStyle w:val="Heading2"/>
+      </w:pPr>
+      <w:r>
+        <w:t>Core use-case catalogue</w:t>
+      </w:r>
+    </w:p>
+    <w:tbl>
+      <w:tblPr>
+        <w:tblStyle w:val="TableGrid"/>
+        <w:tblW w:type="auto" w:w="0"/>
+        <w:jc w:val="center"/>
+        <w:tblLook w:firstColumn="1" w:firstRow="1" w:lastColumn="0" w:lastRow="0" w:noHBand="0" w:noVBand="1" w:val="04A0"/>
+      </w:tblPr>
+      <w:tblGrid>
+        <w:gridCol w:w="3389"/>
+        <w:gridCol w:w="3389"/>
+        <w:gridCol w:w="3389"/>
+      </w:tblGrid>
+      <w:tr>
+        <w:trPr>
+          <w:cantSplit/>
+        </w:trPr>
+        <w:tc>
+          <w:tcPr>
+            <w:tcW w:type="dxa" w:w="2088"/>
+            <w:shd w:val="clear" w:fill="DBEAFE"/>
+            <w:vAlign w:val="center"/>
+          </w:tcPr>
+          <w:p>
+            <w:pPr>
+              <w:spacing w:after="0"/>
+            </w:pPr>
+            <w:r/>
+            <w:r>
+              <w:rPr>
+                <w:rFonts w:ascii="Aptos" w:hAnsi="Aptos"/>
+                <w:b/>
+                <w:color w:val="1E3A8A"/>
+                <w:sz w:val="17"/>
+              </w:rPr>
+              <w:t>Use case / actor</w:t>
+            </w:r>
+          </w:p>
+        </w:tc>
+        <w:tc>
+          <w:tcPr>
+            <w:tcW w:type="dxa" w:w="4320"/>
+            <w:shd w:val="clear" w:fill="DBEAFE"/>
+            <w:vAlign w:val="center"/>
+          </w:tcPr>
+          <w:p>
+            <w:pPr>
+              <w:spacing w:after="0"/>
+            </w:pPr>
+            <w:r/>
+            <w:r>
+              <w:rPr>
+                <w:rFonts w:ascii="Aptos" w:hAnsi="Aptos"/>
+                <w:b/>
+                <w:color w:val="1E3A8A"/>
+                <w:sz w:val="17"/>
+              </w:rPr>
+              <w:t>Main journey</w:t>
+            </w:r>
+          </w:p>
+        </w:tc>
+        <w:tc>
+          <w:tcPr>
+            <w:tcW w:type="dxa" w:w="3384"/>
+            <w:shd w:val="clear" w:fill="DBEAFE"/>
+            <w:vAlign w:val="center"/>
+          </w:tcPr>
+          <w:p>
+            <w:pPr>
+              <w:spacing w:after="0"/>
+            </w:pPr>
+            <w:r/>
+            <w:r>
+              <w:rPr>
+                <w:rFonts w:ascii="Aptos" w:hAnsi="Aptos"/>
+                <w:b/>
+                <w:color w:val="1E3A8A"/>
+                <w:sz w:val="17"/>
+              </w:rPr>
+              <w:t>Alternate / failure / outcome</w:t>
+            </w:r>
+          </w:p>
+        </w:tc>
+      </w:tr>
+      <w:tr>
+        <w:trPr>
+          <w:cantSplit/>
+        </w:trPr>
+        <w:tc>
+          <w:tcPr>
+            <w:tcW w:type="dxa" w:w="2088"/>
+            <w:vAlign w:val="center"/>
+          </w:tcPr>
+          <w:p>
+            <w:pPr>
+              <w:spacing w:after="0"/>
+            </w:pPr>
+            <w:r/>
+            <w:r>
+              <w:rPr>
+                <w:rFonts w:ascii="Aptos" w:hAnsi="Aptos"/>
+                <w:b w:val="0"/>
+                <w:color w:val="1E293B"/>
+                <w:sz w:val="16"/>
+              </w:rPr>
+              <w:t>UC-01 Sign in and My Projects / Developer</w:t>
+            </w:r>
+          </w:p>
+        </w:tc>
+        <w:tc>
+          <w:tcPr>
+            <w:tcW w:type="dxa" w:w="4320"/>
+            <w:vAlign w:val="center"/>
+          </w:tcPr>
+          <w:p>
+            <w:pPr>
+              <w:spacing w:after="0"/>
+            </w:pPr>
+            <w:r/>
+            <w:r>
+              <w:rPr>
+                <w:rFonts w:ascii="Aptos" w:hAnsi="Aptos"/>
+                <w:b w:val="0"/>
+                <w:color w:val="1E293B"/>
+                <w:sz w:val="16"/>
+              </w:rPr>
+              <w:t>SSO → bounded session → owner-scoped project list/actions</w:t>
+            </w:r>
+          </w:p>
+        </w:tc>
+        <w:tc>
+          <w:tcPr>
+            <w:tcW w:type="dxa" w:w="3384"/>
+            <w:vAlign w:val="center"/>
+          </w:tcPr>
+          <w:p>
+            <w:pPr>
+              <w:spacing w:after="0"/>
+            </w:pPr>
+            <w:r/>
+            <w:r>
+              <w:rPr>
+                <w:rFonts w:ascii="Aptos" w:hAnsi="Aptos"/>
+                <w:b w:val="0"/>
+                <w:color w:val="1E293B"/>
+                <w:sz w:val="16"/>
+              </w:rPr>
+              <w:t>Empty state or safe IdP/session error; ownership and revoke evidence.</w:t>
+            </w:r>
+          </w:p>
+        </w:tc>
+      </w:tr>
+      <w:tr>
+        <w:trPr>
+          <w:cantSplit/>
+        </w:trPr>
+        <w:tc>
+          <w:tcPr>
+            <w:tcW w:type="dxa" w:w="2088"/>
+            <w:shd w:val="clear" w:fill="F1F5F9"/>
+            <w:vAlign w:val="center"/>
+          </w:tcPr>
+          <w:p>
+            <w:pPr>
+              <w:spacing w:after="0"/>
+            </w:pPr>
+            <w:r/>
+            <w:r>
+              <w:rPr>
+                <w:rFonts w:ascii="Aptos" w:hAnsi="Aptos"/>
+                <w:b w:val="0"/>
+                <w:color w:val="1E293B"/>
+                <w:sz w:val="16"/>
+              </w:rPr>
+              <w:t>UC-02 Create project / Developer</w:t>
+            </w:r>
+          </w:p>
+        </w:tc>
+        <w:tc>
+          <w:tcPr>
+            <w:tcW w:type="dxa" w:w="4320"/>
+            <w:shd w:val="clear" w:fill="F1F5F9"/>
+            <w:vAlign w:val="center"/>
+          </w:tcPr>
+          <w:p>
+            <w:pPr>
+              <w:spacing w:after="0"/>
+            </w:pPr>
+            <w:r/>
+            <w:r>
+              <w:rPr>
+                <w:rFonts w:ascii="Aptos" w:hAnsi="Aptos"/>
+                <w:b w:val="0"/>
+                <w:color w:val="1E293B"/>
+                <w:sz w:val="16"/>
+              </w:rPr>
+              <w:t>Select template/packages/profile → validate → idempotent create → provision</w:t>
+            </w:r>
+          </w:p>
+        </w:tc>
+        <w:tc>
+          <w:tcPr>
+            <w:tcW w:type="dxa" w:w="3384"/>
+            <w:shd w:val="clear" w:fill="F1F5F9"/>
+            <w:vAlign w:val="center"/>
+          </w:tcPr>
+          <w:p>
+            <w:pPr>
+              <w:spacing w:after="0"/>
+            </w:pPr>
+            <w:r/>
+            <w:r>
+              <w:rPr>
+                <w:rFonts w:ascii="Aptos" w:hAnsi="Aptos"/>
+                <w:b w:val="0"/>
+                <w:color w:val="1E293B"/>
+                <w:sz w:val="16"/>
+              </w:rPr>
+              <w:t>Retry returns original; incompatible/quota failure is actionable and non-duplicating.</w:t>
+            </w:r>
+          </w:p>
+        </w:tc>
+      </w:tr>
+      <w:tr>
+        <w:trPr>
+          <w:cantSplit/>
+        </w:trPr>
+        <w:tc>
+          <w:tcPr>
+            <w:tcW w:type="dxa" w:w="2088"/>
+            <w:vAlign w:val="center"/>
+          </w:tcPr>
+          <w:p>
+            <w:pPr>
+              <w:spacing w:after="0"/>
+            </w:pPr>
+            <w:r/>
+            <w:r>
+              <w:rPr>
+                <w:rFonts w:ascii="Aptos" w:hAnsi="Aptos"/>
+                <w:b w:val="0"/>
+                <w:color w:val="1E293B"/>
+                <w:sz w:val="16"/>
+              </w:rPr>
+              <w:t>UC-03 Start/continue workspace / Developer</w:t>
+            </w:r>
+          </w:p>
+        </w:tc>
+        <w:tc>
+          <w:tcPr>
+            <w:tcW w:type="dxa" w:w="4320"/>
+            <w:vAlign w:val="center"/>
+          </w:tcPr>
+          <w:p>
+            <w:pPr>
+              <w:spacing w:after="0"/>
+            </w:pPr>
+            <w:r/>
+            <w:r>
+              <w:rPr>
+                <w:rFonts w:ascii="Aptos" w:hAnsi="Aptos"/>
+                <w:b w:val="0"/>
+                <w:color w:val="1E293B"/>
+                <w:sz w:val="16"/>
+              </w:rPr>
+              <w:t>Admission → Coder → namespace/PVC → IDE ready → authenticated route</w:t>
+            </w:r>
+          </w:p>
+        </w:tc>
+        <w:tc>
+          <w:tcPr>
+            <w:tcW w:type="dxa" w:w="3384"/>
+            <w:vAlign w:val="center"/>
+          </w:tcPr>
+          <w:p>
+            <w:pPr>
+              <w:spacing w:after="0"/>
+            </w:pPr>
+            <w:r/>
+            <w:r>
+              <w:rPr>
+                <w:rFonts w:ascii="Aptos" w:hAnsi="Aptos"/>
+                <w:b w:val="0"/>
+                <w:color w:val="1E293B"/>
+                <w:sz w:val="16"/>
+              </w:rPr>
+              <w:t>Capacity queue with ETA; image/PVC failure preserves source and rescue path.</w:t>
+            </w:r>
+          </w:p>
+        </w:tc>
+      </w:tr>
+      <w:tr>
+        <w:trPr>
+          <w:cantSplit/>
+        </w:trPr>
+        <w:tc>
+          <w:tcPr>
+            <w:tcW w:type="dxa" w:w="2088"/>
+            <w:shd w:val="clear" w:fill="F1F5F9"/>
+            <w:vAlign w:val="center"/>
+          </w:tcPr>
+          <w:p>
+            <w:pPr>
+              <w:spacing w:after="0"/>
+            </w:pPr>
+            <w:r/>
+            <w:r>
+              <w:rPr>
+                <w:rFonts w:ascii="Aptos" w:hAnsi="Aptos"/>
+                <w:b w:val="0"/>
+                <w:color w:val="1E293B"/>
+                <w:sz w:val="16"/>
+              </w:rPr>
+              <w:t>UC-04 AI coding / Developer</w:t>
+            </w:r>
+          </w:p>
+        </w:tc>
+        <w:tc>
+          <w:tcPr>
+            <w:tcW w:type="dxa" w:w="4320"/>
+            <w:shd w:val="clear" w:fill="F1F5F9"/>
+            <w:vAlign w:val="center"/>
+          </w:tcPr>
+          <w:p>
+            <w:pPr>
+              <w:spacing w:after="0"/>
+            </w:pPr>
+            <w:r/>
+            <w:r>
+              <w:rPr>
+                <w:rFonts w:ascii="Aptos" w:hAnsi="Aptos"/>
+                <w:b w:val="0"/>
+                <w:color w:val="1E293B"/>
+                <w:sz w:val="16"/>
+              </w:rPr>
+              <w:t>Cline → LiteLLM policy/budget → approved model → tool approval → checkpoint</w:t>
+            </w:r>
+          </w:p>
+        </w:tc>
+        <w:tc>
+          <w:tcPr>
+            <w:tcW w:type="dxa" w:w="3384"/>
+            <w:shd w:val="clear" w:fill="F1F5F9"/>
+            <w:vAlign w:val="center"/>
+          </w:tcPr>
+          <w:p>
+            <w:pPr>
+              <w:spacing w:after="0"/>
+            </w:pPr>
+            <w:r/>
+            <w:r>
+              <w:rPr>
+                <w:rFonts w:ascii="Aptos" w:hAnsi="Aptos"/>
+                <w:b w:val="0"/>
+                <w:color w:val="1E293B"/>
+                <w:sz w:val="16"/>
+              </w:rPr>
+              <w:t>Fallback or explicit budget/policy/revoke failure; manual IDE remains available.</w:t>
+            </w:r>
+          </w:p>
+        </w:tc>
+      </w:tr>
+      <w:tr>
+        <w:trPr>
+          <w:cantSplit/>
+        </w:trPr>
+        <w:tc>
+          <w:tcPr>
+            <w:tcW w:type="dxa" w:w="2088"/>
+            <w:vAlign w:val="center"/>
+          </w:tcPr>
+          <w:p>
+            <w:pPr>
+              <w:spacing w:after="0"/>
+            </w:pPr>
+            <w:r/>
+            <w:r>
+              <w:rPr>
+                <w:rFonts w:ascii="Aptos" w:hAnsi="Aptos"/>
+                <w:b w:val="0"/>
+                <w:color w:val="1E293B"/>
+                <w:sz w:val="16"/>
+              </w:rPr>
+              <w:t>UC-05 Preview POC / Developer</w:t>
+            </w:r>
+          </w:p>
+        </w:tc>
+        <w:tc>
+          <w:tcPr>
+            <w:tcW w:type="dxa" w:w="4320"/>
+            <w:vAlign w:val="center"/>
+          </w:tcPr>
+          <w:p>
+            <w:pPr>
+              <w:spacing w:after="0"/>
+            </w:pPr>
+            <w:r/>
+            <w:r>
+              <w:rPr>
+                <w:rFonts w:ascii="Aptos" w:hAnsi="Aptos"/>
+                <w:b w:val="0"/>
+                <w:color w:val="1E293B"/>
+                <w:sz w:val="16"/>
+              </w:rPr>
+              <w:t>Readiness → authenticated frontend/API routes → POC database journey</w:t>
+            </w:r>
+          </w:p>
+        </w:tc>
+        <w:tc>
+          <w:tcPr>
+            <w:tcW w:type="dxa" w:w="3384"/>
+            <w:vAlign w:val="center"/>
+          </w:tcPr>
+          <w:p>
+            <w:pPr>
+              <w:spacing w:after="0"/>
+            </w:pPr>
+            <w:r/>
+            <w:r>
+              <w:rPr>
+                <w:rFonts w:ascii="Aptos" w:hAnsi="Aptos"/>
+                <w:b w:val="0"/>
+                <w:color w:val="1E293B"/>
+                <w:sz w:val="16"/>
+              </w:rPr>
+              <w:t>Restart preserves approved data; crash keeps IDE/source and exposes logs.</w:t>
+            </w:r>
+          </w:p>
+        </w:tc>
+      </w:tr>
+      <w:tr>
+        <w:trPr>
+          <w:cantSplit/>
+        </w:trPr>
+        <w:tc>
+          <w:tcPr>
+            <w:tcW w:type="dxa" w:w="2088"/>
+            <w:shd w:val="clear" w:fill="F1F5F9"/>
+            <w:vAlign w:val="center"/>
+          </w:tcPr>
+          <w:p>
+            <w:pPr>
+              <w:spacing w:after="0"/>
+            </w:pPr>
+            <w:r/>
+            <w:r>
+              <w:rPr>
+                <w:rFonts w:ascii="Aptos" w:hAnsi="Aptos"/>
+                <w:b w:val="0"/>
+                <w:color w:val="1E293B"/>
+                <w:sz w:val="16"/>
+              </w:rPr>
+              <w:t>UC-06 Install/upgrade package / Project owner</w:t>
+            </w:r>
+          </w:p>
+        </w:tc>
+        <w:tc>
+          <w:tcPr>
+            <w:tcW w:type="dxa" w:w="4320"/>
+            <w:shd w:val="clear" w:fill="F1F5F9"/>
+            <w:vAlign w:val="center"/>
+          </w:tcPr>
+          <w:p>
+            <w:pPr>
+              <w:spacing w:after="0"/>
+            </w:pPr>
+            <w:r/>
+            <w:r>
+              <w:rPr>
+                <w:rFonts w:ascii="Aptos" w:hAnsi="Aptos"/>
+                <w:b w:val="0"/>
+                <w:color w:val="1E293B"/>
+                <w:sz w:val="16"/>
+              </w:rPr>
+              <w:t>Resolve digest/dependencies → isolated branch install → migrate/test → review/merge</w:t>
+            </w:r>
+          </w:p>
+        </w:tc>
+        <w:tc>
+          <w:tcPr>
+            <w:tcW w:type="dxa" w:w="3384"/>
+            <w:shd w:val="clear" w:fill="F1F5F9"/>
+            <w:vAlign w:val="center"/>
+          </w:tcPr>
+          <w:p>
+            <w:pPr>
+              <w:spacing w:after="0"/>
+            </w:pPr>
+            <w:r/>
+            <w:r>
+              <w:rPr>
+                <w:rFonts w:ascii="Aptos" w:hAnsi="Aptos"/>
+                <w:b w:val="0"/>
+                <w:color w:val="1E293B"/>
+                <w:sz w:val="16"/>
+              </w:rPr>
+              <w:t>Compatibility/security failure leaves main and last-known-good unchanged.</w:t>
+            </w:r>
+          </w:p>
+        </w:tc>
+      </w:tr>
+      <w:tr>
+        <w:trPr>
+          <w:cantSplit/>
+        </w:trPr>
+        <w:tc>
+          <w:tcPr>
+            <w:tcW w:type="dxa" w:w="2088"/>
+            <w:vAlign w:val="center"/>
+          </w:tcPr>
+          <w:p>
+            <w:pPr>
+              <w:spacing w:after="0"/>
+            </w:pPr>
+            <w:r/>
+            <w:r>
+              <w:rPr>
+                <w:rFonts w:ascii="Aptos" w:hAnsi="Aptos"/>
+                <w:b w:val="0"/>
+                <w:color w:val="1E293B"/>
+                <w:sz w:val="16"/>
+              </w:rPr>
+              <w:t>UC-07 Review evidence / Reviewer</w:t>
+            </w:r>
+          </w:p>
+        </w:tc>
+        <w:tc>
+          <w:tcPr>
+            <w:tcW w:type="dxa" w:w="4320"/>
+            <w:vAlign w:val="center"/>
+          </w:tcPr>
+          <w:p>
+            <w:pPr>
+              <w:spacing w:after="0"/>
+            </w:pPr>
+            <w:r/>
+            <w:r>
+              <w:rPr>
+                <w:rFonts w:ascii="Aptos" w:hAnsi="Aptos"/>
+                <w:b w:val="0"/>
+                <w:color w:val="1E293B"/>
+                <w:sz w:val="16"/>
+              </w:rPr>
+              <w:t>Build/test/migration/security/business probes → normalized evidence by SHA</w:t>
+            </w:r>
+          </w:p>
+        </w:tc>
+        <w:tc>
+          <w:tcPr>
+            <w:tcW w:type="dxa" w:w="3384"/>
+            <w:vAlign w:val="center"/>
+          </w:tcPr>
+          <w:p>
+            <w:pPr>
+              <w:spacing w:after="0"/>
+            </w:pPr>
+            <w:r/>
+            <w:r>
+              <w:rPr>
+                <w:rFonts w:ascii="Aptos" w:hAnsi="Aptos"/>
+                <w:b w:val="0"/>
+                <w:color w:val="1E293B"/>
+                <w:sz w:val="16"/>
+              </w:rPr>
+              <w:t>Unavailable tool is NOT_EVALUATED; critical failure blocks promotion/handover.</w:t>
+            </w:r>
+          </w:p>
+        </w:tc>
+      </w:tr>
+      <w:tr>
+        <w:trPr>
+          <w:cantSplit/>
+        </w:trPr>
+        <w:tc>
+          <w:tcPr>
+            <w:tcW w:type="dxa" w:w="2088"/>
+            <w:shd w:val="clear" w:fill="F1F5F9"/>
+            <w:vAlign w:val="center"/>
+          </w:tcPr>
+          <w:p>
+            <w:pPr>
+              <w:spacing w:after="0"/>
+            </w:pPr>
+            <w:r/>
+            <w:r>
+              <w:rPr>
+                <w:rFonts w:ascii="Aptos" w:hAnsi="Aptos"/>
+                <w:b w:val="0"/>
+                <w:color w:val="1E293B"/>
+                <w:sz w:val="16"/>
+              </w:rPr>
+              <w:t>UC-08 IT handover / Project + IT owner</w:t>
+            </w:r>
+          </w:p>
+        </w:tc>
+        <w:tc>
+          <w:tcPr>
+            <w:tcW w:type="dxa" w:w="4320"/>
+            <w:shd w:val="clear" w:fill="F1F5F9"/>
+            <w:vAlign w:val="center"/>
+          </w:tcPr>
+          <w:p>
+            <w:pPr>
+              <w:spacing w:after="0"/>
+            </w:pPr>
+            <w:r/>
+            <w:r>
+              <w:rPr>
+                <w:rFonts w:ascii="Aptos" w:hAnsi="Aptos"/>
+                <w:b w:val="0"/>
+                <w:color w:val="1E293B"/>
+                <w:sz w:val="16"/>
+              </w:rPr>
+              <w:t>Assemble signed source/lock/test/scan/data/gap package → IT receipt</w:t>
+            </w:r>
+          </w:p>
+        </w:tc>
+        <w:tc>
+          <w:tcPr>
+            <w:tcW w:type="dxa" w:w="3384"/>
+            <w:shd w:val="clear" w:fill="F1F5F9"/>
+            <w:vAlign w:val="center"/>
+          </w:tcPr>
+          <w:p>
+            <w:pPr>
+              <w:spacing w:after="0"/>
+            </w:pPr>
+            <w:r/>
+            <w:r>
+              <w:rPr>
+                <w:rFonts w:ascii="Aptos" w:hAnsi="Aptos"/>
+                <w:b w:val="0"/>
+                <w:color w:val="1E293B"/>
+                <w:sz w:val="16"/>
+              </w:rPr>
+              <w:t>Incomplete evidence remains draft; no direct production deployment.</w:t>
+            </w:r>
+          </w:p>
+        </w:tc>
+      </w:tr>
+      <w:tr>
+        <w:trPr>
+          <w:cantSplit/>
+        </w:trPr>
+        <w:tc>
+          <w:tcPr>
+            <w:tcW w:type="dxa" w:w="2088"/>
+            <w:vAlign w:val="center"/>
+          </w:tcPr>
+          <w:p>
+            <w:pPr>
+              <w:spacing w:after="0"/>
+            </w:pPr>
+            <w:r/>
+            <w:r>
+              <w:rPr>
+                <w:rFonts w:ascii="Aptos" w:hAnsi="Aptos"/>
+                <w:b w:val="0"/>
+                <w:color w:val="1E293B"/>
+                <w:sz w:val="16"/>
+              </w:rPr>
+              <w:t>UC-09 Administer platform / Administrator</w:t>
+            </w:r>
+          </w:p>
+        </w:tc>
+        <w:tc>
+          <w:tcPr>
+            <w:tcW w:type="dxa" w:w="4320"/>
+            <w:vAlign w:val="center"/>
+          </w:tcPr>
+          <w:p>
+            <w:pPr>
+              <w:spacing w:after="0"/>
+            </w:pPr>
+            <w:r/>
+            <w:r>
+              <w:rPr>
+                <w:rFonts w:ascii="Aptos" w:hAnsi="Aptos"/>
+                <w:b w:val="0"/>
+                <w:color w:val="1E293B"/>
+                <w:sz w:val="16"/>
+              </w:rPr>
+              <w:t>Search records → authorize role/quota/policy change → audit before/after/reason</w:t>
+            </w:r>
+          </w:p>
+        </w:tc>
+        <w:tc>
+          <w:tcPr>
+            <w:tcW w:type="dxa" w:w="3384"/>
+            <w:vAlign w:val="center"/>
+          </w:tcPr>
+          <w:p>
+            <w:pPr>
+              <w:spacing w:after="0"/>
+            </w:pPr>
+            <w:r/>
+            <w:r>
+              <w:rPr>
+                <w:rFonts w:ascii="Aptos" w:hAnsi="Aptos"/>
+                <w:b w:val="0"/>
+                <w:color w:val="1E293B"/>
+                <w:sz w:val="16"/>
+              </w:rPr>
+              <w:t>Break-glass expires; unauthorized/stale change fails without partial state.</w:t>
+            </w:r>
+          </w:p>
+        </w:tc>
+      </w:tr>
+      <w:tr>
+        <w:trPr>
+          <w:cantSplit/>
+        </w:trPr>
+        <w:tc>
+          <w:tcPr>
+            <w:tcW w:type="dxa" w:w="2088"/>
+            <w:shd w:val="clear" w:fill="F1F5F9"/>
+            <w:vAlign w:val="center"/>
+          </w:tcPr>
+          <w:p>
+            <w:pPr>
+              <w:spacing w:after="0"/>
+            </w:pPr>
+            <w:r/>
+            <w:r>
+              <w:rPr>
+                <w:rFonts w:ascii="Aptos" w:hAnsi="Aptos"/>
+                <w:b w:val="0"/>
+                <w:color w:val="1E293B"/>
+                <w:sz w:val="16"/>
+              </w:rPr>
+              <w:t>UC-10 Durable agent task / Developer</w:t>
+            </w:r>
+          </w:p>
+        </w:tc>
+        <w:tc>
+          <w:tcPr>
+            <w:tcW w:type="dxa" w:w="4320"/>
+            <w:shd w:val="clear" w:fill="F1F5F9"/>
+            <w:vAlign w:val="center"/>
+          </w:tcPr>
+          <w:p>
+            <w:pPr>
+              <w:spacing w:after="0"/>
+            </w:pPr>
+            <w:r/>
+            <w:r>
+              <w:rPr>
+                <w:rFonts w:ascii="Aptos" w:hAnsi="Aptos"/>
+                <w:b w:val="0"/>
+                <w:color w:val="1E293B"/>
+                <w:sz w:val="16"/>
+              </w:rPr>
+              <w:t>Commit task/outbox → broker → leased runner → events/checkpoints → review</w:t>
+            </w:r>
+          </w:p>
+        </w:tc>
+        <w:tc>
+          <w:tcPr>
+            <w:tcW w:type="dxa" w:w="3384"/>
+            <w:shd w:val="clear" w:fill="F1F5F9"/>
+            <w:vAlign w:val="center"/>
+          </w:tcPr>
+          <w:p>
+            <w:pPr>
+              <w:spacing w:after="0"/>
+            </w:pPr>
+            <w:r/>
+            <w:r>
+              <w:rPr>
+                <w:rFonts w:ascii="Aptos" w:hAnsi="Aptos"/>
+                <w:b w:val="0"/>
+                <w:color w:val="1E293B"/>
+                <w:sz w:val="16"/>
+              </w:rPr>
+              <w:t>Reconnect replays gap; runner failure redelivers idempotently or asks user.</w:t>
+            </w:r>
+          </w:p>
+        </w:tc>
+      </w:tr>
+      <w:tr>
+        <w:trPr>
+          <w:cantSplit/>
+        </w:trPr>
+        <w:tc>
+          <w:tcPr>
+            <w:tcW w:type="dxa" w:w="2088"/>
+            <w:vAlign w:val="center"/>
+          </w:tcPr>
+          <w:p>
+            <w:pPr>
+              <w:spacing w:after="0"/>
+            </w:pPr>
+            <w:r/>
+            <w:r>
+              <w:rPr>
+                <w:rFonts w:ascii="Aptos" w:hAnsi="Aptos"/>
+                <w:b w:val="0"/>
+                <w:color w:val="1E293B"/>
+                <w:sz w:val="16"/>
+              </w:rPr>
+              <w:t>UC-11 Mobile approve/stop / Developer</w:t>
+            </w:r>
+          </w:p>
+        </w:tc>
+        <w:tc>
+          <w:tcPr>
+            <w:tcW w:type="dxa" w:w="4320"/>
+            <w:vAlign w:val="center"/>
+          </w:tcPr>
+          <w:p>
+            <w:pPr>
+              <w:spacing w:after="0"/>
+            </w:pPr>
+            <w:r/>
+            <w:r>
+              <w:rPr>
+                <w:rFonts w:ascii="Aptos" w:hAnsi="Aptos"/>
+                <w:b w:val="0"/>
+                <w:color w:val="1E293B"/>
+                <w:sz w:val="16"/>
+              </w:rPr>
+              <w:t>Review timeline/evidence → scoped approve, follow-up or Stop → durable result</w:t>
+            </w:r>
+          </w:p>
+        </w:tc>
+        <w:tc>
+          <w:tcPr>
+            <w:tcW w:type="dxa" w:w="3384"/>
+            <w:vAlign w:val="center"/>
+          </w:tcPr>
+          <w:p>
+            <w:pPr>
+              <w:spacing w:after="0"/>
+            </w:pPr>
+            <w:r/>
+            <w:r>
+              <w:rPr>
+                <w:rFonts w:ascii="Aptos" w:hAnsi="Aptos"/>
+                <w:b w:val="0"/>
+                <w:color w:val="1E293B"/>
+                <w:sz w:val="16"/>
+              </w:rPr>
+              <w:t>Offline/stale action reconciles safely; mobile never receives master keys.</w:t>
+            </w:r>
+          </w:p>
+        </w:tc>
+      </w:tr>
+      <w:tr>
+        <w:trPr>
+          <w:cantSplit/>
+        </w:trPr>
+        <w:tc>
+          <w:tcPr>
+            <w:tcW w:type="dxa" w:w="2088"/>
+            <w:shd w:val="clear" w:fill="F1F5F9"/>
+            <w:vAlign w:val="center"/>
+          </w:tcPr>
+          <w:p>
+            <w:pPr>
+              <w:spacing w:after="0"/>
+            </w:pPr>
+            <w:r/>
+            <w:r>
+              <w:rPr>
+                <w:rFonts w:ascii="Aptos" w:hAnsi="Aptos"/>
+                <w:b w:val="0"/>
+                <w:color w:val="1E293B"/>
+                <w:sz w:val="16"/>
+              </w:rPr>
+              <w:t>UC-12 Capacity spike / Developer + Operator</w:t>
+            </w:r>
+          </w:p>
+        </w:tc>
+        <w:tc>
+          <w:tcPr>
+            <w:tcW w:type="dxa" w:w="4320"/>
+            <w:shd w:val="clear" w:fill="F1F5F9"/>
+            <w:vAlign w:val="center"/>
+          </w:tcPr>
+          <w:p>
+            <w:pPr>
+              <w:spacing w:after="0"/>
+            </w:pPr>
+            <w:r/>
+            <w:r>
+              <w:rPr>
+                <w:rFonts w:ascii="Aptos" w:hAnsi="Aptos"/>
+                <w:b w:val="0"/>
+                <w:color w:val="1E293B"/>
+                <w:sz w:val="16"/>
+              </w:rPr>
+              <w:t>Protect login/running IDEs → fill warm slots → autoscale → fair queue/notify</w:t>
+            </w:r>
+          </w:p>
+        </w:tc>
+        <w:tc>
+          <w:tcPr>
+            <w:tcW w:type="dxa" w:w="3384"/>
+            <w:shd w:val="clear" w:fill="F1F5F9"/>
+            <w:vAlign w:val="center"/>
+          </w:tcPr>
+          <w:p>
+            <w:pPr>
+              <w:spacing w:after="0"/>
+            </w:pPr>
+            <w:r/>
+            <w:r>
+              <w:rPr>
+                <w:rFonts w:ascii="Aptos" w:hAnsi="Aptos"/>
+                <w:b w:val="0"/>
+                <w:color w:val="1E293B"/>
+                <w:sz w:val="16"/>
+              </w:rPr>
+              <w:t>Max quota invokes runbook; no generic login/server failure.</w:t>
+            </w:r>
+          </w:p>
+        </w:tc>
+      </w:tr>
+      <w:tr>
+        <w:trPr>
+          <w:cantSplit/>
+        </w:trPr>
+        <w:tc>
+          <w:tcPr>
+            <w:tcW w:type="dxa" w:w="2088"/>
+            <w:vAlign w:val="center"/>
+          </w:tcPr>
+          <w:p>
+            <w:pPr>
+              <w:spacing w:after="0"/>
+            </w:pPr>
+            <w:r/>
+            <w:r>
+              <w:rPr>
+                <w:rFonts w:ascii="Aptos" w:hAnsi="Aptos"/>
+                <w:b w:val="0"/>
+                <w:color w:val="1E293B"/>
+                <w:sz w:val="16"/>
+              </w:rPr>
+              <w:t>UC-13 Restore/failover / Operator</w:t>
+            </w:r>
+          </w:p>
+        </w:tc>
+        <w:tc>
+          <w:tcPr>
+            <w:tcW w:type="dxa" w:w="4320"/>
+            <w:vAlign w:val="center"/>
+          </w:tcPr>
+          <w:p>
+            <w:pPr>
+              <w:spacing w:after="0"/>
+            </w:pPr>
+            <w:r/>
+            <w:r>
+              <w:rPr>
+                <w:rFonts w:ascii="Aptos" w:hAnsi="Aptos"/>
+                <w:b w:val="0"/>
+                <w:color w:val="1E293B"/>
+                <w:sz w:val="16"/>
+              </w:rPr>
+              <w:t>Fence writes → validate copies → promote → verify data/queue/object → DNS</w:t>
+            </w:r>
+          </w:p>
+        </w:tc>
+        <w:tc>
+          <w:tcPr>
+            <w:tcW w:type="dxa" w:w="3384"/>
+            <w:vAlign w:val="center"/>
+          </w:tcPr>
+          <w:p>
+            <w:pPr>
+              <w:spacing w:after="0"/>
+            </w:pPr>
+            <w:r/>
+            <w:r>
+              <w:rPr>
+                <w:rFonts w:ascii="Aptos" w:hAnsi="Aptos"/>
+                <w:b w:val="0"/>
+                <w:color w:val="1E293B"/>
+                <w:sz w:val="16"/>
+              </w:rPr>
+              <w:t>Project-only restore alternate; failed integrity check keeps writes closed.</w:t>
+            </w:r>
+          </w:p>
+        </w:tc>
+      </w:tr>
+      <w:tr>
+        <w:trPr>
+          <w:cantSplit/>
+        </w:trPr>
+        <w:tc>
+          <w:tcPr>
+            <w:tcW w:type="dxa" w:w="2088"/>
+            <w:shd w:val="clear" w:fill="F1F5F9"/>
+            <w:vAlign w:val="center"/>
+          </w:tcPr>
+          <w:p>
+            <w:pPr>
+              <w:spacing w:after="0"/>
+            </w:pPr>
+            <w:r/>
+            <w:r>
+              <w:rPr>
+                <w:rFonts w:ascii="Aptos" w:hAnsi="Aptos"/>
+                <w:b w:val="0"/>
+                <w:color w:val="1E293B"/>
+                <w:sz w:val="16"/>
+              </w:rPr>
+              <w:t>UC-14 Decommission / Admin + data owner</w:t>
+            </w:r>
+          </w:p>
+        </w:tc>
+        <w:tc>
+          <w:tcPr>
+            <w:tcW w:type="dxa" w:w="4320"/>
+            <w:shd w:val="clear" w:fill="F1F5F9"/>
+            <w:vAlign w:val="center"/>
+          </w:tcPr>
+          <w:p>
+            <w:pPr>
+              <w:spacing w:after="0"/>
+            </w:pPr>
+            <w:r/>
+            <w:r>
+              <w:rPr>
+                <w:rFonts w:ascii="Aptos" w:hAnsi="Aptos"/>
+                <w:b w:val="0"/>
+                <w:color w:val="1E293B"/>
+                <w:sz w:val="16"/>
+              </w:rPr>
+              <w:t>Revoke → stop/quarantine → export/retain → delete eligible data → audit</w:t>
+            </w:r>
+          </w:p>
+        </w:tc>
+        <w:tc>
+          <w:tcPr>
+            <w:tcW w:type="dxa" w:w="3384"/>
+            <w:shd w:val="clear" w:fill="F1F5F9"/>
+            <w:vAlign w:val="center"/>
+          </w:tcPr>
+          <w:p>
+            <w:pPr>
+              <w:spacing w:after="0"/>
+            </w:pPr>
+            <w:r/>
+            <w:r>
+              <w:rPr>
+                <w:rFonts w:ascii="Aptos" w:hAnsi="Aptos"/>
+                <w:b w:val="0"/>
+                <w:color w:val="1E293B"/>
+                <w:sz w:val="16"/>
+              </w:rPr>
+              <w:t>Legal hold or dependencies keep explicit pending state; no orphan PVC/key/route.</w:t>
+            </w:r>
+          </w:p>
+        </w:tc>
+      </w:tr>
+    </w:tbl>
+    <w:p>
+      <w:pPr>
+        <w:spacing w:after="0"/>
+      </w:pPr>
+    </w:p>
+    <w:p>
+      <w:pPr>
+        <w:pStyle w:val="Heading2"/>
+      </w:pPr>
+      <w:r>
+        <w:t>Functional Definition of Done</w:t>
+      </w:r>
+    </w:p>
+    <w:p>
+      <w:pPr>
+        <w:pStyle w:val="ListBullet"/>
+        <w:spacing w:after="40"/>
+      </w:pPr>
+      <w:r>
+        <w:t>Actor, owner, phase, scope, non-goals, dependencies and business outcome are explicit.</w:t>
+      </w:r>
+    </w:p>
+    <w:p>
+      <w:pPr>
+        <w:pStyle w:val="ListBullet"/>
+        <w:spacing w:after="40"/>
+      </w:pPr>
+      <w:r>
+        <w:t>Main, alternate, failure and recovery paths have observable acceptance evidence.</w:t>
+      </w:r>
+    </w:p>
+    <w:p>
+      <w:pPr>
+        <w:pStyle w:val="ListBullet"/>
+        <w:spacing w:after="40"/>
+      </w:pPr>
+      <w:r>
+        <w:t>Backend authorization and cross-user negative tests pass.</w:t>
+      </w:r>
+    </w:p>
+    <w:p>
+      <w:pPr>
+        <w:pStyle w:val="ListBullet"/>
+        <w:spacing w:after="40"/>
+      </w:pPr>
+      <w:r>
+        <w:t>Data owner, location, retention, backup, export and deletion are approved.</w:t>
+      </w:r>
+    </w:p>
+    <w:p>
+      <w:pPr>
+        <w:pStyle w:val="ListBullet"/>
+        <w:spacing w:after="40"/>
+      </w:pPr>
+      <w:r>
+        <w:t>Loading, empty, queued, unavailable, error and retry states are visible.</w:t>
+      </w:r>
+    </w:p>
+    <w:p>
+      <w:pPr>
+        <w:pStyle w:val="ListBullet"/>
+        <w:spacing w:after="40"/>
+      </w:pPr>
+      <w:r>
+        <w:t>Logs, metrics, audit, correlation IDs, support and recovery runbooks exist.</w:t>
+      </w:r>
+    </w:p>
+    <w:p>
+      <w:pPr>
+        <w:pStyle w:val="ListBullet"/>
+        <w:spacing w:after="40"/>
+      </w:pPr>
+      <w:r>
+        <w:t>Resource, cost, spike, rollout, rollback/forward-fix and decommission behavior are measured.</w:t>
+      </w:r>
+    </w:p>
+    <w:p>
+      <w:pPr>
+        <w:pStyle w:val="ListBullet"/>
+        <w:spacing w:after="40"/>
+      </w:pPr>
+      <w:r>
+        <w:t>Evidence is tied to a frozen Git SHA/digest; later changes invalidate review.</w:t>
+      </w:r>
+    </w:p>
+    <w:p>
+      <w:pPr>
+        <w:pStyle w:val="ListBullet"/>
+        <w:spacing w:after="40"/>
+      </w:pPr>
+      <w:r>
+        <w:t>Generated output remains labelled POC and cannot deploy directly to production.</w:t>
+      </w:r>
+    </w:p>
+    <w:p>
+      <w:r>
+        <w:br w:type="page"/>
+      </w:r>
+    </w:p>
+    <w:p>
+      <w:pPr>
+        <w:pStyle w:val="Heading1"/>
+      </w:pPr>
+      <w:r>
+        <w:t>5. Production topology, scaling and data placement</w:t>
       </w:r>
     </w:p>
     <w:p>
@@ -3860,7 +8288,7 @@
         <w:pStyle w:val="Heading1"/>
       </w:pPr>
       <w:r>
-        <w:t>5. Staged delivery roadmap</w:t>
+        <w:t>6. Staged delivery roadmap</w:t>
       </w:r>
     </w:p>
     <w:p>
@@ -4633,7 +9061,7 @@
         <w:pStyle w:val="Heading1"/>
       </w:pPr>
       <w:r>
-        <w:t>6. Stage 0 feasibility spike</w:t>
+        <w:t>7. Stage 0 feasibility spike</w:t>
       </w:r>
     </w:p>
     <w:p>
@@ -4970,7 +9398,7 @@
         <w:pStyle w:val="Heading1"/>
       </w:pPr>
       <w:r>
-        <w:t>7. Security and operational boundaries</w:t>
+        <w:t>8. Security and operational boundaries</w:t>
       </w:r>
     </w:p>
     <w:p>
@@ -5417,7 +9845,7 @@
         <w:pStyle w:val="Heading1"/>
       </w:pPr>
       <w:r>
-        <w:t>8. Key risks and decision owners</w:t>
+        <w:t>9. Key risks and decision owners</w:t>
       </w:r>
     </w:p>
     <w:tbl>
@@ -6143,7 +10571,7 @@
         <w:pStyle w:val="Heading1"/>
       </w:pPr>
       <w:r>
-        <w:t>9. Planning assumptions and decision register</w:t>
+        <w:t>10. Planning assumptions and decision register</w:t>
       </w:r>
     </w:p>
     <w:p>
@@ -8740,7 +13168,7 @@
         <w:pStyle w:val="Heading1"/>
       </w:pPr>
       <w:r>
-        <w:t>10. Immediate decision package</w:t>
+        <w:t>11. Immediate decision package</w:t>
       </w:r>
     </w:p>
     <w:p>
@@ -8869,7 +13297,7 @@
         <w:pStyle w:val="Heading1"/>
       </w:pPr>
       <w:r>
-        <w:t>11. Repository references</w:t>
+        <w:t>12. Repository references</w:t>
       </w:r>
     </w:p>
     <w:tbl>
@@ -8953,7 +13381,7 @@
                 <w:color w:val="1E293B"/>
                 <w:sz w:val="16"/>
               </w:rPr>
-              <w:t>Target architecture baseline</w:t>
+              <w:t>Functional scope catalogue</w:t>
             </w:r>
           </w:p>
         </w:tc>
@@ -8974,7 +13402,7 @@
                 <w:color w:val="1E293B"/>
                 <w:sz w:val="16"/>
               </w:rPr>
-              <w:t>wiki/architecture/baseline/vibe-code-platform-target-architecture.md</w:t>
+              <w:t>wiki/product/vibe-code-platform-functional-scope.md</w:t>
             </w:r>
           </w:p>
         </w:tc>
@@ -9001,7 +13429,7 @@
                 <w:color w:val="1E293B"/>
                 <w:sz w:val="16"/>
               </w:rPr>
-              <w:t>Editable architecture diagram</w:t>
+              <w:t>Target architecture baseline</w:t>
             </w:r>
           </w:p>
         </w:tc>
@@ -9023,7 +13451,7 @@
                 <w:color w:val="1E293B"/>
                 <w:sz w:val="16"/>
               </w:rPr>
-              <w:t>wiki/architecture/diagrams/vibe-code-platform-target-architecture.html</w:t>
+              <w:t>wiki/architecture/baseline/vibe-code-platform-target-architecture.md</w:t>
             </w:r>
           </w:p>
         </w:tc>
@@ -9049,7 +13477,7 @@
                 <w:color w:val="1E293B"/>
                 <w:sz w:val="16"/>
               </w:rPr>
-              <w:t>PNG architecture diagram</w:t>
+              <w:t>Editable architecture diagram</w:t>
             </w:r>
           </w:p>
         </w:tc>
@@ -9070,7 +13498,7 @@
                 <w:color w:val="1E293B"/>
                 <w:sz w:val="16"/>
               </w:rPr>
-              <w:t>wiki/architecture/diagrams/vibe-code-platform-target-architecture.png</w:t>
+              <w:t>wiki/architecture/diagrams/vibe-code-platform-target-architecture.html</w:t>
             </w:r>
           </w:p>
         </w:tc>
@@ -9097,7 +13525,7 @@
                 <w:color w:val="1E293B"/>
                 <w:sz w:val="16"/>
               </w:rPr>
-              <w:t>Raw platform planning source</w:t>
+              <w:t>PNG architecture diagram</w:t>
             </w:r>
           </w:p>
         </w:tc>
@@ -9119,7 +13547,7 @@
                 <w:color w:val="1E293B"/>
                 <w:sz w:val="16"/>
               </w:rPr>
-              <w:t>wiki/raw/vibe-code-platform-plan.md</w:t>
+              <w:t>wiki/architecture/diagrams/vibe-code-platform-target-architecture.png</w:t>
             </w:r>
           </w:p>
         </w:tc>
@@ -9145,7 +13573,7 @@
                 <w:color w:val="1E293B"/>
                 <w:sz w:val="16"/>
               </w:rPr>
-              <w:t>Current local POC baseline</w:t>
+              <w:t>Raw platform planning source</w:t>
             </w:r>
           </w:p>
         </w:tc>
@@ -9166,7 +13594,7 @@
                 <w:color w:val="1E293B"/>
                 <w:sz w:val="16"/>
               </w:rPr>
-              <w:t>wiki/architecture/baseline/README.md</w:t>
+              <w:t>wiki/raw/vibe-code-platform-plan.md</w:t>
             </w:r>
           </w:p>
         </w:tc>
@@ -9193,7 +13621,7 @@
                 <w:color w:val="1E293B"/>
                 <w:sz w:val="16"/>
               </w:rPr>
-              <w:t>Current local POC ADR</w:t>
+              <w:t>Current local POC baseline</w:t>
             </w:r>
           </w:p>
         </w:tc>
@@ -9215,7 +13643,7 @@
                 <w:color w:val="1E293B"/>
                 <w:sz w:val="16"/>
               </w:rPr>
-              <w:t>wiki/architecture/decisions/ADR-0001-local-poc-stack.md</w:t>
+              <w:t>wiki/architecture/baseline/README.md</w:t>
             </w:r>
           </w:p>
         </w:tc>
@@ -9241,6 +13669,54 @@
                 <w:color w:val="1E293B"/>
                 <w:sz w:val="16"/>
               </w:rPr>
+              <w:t>Current local POC ADR</w:t>
+            </w:r>
+          </w:p>
+        </w:tc>
+        <w:tc>
+          <w:tcPr>
+            <w:tcW w:type="dxa" w:w="6552"/>
+            <w:vAlign w:val="center"/>
+          </w:tcPr>
+          <w:p>
+            <w:pPr>
+              <w:spacing w:after="0"/>
+            </w:pPr>
+            <w:r/>
+            <w:r>
+              <w:rPr>
+                <w:rFonts w:ascii="Aptos" w:hAnsi="Aptos"/>
+                <w:b w:val="0"/>
+                <w:color w:val="1E293B"/>
+                <w:sz w:val="16"/>
+              </w:rPr>
+              <w:t>wiki/architecture/decisions/ADR-0001-local-poc-stack.md</w:t>
+            </w:r>
+          </w:p>
+        </w:tc>
+      </w:tr>
+      <w:tr>
+        <w:trPr>
+          <w:cantSplit/>
+        </w:trPr>
+        <w:tc>
+          <w:tcPr>
+            <w:tcW w:type="dxa" w:w="3168"/>
+            <w:shd w:val="clear" w:fill="F1F5F9"/>
+            <w:vAlign w:val="center"/>
+          </w:tcPr>
+          <w:p>
+            <w:pPr>
+              <w:spacing w:after="0"/>
+            </w:pPr>
+            <w:r/>
+            <w:r>
+              <w:rPr>
+                <w:rFonts w:ascii="Aptos" w:hAnsi="Aptos"/>
+                <w:b w:val="0"/>
+                <w:color w:val="1E293B"/>
+                <w:sz w:val="16"/>
+              </w:rPr>
               <w:t>POC feature package</w:t>
             </w:r>
           </w:p>
@@ -9248,6 +13724,7 @@
         <w:tc>
           <w:tcPr>
             <w:tcW w:type="dxa" w:w="6552"/>
+            <w:shd w:val="clear" w:fill="F1F5F9"/>
             <w:vAlign w:val="center"/>
           </w:tcPr>
           <w:p>

</xml_diff>